<commit_message>
Importance of risk management and Role of technologies like reinforcement learning in modern finance.
</commit_message>
<xml_diff>
--- a/doc/PROJECT REPORT - PROJECT PROPOSAL.docx
+++ b/doc/PROJECT REPORT - PROJECT PROPOSAL.docx
@@ -1628,46 +1628,471 @@
     </w:p>
     <w:p>
       <w:pPr>
+        <w:jc w:val="both"/>
+      </w:pPr>
+      <w:r>
+        <w:t xml:space="preserve">Risk management in finance refers to the process of identifying, assessing, and controlling potential risks that could negatively impact financial outcomes. It involves understanding the various uncertainties associated with investments, markets, or business operations and implementing strategies to minimize or mitigate those risks. This can include techniques like diversification, hedging, and insurance to protect assets and ensure financial stability. The importance of risk management lies in its ability to safeguard against significant losses, balance risk with potential rewards, and enhance decision-making. By proactively addressing risks, businesses and investors can maintain stability, meet long-term financial goals, comply with regulations, and protect their reputation, all of which contribute to sustained success in an </w:t>
+      </w:r>
+      <w:proofErr w:type="gramStart"/>
+      <w:r>
+        <w:t>often volatile</w:t>
+      </w:r>
+      <w:proofErr w:type="gramEnd"/>
+      <w:r>
+        <w:t xml:space="preserve"> financial environment.</w:t>
+      </w:r>
+    </w:p>
+    <w:p>
+      <w:pPr>
+        <w:jc w:val="both"/>
+      </w:pPr>
+      <w:r>
+        <w:t>Failure to properly manage risk can have severe consequences, as demonstrated by the 2007-2008 subprime mortgage crisis. Financial institutions failed to adequately assess the risks associated with mortgage-backed securities, leading to massive defaults and a global economic downturn. This highlights the importance of maintaining a structured and rigorous approach to risk management.</w:t>
+      </w:r>
+    </w:p>
+    <w:p>
+      <w:pPr>
+        <w:jc w:val="both"/>
+      </w:pPr>
+      <w:r>
+        <w:t>There are several types of financial risks</w:t>
+      </w:r>
+      <w:r>
+        <w:t>:</w:t>
+      </w:r>
+    </w:p>
+    <w:p>
+      <w:pPr>
+        <w:numPr>
+          <w:ilvl w:val="0"/>
+          <w:numId w:val="4"/>
+        </w:numPr>
+        <w:jc w:val="both"/>
+      </w:pPr>
+      <w:r>
+        <w:rPr>
+          <w:b/>
+          <w:bCs/>
+        </w:rPr>
+        <w:t>Market Risk:</w:t>
+      </w:r>
+      <w:r>
+        <w:t xml:space="preserve"> The risk of financial loss due to changes in market conditions (e.g., stock prices, interest rates, or currency exchange rates).</w:t>
+      </w:r>
+    </w:p>
+    <w:p>
+      <w:pPr>
+        <w:numPr>
+          <w:ilvl w:val="0"/>
+          <w:numId w:val="4"/>
+        </w:numPr>
+        <w:jc w:val="both"/>
+      </w:pPr>
+      <w:r>
+        <w:rPr>
+          <w:b/>
+          <w:bCs/>
+        </w:rPr>
+        <w:t>Credit Risk:</w:t>
+      </w:r>
+      <w:r>
+        <w:t xml:space="preserve"> The risk of a borrower defaulting on a loan or debt.</w:t>
+      </w:r>
+    </w:p>
+    <w:p>
+      <w:pPr>
+        <w:numPr>
+          <w:ilvl w:val="0"/>
+          <w:numId w:val="4"/>
+        </w:numPr>
+        <w:jc w:val="both"/>
+      </w:pPr>
+      <w:r>
+        <w:rPr>
+          <w:b/>
+          <w:bCs/>
+        </w:rPr>
+        <w:t>Liquidity Risk:</w:t>
+      </w:r>
+      <w:r>
+        <w:t xml:space="preserve"> The risk of not being able to meet short-term financial obligations due to a lack of liquid assets.</w:t>
+      </w:r>
+    </w:p>
+    <w:p>
+      <w:pPr>
+        <w:numPr>
+          <w:ilvl w:val="0"/>
+          <w:numId w:val="4"/>
+        </w:numPr>
+        <w:jc w:val="both"/>
+      </w:pPr>
+      <w:r>
+        <w:rPr>
+          <w:b/>
+          <w:bCs/>
+        </w:rPr>
+        <w:t>Operational Risk:</w:t>
+      </w:r>
+      <w:r>
+        <w:t xml:space="preserve"> Risks arising from internal processes, systems, or human errors that can disrupt business operations.</w:t>
+      </w:r>
+    </w:p>
+    <w:p>
+      <w:pPr>
+        <w:numPr>
+          <w:ilvl w:val="0"/>
+          <w:numId w:val="4"/>
+        </w:numPr>
+        <w:jc w:val="both"/>
+      </w:pPr>
+      <w:r>
+        <w:rPr>
+          <w:b/>
+          <w:bCs/>
+        </w:rPr>
+        <w:t>Legal and Regulatory Risk:</w:t>
+      </w:r>
+      <w:r>
+        <w:t xml:space="preserve"> The risk of legal actions or failure to comply with relevant regulations.</w:t>
+      </w:r>
+    </w:p>
+    <w:p>
+      <w:pPr>
+        <w:jc w:val="both"/>
+      </w:pPr>
+    </w:p>
+    <w:p>
+      <w:pPr>
+        <w:jc w:val="both"/>
+      </w:pPr>
+    </w:p>
+    <w:p>
+      <w:pPr>
+        <w:jc w:val="both"/>
+        <w:rPr>
+          <w:b/>
+          <w:bCs/>
+        </w:rPr>
+      </w:pPr>
+      <w:r>
+        <w:rPr>
+          <w:b/>
+          <w:bCs/>
+        </w:rPr>
+        <w:lastRenderedPageBreak/>
+        <w:t>The Risk Management Process</w:t>
+      </w:r>
+    </w:p>
+    <w:p>
+      <w:pPr>
+        <w:numPr>
+          <w:ilvl w:val="0"/>
+          <w:numId w:val="5"/>
+        </w:numPr>
+        <w:jc w:val="both"/>
+      </w:pPr>
+      <w:r>
+        <w:rPr>
+          <w:b/>
+          <w:bCs/>
+        </w:rPr>
+        <w:t>Risk Identification:</w:t>
+      </w:r>
+      <w:r>
+        <w:t xml:space="preserve"> Identifying the risks that could affect the financial position or objectives of the investor or company. This includes market fluctuations, operational risks, and others.</w:t>
+      </w:r>
+    </w:p>
+    <w:p>
+      <w:pPr>
+        <w:numPr>
+          <w:ilvl w:val="0"/>
+          <w:numId w:val="5"/>
+        </w:numPr>
+        <w:jc w:val="both"/>
+      </w:pPr>
+      <w:r>
+        <w:rPr>
+          <w:b/>
+          <w:bCs/>
+        </w:rPr>
+        <w:t>Risk Assessment:</w:t>
+      </w:r>
+      <w:r>
+        <w:t xml:space="preserve"> Once risks are identified, they need to be evaluated in terms of their potential impact and likelihood. This involves quantitative analysis and modeling to determine potential financial losses.</w:t>
+      </w:r>
+    </w:p>
+    <w:p>
+      <w:pPr>
+        <w:numPr>
+          <w:ilvl w:val="0"/>
+          <w:numId w:val="5"/>
+        </w:numPr>
+        <w:jc w:val="both"/>
+      </w:pPr>
+      <w:r>
+        <w:rPr>
+          <w:b/>
+          <w:bCs/>
+        </w:rPr>
+        <w:t>Risk Mitigation:</w:t>
+      </w:r>
+      <w:r>
+        <w:t xml:space="preserve"> After assessing risks, strategies are implemented to either reduce, eliminate, or transfer the risks. Common methods include diversification, hedging, and using insurance products.</w:t>
+      </w:r>
+    </w:p>
+    <w:p>
+      <w:pPr>
+        <w:numPr>
+          <w:ilvl w:val="0"/>
+          <w:numId w:val="5"/>
+        </w:numPr>
+        <w:jc w:val="both"/>
+      </w:pPr>
+      <w:r>
+        <w:rPr>
+          <w:b/>
+          <w:bCs/>
+        </w:rPr>
+        <w:t>Monitoring and Review:</w:t>
+      </w:r>
+      <w:r>
+        <w:t xml:space="preserve"> Risk management is a dynamic process, requiring regular monitoring of risks and the effectiveness of mitigation strategies. Adjustments are made as necessary based on new developments or changes in market conditions.</w:t>
+      </w:r>
+    </w:p>
+    <w:p>
+      <w:pPr>
+        <w:jc w:val="both"/>
+        <w:rPr>
+          <w:b/>
+          <w:bCs/>
+        </w:rPr>
+      </w:pPr>
+      <w:r>
+        <w:rPr>
+          <w:b/>
+          <w:bCs/>
+        </w:rPr>
+        <w:t>Key Risk Management Techniques</w:t>
+      </w:r>
+    </w:p>
+    <w:p>
+      <w:pPr>
+        <w:numPr>
+          <w:ilvl w:val="0"/>
+          <w:numId w:val="6"/>
+        </w:numPr>
+        <w:jc w:val="both"/>
+      </w:pPr>
+      <w:r>
+        <w:rPr>
+          <w:b/>
+          <w:bCs/>
+        </w:rPr>
+        <w:t>Avoidance:</w:t>
+      </w:r>
+      <w:r>
+        <w:t xml:space="preserve"> This involves eliminating exposure to a particular risk by choosing safer, low-risk investments. It’s most effective when the potential risk is significant, and the investor’s tolerance for it is low.</w:t>
+      </w:r>
+    </w:p>
+    <w:p>
+      <w:pPr>
+        <w:numPr>
+          <w:ilvl w:val="0"/>
+          <w:numId w:val="6"/>
+        </w:numPr>
+        <w:jc w:val="both"/>
+      </w:pPr>
+      <w:r>
+        <w:rPr>
+          <w:b/>
+          <w:bCs/>
+        </w:rPr>
+        <w:t>Retention:</w:t>
+      </w:r>
+      <w:r>
+        <w:t xml:space="preserve"> In some cases, investors accept the risk involved, hoping the returns will outweigh potential losses. This strategy is more common when high returns are expected, and the investor has the capacity to absorb potential losses.</w:t>
+      </w:r>
+    </w:p>
+    <w:p>
+      <w:pPr>
+        <w:numPr>
+          <w:ilvl w:val="0"/>
+          <w:numId w:val="6"/>
+        </w:numPr>
+        <w:jc w:val="both"/>
+      </w:pPr>
+      <w:r>
+        <w:rPr>
+          <w:b/>
+          <w:bCs/>
+        </w:rPr>
+        <w:t>Sharing:</w:t>
+      </w:r>
+      <w:r>
+        <w:t xml:space="preserve"> Risk can be shared among multiple parties. For instance, insurance companies spread the risk of large claims by sharing it with reinsurance firms.</w:t>
+      </w:r>
+    </w:p>
+    <w:p>
+      <w:pPr>
+        <w:numPr>
+          <w:ilvl w:val="0"/>
+          <w:numId w:val="6"/>
+        </w:numPr>
+        <w:jc w:val="both"/>
+      </w:pPr>
+      <w:r>
+        <w:rPr>
+          <w:b/>
+          <w:bCs/>
+        </w:rPr>
+        <w:t>Transferring:</w:t>
+      </w:r>
+      <w:r>
+        <w:t xml:space="preserve"> Risk can be transferred to another party, such as through purchasing insurance or using derivative contracts like options or futures. This allows investors to shift financial risks to entities better positioned to handle them.</w:t>
+      </w:r>
+    </w:p>
+    <w:p>
+      <w:pPr>
+        <w:numPr>
+          <w:ilvl w:val="0"/>
+          <w:numId w:val="6"/>
+        </w:numPr>
+        <w:jc w:val="both"/>
+      </w:pPr>
+      <w:r>
+        <w:rPr>
+          <w:b/>
+          <w:bCs/>
+        </w:rPr>
+        <w:t>Loss Prevention and Reduction:</w:t>
+      </w:r>
+      <w:r>
+        <w:t xml:space="preserve"> This technique involves diversifying investments to reduce the impact of potential losses. For example, a portfolio manager may invest in a mix of assets, balancing high-risk investments with safer ones.</w:t>
+      </w:r>
+    </w:p>
+    <w:p>
+      <w:pPr>
+        <w:jc w:val="both"/>
+        <w:rPr>
+          <w:b/>
+          <w:bCs/>
+        </w:rPr>
+      </w:pPr>
+      <w:r>
+        <w:rPr>
+          <w:b/>
+          <w:bCs/>
+        </w:rPr>
+        <w:t>Quantifying and Measuring Risk</w:t>
+      </w:r>
+    </w:p>
+    <w:p>
+      <w:pPr>
+        <w:numPr>
+          <w:ilvl w:val="0"/>
+          <w:numId w:val="7"/>
+        </w:numPr>
+        <w:jc w:val="both"/>
+      </w:pPr>
+      <w:r>
+        <w:t>Standard Deviation: A measure of the volatility of investment returns. A higher standard deviation indicates greater risk, as the returns are more spread out from the expected average.</w:t>
+      </w:r>
+    </w:p>
+    <w:p>
+      <w:pPr>
+        <w:numPr>
+          <w:ilvl w:val="0"/>
+          <w:numId w:val="7"/>
+        </w:numPr>
+        <w:jc w:val="both"/>
+      </w:pPr>
+      <w:r>
+        <w:lastRenderedPageBreak/>
+        <w:t>Beta: A measure of an investment's sensitivity to overall market movements. A beta higher than 1 indicates greater volatility relative to the market, while a beta below 1 suggests lower market risk.</w:t>
+      </w:r>
+    </w:p>
+    <w:p>
+      <w:pPr>
+        <w:spacing w:before="100" w:beforeAutospacing="1" w:after="100" w:afterAutospacing="1" w:line="240" w:lineRule="auto"/>
+        <w:jc w:val="both"/>
+        <w:outlineLvl w:val="3"/>
+        <w:rPr>
+          <w:rFonts w:eastAsia="Times New Roman" w:cs="Times New Roman"/>
+          <w:b/>
+          <w:bCs/>
+          <w:kern w:val="0"/>
+          <w:lang w:eastAsia="en-CA"/>
+          <w14:ligatures w14:val="none"/>
+        </w:rPr>
+      </w:pPr>
+      <w:r>
+        <w:rPr>
+          <w:rFonts w:eastAsia="Times New Roman" w:cs="Times New Roman"/>
+          <w:b/>
+          <w:bCs/>
+          <w:kern w:val="0"/>
+          <w:lang w:eastAsia="en-CA"/>
+          <w14:ligatures w14:val="none"/>
+        </w:rPr>
+        <w:t>Types of Risk and Their Measurement</w:t>
+      </w:r>
+    </w:p>
+    <w:p>
+      <w:pPr>
+        <w:pStyle w:val="NormalWeb"/>
+        <w:numPr>
+          <w:ilvl w:val="0"/>
+          <w:numId w:val="9"/>
+        </w:numPr>
+        <w:jc w:val="both"/>
+        <w:rPr>
+          <w:rFonts w:asciiTheme="minorHAnsi" w:hAnsiTheme="minorHAnsi"/>
+        </w:rPr>
+      </w:pPr>
+      <w:r>
+        <w:rPr>
+          <w:rStyle w:val="Strong"/>
+          <w:rFonts w:asciiTheme="minorHAnsi" w:eastAsiaTheme="majorEastAsia" w:hAnsiTheme="minorHAnsi"/>
+        </w:rPr>
+        <w:t>Beta and Passive Risk:</w:t>
+      </w:r>
+      <w:r>
+        <w:rPr>
+          <w:rFonts w:asciiTheme="minorHAnsi" w:hAnsiTheme="minorHAnsi"/>
+        </w:rPr>
+        <w:t xml:space="preserve"> Beta measures an investment’s sensitivity to market movements. Investments with higher beta values carry more market risk, while lower beta investments have less market exposure.</w:t>
+      </w:r>
+    </w:p>
+    <w:p>
+      <w:pPr>
+        <w:pStyle w:val="ListParagraph"/>
+        <w:numPr>
+          <w:ilvl w:val="0"/>
+          <w:numId w:val="9"/>
+        </w:numPr>
         <w:spacing w:after="162" w:line="360" w:lineRule="auto"/>
         <w:ind w:right="60"/>
-        <w:rPr>
-          <w:rFonts w:ascii="Times New Roman" w:eastAsia="Times New Roman" w:hAnsi="Times New Roman" w:cs="Times New Roman"/>
-          <w:bCs/>
-          <w:color w:val="000000"/>
-          <w:kern w:val="0"/>
-          <w:sz w:val="32"/>
-          <w:szCs w:val="32"/>
-          <w:lang w:val="en-US"/>
-          <w14:ligatures w14:val="none"/>
-        </w:rPr>
-      </w:pPr>
-      <w:proofErr w:type="gramStart"/>
-      <w:r>
-        <w:rPr>
-          <w:rFonts w:ascii="Times New Roman" w:eastAsia="Times New Roman" w:hAnsi="Times New Roman" w:cs="Times New Roman"/>
-          <w:bCs/>
-          <w:color w:val="000000"/>
-          <w:kern w:val="0"/>
-          <w:sz w:val="32"/>
-          <w:szCs w:val="32"/>
-          <w:lang w:val="en-US"/>
-          <w14:ligatures w14:val="none"/>
-        </w:rPr>
-        <w:t>Answer</w:t>
-      </w:r>
-      <w:proofErr w:type="gramEnd"/>
-      <w:r>
-        <w:rPr>
-          <w:rFonts w:ascii="Times New Roman" w:eastAsia="Times New Roman" w:hAnsi="Times New Roman" w:cs="Times New Roman"/>
-          <w:bCs/>
-          <w:color w:val="000000"/>
-          <w:kern w:val="0"/>
-          <w:sz w:val="32"/>
-          <w:szCs w:val="32"/>
-          <w:lang w:val="en-US"/>
-          <w14:ligatures w14:val="none"/>
-        </w:rPr>
-        <w:t xml:space="preserve"> here:</w:t>
+        <w:jc w:val="both"/>
+        <w:rPr>
+          <w:rFonts w:ascii="Times New Roman" w:eastAsia="Times New Roman" w:hAnsi="Times New Roman" w:cs="Times New Roman"/>
+          <w:bCs/>
+          <w:color w:val="000000"/>
+          <w:kern w:val="0"/>
+          <w:sz w:val="32"/>
+          <w:szCs w:val="32"/>
+          <w:lang w:val="en-US"/>
+          <w14:ligatures w14:val="none"/>
+        </w:rPr>
+      </w:pPr>
+      <w:r>
+        <w:rPr>
+          <w:rStyle w:val="Strong"/>
+          <w:rFonts w:eastAsiaTheme="majorEastAsia"/>
+        </w:rPr>
+        <w:t>Alpha and Active Risk:</w:t>
+      </w:r>
+      <w:r>
+        <w:t xml:space="preserve"> Alpha refers to the excess return an investment generates over the expected return based on market risk. Active risk involves the risk taken by portfolio managers to achieve returns beyond the market, which often results in higher fees and potential underperformance if their strategies fail.</w:t>
       </w:r>
     </w:p>
     <w:p>
@@ -1701,6 +2126,931 @@
     </w:p>
     <w:p>
       <w:pPr>
+        <w:jc w:val="both"/>
+      </w:pPr>
+      <w:r>
+        <w:t>In modern finance, technologies like reinforcement learning (RL) are revolutionizing decision-making processes, especially in complex tasks such as portfolio allocation. Portfolio allocation involves distributing investments across various assets to achieve an optimal balance between risk and return. Traditional methods, such as mean-variance optimization (MVO), rely heavily on historical data to estimate expected returns and risk. However, these methods have limitations, such as their inability to fully adapt to the dynamic and unpredictable nature of financial markets.</w:t>
+      </w:r>
+    </w:p>
+    <w:p>
+      <w:pPr>
+        <w:jc w:val="both"/>
+      </w:pPr>
+      <w:r>
+        <w:t xml:space="preserve">Reinforcement learning, a branch of machine learning, offers a solution to these challenges by enabling systems to make decisions through interaction with the environment and by learning from real-time data. </w:t>
+      </w:r>
+    </w:p>
+    <w:p>
+      <w:pPr>
+        <w:jc w:val="both"/>
+      </w:pPr>
+      <w:r>
+        <w:rPr>
+          <w:b/>
+          <w:bCs/>
+        </w:rPr>
+        <w:t>Applications of Reinforcement Learning in Portfolio Allocation:</w:t>
+      </w:r>
+    </w:p>
+    <w:p>
+      <w:pPr>
+        <w:numPr>
+          <w:ilvl w:val="0"/>
+          <w:numId w:val="11"/>
+        </w:numPr>
+        <w:jc w:val="both"/>
+      </w:pPr>
+      <w:r>
+        <w:rPr>
+          <w:b/>
+          <w:bCs/>
+        </w:rPr>
+        <w:t>Dynamic Portfolio Optimization:</w:t>
+      </w:r>
+      <w:r>
+        <w:t xml:space="preserve"> RL models can adjust asset weights adaptively in response to evolving market conditions.</w:t>
+      </w:r>
+    </w:p>
+    <w:p>
+      <w:pPr>
+        <w:numPr>
+          <w:ilvl w:val="0"/>
+          <w:numId w:val="11"/>
+        </w:numPr>
+        <w:jc w:val="both"/>
+      </w:pPr>
+      <w:r>
+        <w:rPr>
+          <w:b/>
+          <w:bCs/>
+        </w:rPr>
+        <w:t>Risk-Reward Balancing:</w:t>
+      </w:r>
+      <w:r>
+        <w:t xml:space="preserve"> RL models use custom reward functions to prioritize risk-adjusted returns, considering metrics like Value-at-Risk (</w:t>
+      </w:r>
+      <w:proofErr w:type="spellStart"/>
+      <w:r>
+        <w:t>VaR</w:t>
+      </w:r>
+      <w:proofErr w:type="spellEnd"/>
+      <w:r>
+        <w:t>) and Conditional Value-at-Risk (CVaR).</w:t>
+      </w:r>
+    </w:p>
+    <w:p>
+      <w:pPr>
+        <w:numPr>
+          <w:ilvl w:val="0"/>
+          <w:numId w:val="11"/>
+        </w:numPr>
+        <w:jc w:val="both"/>
+      </w:pPr>
+      <w:r>
+        <w:rPr>
+          <w:b/>
+          <w:bCs/>
+        </w:rPr>
+        <w:t>Real-Time Market Responses:</w:t>
+      </w:r>
+      <w:r>
+        <w:t xml:space="preserve"> RL agents can respond to immediate market shifts, improving portfolio performance compared to traditional methods</w:t>
+      </w:r>
+    </w:p>
+    <w:p>
+      <w:pPr>
+        <w:jc w:val="both"/>
+      </w:pPr>
+      <w:r>
+        <w:lastRenderedPageBreak/>
+        <w:t>Comparison of traditional methods vs reinforcement learning</w:t>
+      </w:r>
+    </w:p>
+    <w:tbl>
+      <w:tblPr>
+        <w:tblStyle w:val="TableGrid"/>
+        <w:tblW w:w="0" w:type="auto"/>
+        <w:tblLook w:val="04A0" w:firstRow="1" w:lastRow="0" w:firstColumn="1" w:lastColumn="0" w:noHBand="0" w:noVBand="1"/>
+      </w:tblPr>
+      <w:tblGrid>
+        <w:gridCol w:w="2284"/>
+        <w:gridCol w:w="3424"/>
+        <w:gridCol w:w="3642"/>
+      </w:tblGrid>
+      <w:tr>
+        <w:tc>
+          <w:tcPr>
+            <w:tcW w:w="0" w:type="auto"/>
+            <w:hideMark/>
+          </w:tcPr>
+          <w:p>
+            <w:pPr>
+              <w:jc w:val="center"/>
+              <w:rPr>
+                <w:rFonts w:ascii="Times New Roman" w:eastAsia="Times New Roman" w:hAnsi="Times New Roman" w:cs="Times New Roman"/>
+                <w:b/>
+                <w:bCs/>
+                <w:kern w:val="0"/>
+                <w:lang w:eastAsia="en-CA"/>
+                <w14:ligatures w14:val="none"/>
+              </w:rPr>
+            </w:pPr>
+            <w:r>
+              <w:rPr>
+                <w:rFonts w:ascii="Times New Roman" w:eastAsia="Times New Roman" w:hAnsi="Times New Roman" w:cs="Times New Roman"/>
+                <w:b/>
+                <w:bCs/>
+                <w:kern w:val="0"/>
+                <w:lang w:eastAsia="en-CA"/>
+                <w14:ligatures w14:val="none"/>
+              </w:rPr>
+              <w:t>Aspect</w:t>
+            </w:r>
+          </w:p>
+        </w:tc>
+        <w:tc>
+          <w:tcPr>
+            <w:tcW w:w="0" w:type="auto"/>
+            <w:hideMark/>
+          </w:tcPr>
+          <w:p>
+            <w:pPr>
+              <w:jc w:val="center"/>
+              <w:rPr>
+                <w:rFonts w:ascii="Times New Roman" w:eastAsia="Times New Roman" w:hAnsi="Times New Roman" w:cs="Times New Roman"/>
+                <w:b/>
+                <w:bCs/>
+                <w:kern w:val="0"/>
+                <w:lang w:eastAsia="en-CA"/>
+                <w14:ligatures w14:val="none"/>
+              </w:rPr>
+            </w:pPr>
+            <w:r>
+              <w:rPr>
+                <w:rFonts w:ascii="Times New Roman" w:eastAsia="Times New Roman" w:hAnsi="Times New Roman" w:cs="Times New Roman"/>
+                <w:b/>
+                <w:bCs/>
+                <w:kern w:val="0"/>
+                <w:lang w:eastAsia="en-CA"/>
+                <w14:ligatures w14:val="none"/>
+              </w:rPr>
+              <w:t>Traditional Methods</w:t>
+            </w:r>
+          </w:p>
+        </w:tc>
+        <w:tc>
+          <w:tcPr>
+            <w:tcW w:w="0" w:type="auto"/>
+            <w:hideMark/>
+          </w:tcPr>
+          <w:p>
+            <w:pPr>
+              <w:jc w:val="center"/>
+              <w:rPr>
+                <w:rFonts w:ascii="Times New Roman" w:eastAsia="Times New Roman" w:hAnsi="Times New Roman" w:cs="Times New Roman"/>
+                <w:b/>
+                <w:bCs/>
+                <w:kern w:val="0"/>
+                <w:lang w:eastAsia="en-CA"/>
+                <w14:ligatures w14:val="none"/>
+              </w:rPr>
+            </w:pPr>
+            <w:r>
+              <w:rPr>
+                <w:rFonts w:ascii="Times New Roman" w:eastAsia="Times New Roman" w:hAnsi="Times New Roman" w:cs="Times New Roman"/>
+                <w:b/>
+                <w:bCs/>
+                <w:kern w:val="0"/>
+                <w:lang w:eastAsia="en-CA"/>
+                <w14:ligatures w14:val="none"/>
+              </w:rPr>
+              <w:t>Reinforcement Learning (RL)</w:t>
+            </w:r>
+          </w:p>
+        </w:tc>
+      </w:tr>
+      <w:tr>
+        <w:tc>
+          <w:tcPr>
+            <w:tcW w:w="0" w:type="auto"/>
+            <w:hideMark/>
+          </w:tcPr>
+          <w:p>
+            <w:pPr>
+              <w:rPr>
+                <w:rFonts w:ascii="Times New Roman" w:eastAsia="Times New Roman" w:hAnsi="Times New Roman" w:cs="Times New Roman"/>
+                <w:kern w:val="0"/>
+                <w:lang w:eastAsia="en-CA"/>
+                <w14:ligatures w14:val="none"/>
+              </w:rPr>
+            </w:pPr>
+            <w:r>
+              <w:rPr>
+                <w:rFonts w:ascii="Times New Roman" w:eastAsia="Times New Roman" w:hAnsi="Times New Roman" w:cs="Times New Roman"/>
+                <w:b/>
+                <w:bCs/>
+                <w:kern w:val="0"/>
+                <w:lang w:eastAsia="en-CA"/>
+                <w14:ligatures w14:val="none"/>
+              </w:rPr>
+              <w:t>Methodology</w:t>
+            </w:r>
+          </w:p>
+        </w:tc>
+        <w:tc>
+          <w:tcPr>
+            <w:tcW w:w="0" w:type="auto"/>
+            <w:hideMark/>
+          </w:tcPr>
+          <w:p>
+            <w:pPr>
+              <w:rPr>
+                <w:rFonts w:ascii="Times New Roman" w:eastAsia="Times New Roman" w:hAnsi="Times New Roman" w:cs="Times New Roman"/>
+                <w:kern w:val="0"/>
+                <w:lang w:eastAsia="en-CA"/>
+                <w14:ligatures w14:val="none"/>
+              </w:rPr>
+            </w:pPr>
+            <w:r>
+              <w:rPr>
+                <w:rFonts w:ascii="Times New Roman" w:eastAsia="Times New Roman" w:hAnsi="Times New Roman" w:cs="Times New Roman"/>
+                <w:kern w:val="0"/>
+                <w:lang w:eastAsia="en-CA"/>
+                <w14:ligatures w14:val="none"/>
+              </w:rPr>
+              <w:t>Relies on historical data (e.g., mean-variance optimization).</w:t>
+            </w:r>
+          </w:p>
+        </w:tc>
+        <w:tc>
+          <w:tcPr>
+            <w:tcW w:w="0" w:type="auto"/>
+            <w:hideMark/>
+          </w:tcPr>
+          <w:p>
+            <w:pPr>
+              <w:rPr>
+                <w:rFonts w:ascii="Times New Roman" w:eastAsia="Times New Roman" w:hAnsi="Times New Roman" w:cs="Times New Roman"/>
+                <w:kern w:val="0"/>
+                <w:lang w:eastAsia="en-CA"/>
+                <w14:ligatures w14:val="none"/>
+              </w:rPr>
+            </w:pPr>
+            <w:r>
+              <w:rPr>
+                <w:rFonts w:ascii="Times New Roman" w:eastAsia="Times New Roman" w:hAnsi="Times New Roman" w:cs="Times New Roman"/>
+                <w:kern w:val="0"/>
+                <w:lang w:eastAsia="en-CA"/>
+                <w14:ligatures w14:val="none"/>
+              </w:rPr>
+              <w:t>Uses real-time data, learns from interaction with the environment.</w:t>
+            </w:r>
+          </w:p>
+        </w:tc>
+      </w:tr>
+      <w:tr>
+        <w:tc>
+          <w:tcPr>
+            <w:tcW w:w="0" w:type="auto"/>
+            <w:hideMark/>
+          </w:tcPr>
+          <w:p>
+            <w:pPr>
+              <w:rPr>
+                <w:rFonts w:ascii="Times New Roman" w:eastAsia="Times New Roman" w:hAnsi="Times New Roman" w:cs="Times New Roman"/>
+                <w:kern w:val="0"/>
+                <w:lang w:eastAsia="en-CA"/>
+                <w14:ligatures w14:val="none"/>
+              </w:rPr>
+            </w:pPr>
+            <w:r>
+              <w:rPr>
+                <w:rFonts w:ascii="Times New Roman" w:eastAsia="Times New Roman" w:hAnsi="Times New Roman" w:cs="Times New Roman"/>
+                <w:b/>
+                <w:bCs/>
+                <w:kern w:val="0"/>
+                <w:lang w:eastAsia="en-CA"/>
+                <w14:ligatures w14:val="none"/>
+              </w:rPr>
+              <w:t>Adaptability</w:t>
+            </w:r>
+          </w:p>
+        </w:tc>
+        <w:tc>
+          <w:tcPr>
+            <w:tcW w:w="0" w:type="auto"/>
+            <w:hideMark/>
+          </w:tcPr>
+          <w:p>
+            <w:pPr>
+              <w:rPr>
+                <w:rFonts w:ascii="Times New Roman" w:eastAsia="Times New Roman" w:hAnsi="Times New Roman" w:cs="Times New Roman"/>
+                <w:kern w:val="0"/>
+                <w:lang w:eastAsia="en-CA"/>
+                <w14:ligatures w14:val="none"/>
+              </w:rPr>
+            </w:pPr>
+            <w:r>
+              <w:rPr>
+                <w:rFonts w:ascii="Times New Roman" w:eastAsia="Times New Roman" w:hAnsi="Times New Roman" w:cs="Times New Roman"/>
+                <w:kern w:val="0"/>
+                <w:lang w:eastAsia="en-CA"/>
+                <w14:ligatures w14:val="none"/>
+              </w:rPr>
+              <w:t>Limited adaptability, struggles with sudden market changes.</w:t>
+            </w:r>
+          </w:p>
+        </w:tc>
+        <w:tc>
+          <w:tcPr>
+            <w:tcW w:w="0" w:type="auto"/>
+            <w:hideMark/>
+          </w:tcPr>
+          <w:p>
+            <w:pPr>
+              <w:rPr>
+                <w:rFonts w:ascii="Times New Roman" w:eastAsia="Times New Roman" w:hAnsi="Times New Roman" w:cs="Times New Roman"/>
+                <w:kern w:val="0"/>
+                <w:lang w:eastAsia="en-CA"/>
+                <w14:ligatures w14:val="none"/>
+              </w:rPr>
+            </w:pPr>
+            <w:r>
+              <w:rPr>
+                <w:rFonts w:ascii="Times New Roman" w:eastAsia="Times New Roman" w:hAnsi="Times New Roman" w:cs="Times New Roman"/>
+                <w:kern w:val="0"/>
+                <w:lang w:eastAsia="en-CA"/>
+                <w14:ligatures w14:val="none"/>
+              </w:rPr>
+              <w:t>Highly adaptive, adjusts based on real-time market conditions.</w:t>
+            </w:r>
+          </w:p>
+        </w:tc>
+      </w:tr>
+      <w:tr>
+        <w:tc>
+          <w:tcPr>
+            <w:tcW w:w="0" w:type="auto"/>
+            <w:hideMark/>
+          </w:tcPr>
+          <w:p>
+            <w:pPr>
+              <w:rPr>
+                <w:rFonts w:ascii="Times New Roman" w:eastAsia="Times New Roman" w:hAnsi="Times New Roman" w:cs="Times New Roman"/>
+                <w:kern w:val="0"/>
+                <w:lang w:eastAsia="en-CA"/>
+                <w14:ligatures w14:val="none"/>
+              </w:rPr>
+            </w:pPr>
+            <w:r>
+              <w:rPr>
+                <w:rFonts w:ascii="Times New Roman" w:eastAsia="Times New Roman" w:hAnsi="Times New Roman" w:cs="Times New Roman"/>
+                <w:b/>
+                <w:bCs/>
+                <w:kern w:val="0"/>
+                <w:lang w:eastAsia="en-CA"/>
+                <w14:ligatures w14:val="none"/>
+              </w:rPr>
+              <w:t>Risk Management</w:t>
+            </w:r>
+          </w:p>
+        </w:tc>
+        <w:tc>
+          <w:tcPr>
+            <w:tcW w:w="0" w:type="auto"/>
+            <w:hideMark/>
+          </w:tcPr>
+          <w:p>
+            <w:pPr>
+              <w:rPr>
+                <w:rFonts w:ascii="Times New Roman" w:eastAsia="Times New Roman" w:hAnsi="Times New Roman" w:cs="Times New Roman"/>
+                <w:kern w:val="0"/>
+                <w:lang w:eastAsia="en-CA"/>
+                <w14:ligatures w14:val="none"/>
+              </w:rPr>
+            </w:pPr>
+            <w:r>
+              <w:rPr>
+                <w:rFonts w:ascii="Times New Roman" w:eastAsia="Times New Roman" w:hAnsi="Times New Roman" w:cs="Times New Roman"/>
+                <w:kern w:val="0"/>
+                <w:lang w:eastAsia="en-CA"/>
+                <w14:ligatures w14:val="none"/>
+              </w:rPr>
+              <w:t>Risk assessed using static models (e.g., volatility, correlation).</w:t>
+            </w:r>
+          </w:p>
+        </w:tc>
+        <w:tc>
+          <w:tcPr>
+            <w:tcW w:w="0" w:type="auto"/>
+            <w:hideMark/>
+          </w:tcPr>
+          <w:p>
+            <w:pPr>
+              <w:rPr>
+                <w:rFonts w:ascii="Times New Roman" w:eastAsia="Times New Roman" w:hAnsi="Times New Roman" w:cs="Times New Roman"/>
+                <w:kern w:val="0"/>
+                <w:lang w:eastAsia="en-CA"/>
+                <w14:ligatures w14:val="none"/>
+              </w:rPr>
+            </w:pPr>
+            <w:r>
+              <w:rPr>
+                <w:rFonts w:ascii="Times New Roman" w:eastAsia="Times New Roman" w:hAnsi="Times New Roman" w:cs="Times New Roman"/>
+                <w:kern w:val="0"/>
+                <w:lang w:eastAsia="en-CA"/>
+                <w14:ligatures w14:val="none"/>
+              </w:rPr>
+              <w:t>Dynamic risk management, continuously adjusts based on feedback.</w:t>
+            </w:r>
+          </w:p>
+        </w:tc>
+      </w:tr>
+      <w:tr>
+        <w:tc>
+          <w:tcPr>
+            <w:tcW w:w="0" w:type="auto"/>
+            <w:hideMark/>
+          </w:tcPr>
+          <w:p>
+            <w:pPr>
+              <w:rPr>
+                <w:rFonts w:ascii="Times New Roman" w:eastAsia="Times New Roman" w:hAnsi="Times New Roman" w:cs="Times New Roman"/>
+                <w:kern w:val="0"/>
+                <w:lang w:eastAsia="en-CA"/>
+                <w14:ligatures w14:val="none"/>
+              </w:rPr>
+            </w:pPr>
+            <w:r>
+              <w:rPr>
+                <w:rFonts w:ascii="Times New Roman" w:eastAsia="Times New Roman" w:hAnsi="Times New Roman" w:cs="Times New Roman"/>
+                <w:b/>
+                <w:bCs/>
+                <w:kern w:val="0"/>
+                <w:lang w:eastAsia="en-CA"/>
+                <w14:ligatures w14:val="none"/>
+              </w:rPr>
+              <w:t>Handling Complex Constraints</w:t>
+            </w:r>
+          </w:p>
+        </w:tc>
+        <w:tc>
+          <w:tcPr>
+            <w:tcW w:w="0" w:type="auto"/>
+            <w:hideMark/>
+          </w:tcPr>
+          <w:p>
+            <w:pPr>
+              <w:rPr>
+                <w:rFonts w:ascii="Times New Roman" w:eastAsia="Times New Roman" w:hAnsi="Times New Roman" w:cs="Times New Roman"/>
+                <w:kern w:val="0"/>
+                <w:lang w:eastAsia="en-CA"/>
+                <w14:ligatures w14:val="none"/>
+              </w:rPr>
+            </w:pPr>
+            <w:r>
+              <w:rPr>
+                <w:rFonts w:ascii="Times New Roman" w:eastAsia="Times New Roman" w:hAnsi="Times New Roman" w:cs="Times New Roman"/>
+                <w:kern w:val="0"/>
+                <w:lang w:eastAsia="en-CA"/>
+                <w14:ligatures w14:val="none"/>
+              </w:rPr>
+              <w:t>Limited flexibility in incorporating evolving constraints.</w:t>
+            </w:r>
+          </w:p>
+        </w:tc>
+        <w:tc>
+          <w:tcPr>
+            <w:tcW w:w="0" w:type="auto"/>
+            <w:hideMark/>
+          </w:tcPr>
+          <w:p>
+            <w:pPr>
+              <w:rPr>
+                <w:rFonts w:ascii="Times New Roman" w:eastAsia="Times New Roman" w:hAnsi="Times New Roman" w:cs="Times New Roman"/>
+                <w:kern w:val="0"/>
+                <w:lang w:eastAsia="en-CA"/>
+                <w14:ligatures w14:val="none"/>
+              </w:rPr>
+            </w:pPr>
+            <w:r>
+              <w:rPr>
+                <w:rFonts w:ascii="Times New Roman" w:eastAsia="Times New Roman" w:hAnsi="Times New Roman" w:cs="Times New Roman"/>
+                <w:kern w:val="0"/>
+                <w:lang w:eastAsia="en-CA"/>
+                <w14:ligatures w14:val="none"/>
+              </w:rPr>
+              <w:t>Handles multiple constraints (e.g., ESG, liquidity) dynamically.</w:t>
+            </w:r>
+          </w:p>
+        </w:tc>
+      </w:tr>
+      <w:tr>
+        <w:tc>
+          <w:tcPr>
+            <w:tcW w:w="0" w:type="auto"/>
+            <w:hideMark/>
+          </w:tcPr>
+          <w:p>
+            <w:pPr>
+              <w:rPr>
+                <w:rFonts w:ascii="Times New Roman" w:eastAsia="Times New Roman" w:hAnsi="Times New Roman" w:cs="Times New Roman"/>
+                <w:kern w:val="0"/>
+                <w:lang w:eastAsia="en-CA"/>
+                <w14:ligatures w14:val="none"/>
+              </w:rPr>
+            </w:pPr>
+            <w:r>
+              <w:rPr>
+                <w:rFonts w:ascii="Times New Roman" w:eastAsia="Times New Roman" w:hAnsi="Times New Roman" w:cs="Times New Roman"/>
+                <w:b/>
+                <w:bCs/>
+                <w:kern w:val="0"/>
+                <w:lang w:eastAsia="en-CA"/>
+                <w14:ligatures w14:val="none"/>
+              </w:rPr>
+              <w:t>Efficiency and Speed</w:t>
+            </w:r>
+          </w:p>
+        </w:tc>
+        <w:tc>
+          <w:tcPr>
+            <w:tcW w:w="0" w:type="auto"/>
+            <w:hideMark/>
+          </w:tcPr>
+          <w:p>
+            <w:pPr>
+              <w:rPr>
+                <w:rFonts w:ascii="Times New Roman" w:eastAsia="Times New Roman" w:hAnsi="Times New Roman" w:cs="Times New Roman"/>
+                <w:kern w:val="0"/>
+                <w:lang w:eastAsia="en-CA"/>
+                <w14:ligatures w14:val="none"/>
+              </w:rPr>
+            </w:pPr>
+            <w:r>
+              <w:rPr>
+                <w:rFonts w:ascii="Times New Roman" w:eastAsia="Times New Roman" w:hAnsi="Times New Roman" w:cs="Times New Roman"/>
+                <w:kern w:val="0"/>
+                <w:lang w:eastAsia="en-CA"/>
+                <w14:ligatures w14:val="none"/>
+              </w:rPr>
+              <w:t>Slower decision-making, often requires recalibration.</w:t>
+            </w:r>
+          </w:p>
+        </w:tc>
+        <w:tc>
+          <w:tcPr>
+            <w:tcW w:w="0" w:type="auto"/>
+            <w:hideMark/>
+          </w:tcPr>
+          <w:p>
+            <w:pPr>
+              <w:rPr>
+                <w:rFonts w:ascii="Times New Roman" w:eastAsia="Times New Roman" w:hAnsi="Times New Roman" w:cs="Times New Roman"/>
+                <w:kern w:val="0"/>
+                <w:lang w:eastAsia="en-CA"/>
+                <w14:ligatures w14:val="none"/>
+              </w:rPr>
+            </w:pPr>
+            <w:r>
+              <w:rPr>
+                <w:rFonts w:ascii="Times New Roman" w:eastAsia="Times New Roman" w:hAnsi="Times New Roman" w:cs="Times New Roman"/>
+                <w:kern w:val="0"/>
+                <w:lang w:eastAsia="en-CA"/>
+                <w14:ligatures w14:val="none"/>
+              </w:rPr>
+              <w:t>Fast decision-making, operates in real-time with automated adjustments.</w:t>
+            </w:r>
+          </w:p>
+        </w:tc>
+      </w:tr>
+      <w:tr>
+        <w:tc>
+          <w:tcPr>
+            <w:tcW w:w="0" w:type="auto"/>
+            <w:hideMark/>
+          </w:tcPr>
+          <w:p>
+            <w:pPr>
+              <w:rPr>
+                <w:rFonts w:ascii="Times New Roman" w:eastAsia="Times New Roman" w:hAnsi="Times New Roman" w:cs="Times New Roman"/>
+                <w:kern w:val="0"/>
+                <w:lang w:eastAsia="en-CA"/>
+                <w14:ligatures w14:val="none"/>
+              </w:rPr>
+            </w:pPr>
+            <w:r>
+              <w:rPr>
+                <w:rFonts w:ascii="Times New Roman" w:eastAsia="Times New Roman" w:hAnsi="Times New Roman" w:cs="Times New Roman"/>
+                <w:b/>
+                <w:bCs/>
+                <w:kern w:val="0"/>
+                <w:lang w:eastAsia="en-CA"/>
+                <w14:ligatures w14:val="none"/>
+              </w:rPr>
+              <w:t>Learning from Past Performance</w:t>
+            </w:r>
+          </w:p>
+        </w:tc>
+        <w:tc>
+          <w:tcPr>
+            <w:tcW w:w="0" w:type="auto"/>
+            <w:hideMark/>
+          </w:tcPr>
+          <w:p>
+            <w:pPr>
+              <w:rPr>
+                <w:rFonts w:ascii="Times New Roman" w:eastAsia="Times New Roman" w:hAnsi="Times New Roman" w:cs="Times New Roman"/>
+                <w:kern w:val="0"/>
+                <w:lang w:eastAsia="en-CA"/>
+                <w14:ligatures w14:val="none"/>
+              </w:rPr>
+            </w:pPr>
+            <w:r>
+              <w:rPr>
+                <w:rFonts w:ascii="Times New Roman" w:eastAsia="Times New Roman" w:hAnsi="Times New Roman" w:cs="Times New Roman"/>
+                <w:kern w:val="0"/>
+                <w:lang w:eastAsia="en-CA"/>
+                <w14:ligatures w14:val="none"/>
+              </w:rPr>
+              <w:t>Dependent on historical performance, risk of overfitting.</w:t>
+            </w:r>
+          </w:p>
+        </w:tc>
+        <w:tc>
+          <w:tcPr>
+            <w:tcW w:w="0" w:type="auto"/>
+            <w:hideMark/>
+          </w:tcPr>
+          <w:p>
+            <w:pPr>
+              <w:rPr>
+                <w:rFonts w:ascii="Times New Roman" w:eastAsia="Times New Roman" w:hAnsi="Times New Roman" w:cs="Times New Roman"/>
+                <w:kern w:val="0"/>
+                <w:lang w:eastAsia="en-CA"/>
+                <w14:ligatures w14:val="none"/>
+              </w:rPr>
+            </w:pPr>
+            <w:r>
+              <w:rPr>
+                <w:rFonts w:ascii="Times New Roman" w:eastAsia="Times New Roman" w:hAnsi="Times New Roman" w:cs="Times New Roman"/>
+                <w:kern w:val="0"/>
+                <w:lang w:eastAsia="en-CA"/>
+                <w14:ligatures w14:val="none"/>
+              </w:rPr>
+              <w:t>Continuously learns from feedback, reduces overfitting risks.</w:t>
+            </w:r>
+          </w:p>
+        </w:tc>
+      </w:tr>
+      <w:tr>
+        <w:tc>
+          <w:tcPr>
+            <w:tcW w:w="0" w:type="auto"/>
+            <w:hideMark/>
+          </w:tcPr>
+          <w:p>
+            <w:pPr>
+              <w:rPr>
+                <w:rFonts w:ascii="Times New Roman" w:eastAsia="Times New Roman" w:hAnsi="Times New Roman" w:cs="Times New Roman"/>
+                <w:kern w:val="0"/>
+                <w:lang w:eastAsia="en-CA"/>
+                <w14:ligatures w14:val="none"/>
+              </w:rPr>
+            </w:pPr>
+            <w:r>
+              <w:rPr>
+                <w:rFonts w:ascii="Times New Roman" w:eastAsia="Times New Roman" w:hAnsi="Times New Roman" w:cs="Times New Roman"/>
+                <w:b/>
+                <w:bCs/>
+                <w:kern w:val="0"/>
+                <w:lang w:eastAsia="en-CA"/>
+                <w14:ligatures w14:val="none"/>
+              </w:rPr>
+              <w:t>Human Bias and Emotion</w:t>
+            </w:r>
+          </w:p>
+        </w:tc>
+        <w:tc>
+          <w:tcPr>
+            <w:tcW w:w="0" w:type="auto"/>
+            <w:hideMark/>
+          </w:tcPr>
+          <w:p>
+            <w:pPr>
+              <w:rPr>
+                <w:rFonts w:ascii="Times New Roman" w:eastAsia="Times New Roman" w:hAnsi="Times New Roman" w:cs="Times New Roman"/>
+                <w:kern w:val="0"/>
+                <w:lang w:eastAsia="en-CA"/>
+                <w14:ligatures w14:val="none"/>
+              </w:rPr>
+            </w:pPr>
+            <w:r>
+              <w:rPr>
+                <w:rFonts w:ascii="Times New Roman" w:eastAsia="Times New Roman" w:hAnsi="Times New Roman" w:cs="Times New Roman"/>
+                <w:kern w:val="0"/>
+                <w:lang w:eastAsia="en-CA"/>
+                <w14:ligatures w14:val="none"/>
+              </w:rPr>
+              <w:t>Susceptible to human biases (e.g., overconfidence, loss aversion).</w:t>
+            </w:r>
+          </w:p>
+        </w:tc>
+        <w:tc>
+          <w:tcPr>
+            <w:tcW w:w="0" w:type="auto"/>
+            <w:hideMark/>
+          </w:tcPr>
+          <w:p>
+            <w:pPr>
+              <w:rPr>
+                <w:rFonts w:ascii="Times New Roman" w:eastAsia="Times New Roman" w:hAnsi="Times New Roman" w:cs="Times New Roman"/>
+                <w:kern w:val="0"/>
+                <w:lang w:eastAsia="en-CA"/>
+                <w14:ligatures w14:val="none"/>
+              </w:rPr>
+            </w:pPr>
+            <w:r>
+              <w:rPr>
+                <w:rFonts w:ascii="Times New Roman" w:eastAsia="Times New Roman" w:hAnsi="Times New Roman" w:cs="Times New Roman"/>
+                <w:kern w:val="0"/>
+                <w:lang w:eastAsia="en-CA"/>
+                <w14:ligatures w14:val="none"/>
+              </w:rPr>
+              <w:t>Objective, data-driven decisions without human emotional bias.</w:t>
+            </w:r>
+          </w:p>
+        </w:tc>
+      </w:tr>
+    </w:tbl>
+    <w:p>
+      <w:pPr>
+        <w:jc w:val="both"/>
+        <w:rPr>
+          <w:b/>
+          <w:bCs/>
+        </w:rPr>
+      </w:pPr>
+    </w:p>
+    <w:p>
+      <w:pPr>
+        <w:jc w:val="both"/>
+        <w:rPr>
+          <w:b/>
+          <w:bCs/>
+        </w:rPr>
+      </w:pPr>
+      <w:r>
+        <w:rPr>
+          <w:b/>
+          <w:bCs/>
+        </w:rPr>
+        <w:t>Challenges and Considerations</w:t>
+      </w:r>
+    </w:p>
+    <w:p>
+      <w:pPr>
+        <w:pStyle w:val="ListParagraph"/>
+        <w:numPr>
+          <w:ilvl w:val="0"/>
+          <w:numId w:val="10"/>
+        </w:numPr>
+        <w:spacing w:after="0" w:line="240" w:lineRule="auto"/>
+        <w:jc w:val="both"/>
+        <w:rPr>
+          <w:rFonts w:eastAsia="Times New Roman" w:cs="Times New Roman"/>
+          <w:kern w:val="0"/>
+          <w:lang w:eastAsia="en-CA"/>
+          <w14:ligatures w14:val="none"/>
+        </w:rPr>
+      </w:pPr>
+      <w:r>
+        <w:rPr>
+          <w:rFonts w:eastAsia="Times New Roman" w:cs="Times New Roman"/>
+          <w:b/>
+          <w:bCs/>
+          <w:kern w:val="0"/>
+          <w:lang w:eastAsia="en-CA"/>
+          <w14:ligatures w14:val="none"/>
+        </w:rPr>
+        <w:t>Data Requirements:</w:t>
+      </w:r>
+      <w:r>
+        <w:rPr>
+          <w:rFonts w:eastAsia="Times New Roman" w:cs="Times New Roman"/>
+          <w:kern w:val="0"/>
+          <w:lang w:eastAsia="en-CA"/>
+          <w14:ligatures w14:val="none"/>
+        </w:rPr>
+        <w:t xml:space="preserve"> RL models require high-quality, granular data for effective training. Incomplete or noisy data may lead to poor decision-making.</w:t>
+      </w:r>
+    </w:p>
+    <w:p>
+      <w:pPr>
+        <w:pStyle w:val="ListParagraph"/>
+        <w:numPr>
+          <w:ilvl w:val="0"/>
+          <w:numId w:val="10"/>
+        </w:numPr>
+        <w:spacing w:after="0" w:line="240" w:lineRule="auto"/>
+        <w:jc w:val="both"/>
+        <w:rPr>
+          <w:rFonts w:eastAsia="Times New Roman" w:cs="Times New Roman"/>
+          <w:kern w:val="0"/>
+          <w:lang w:eastAsia="en-CA"/>
+          <w14:ligatures w14:val="none"/>
+        </w:rPr>
+      </w:pPr>
+      <w:r>
+        <w:rPr>
+          <w:rFonts w:eastAsia="Times New Roman" w:cs="Times New Roman"/>
+          <w:b/>
+          <w:bCs/>
+          <w:kern w:val="0"/>
+          <w:lang w:eastAsia="en-CA"/>
+          <w14:ligatures w14:val="none"/>
+        </w:rPr>
+        <w:t>Computational Complexity:</w:t>
+      </w:r>
+      <w:r>
+        <w:rPr>
+          <w:rFonts w:eastAsia="Times New Roman" w:cs="Times New Roman"/>
+          <w:kern w:val="0"/>
+          <w:lang w:eastAsia="en-CA"/>
+          <w14:ligatures w14:val="none"/>
+        </w:rPr>
+        <w:t xml:space="preserve"> Training RL agents involves significant computational resources, requiring advanced hardware and specialized software.</w:t>
+      </w:r>
+    </w:p>
+    <w:p>
+      <w:pPr>
+        <w:pStyle w:val="ListParagraph"/>
+        <w:numPr>
+          <w:ilvl w:val="0"/>
+          <w:numId w:val="10"/>
+        </w:numPr>
+        <w:spacing w:after="0" w:line="240" w:lineRule="auto"/>
+        <w:jc w:val="both"/>
+        <w:rPr>
+          <w:rFonts w:eastAsia="Times New Roman" w:cs="Times New Roman"/>
+          <w:kern w:val="0"/>
+          <w:lang w:eastAsia="en-CA"/>
+          <w14:ligatures w14:val="none"/>
+        </w:rPr>
+      </w:pPr>
+      <w:r>
+        <w:rPr>
+          <w:rFonts w:eastAsia="Times New Roman" w:cs="Times New Roman"/>
+          <w:b/>
+          <w:bCs/>
+          <w:kern w:val="0"/>
+          <w:lang w:eastAsia="en-CA"/>
+          <w14:ligatures w14:val="none"/>
+        </w:rPr>
+        <w:t>Regulatory Scrutiny:</w:t>
+      </w:r>
+      <w:r>
+        <w:rPr>
+          <w:rFonts w:eastAsia="Times New Roman" w:cs="Times New Roman"/>
+          <w:kern w:val="0"/>
+          <w:lang w:eastAsia="en-CA"/>
+          <w14:ligatures w14:val="none"/>
+        </w:rPr>
+        <w:t xml:space="preserve"> Financial institutions must ensure that RL models comply with financial regulations, including transparency and accountability.</w:t>
+      </w:r>
+    </w:p>
+    <w:p>
+      <w:pPr>
+        <w:pStyle w:val="ListParagraph"/>
+        <w:numPr>
+          <w:ilvl w:val="0"/>
+          <w:numId w:val="10"/>
+        </w:numPr>
+        <w:jc w:val="both"/>
+      </w:pPr>
+      <w:r>
+        <w:rPr>
+          <w:rFonts w:eastAsia="Times New Roman" w:cs="Times New Roman"/>
+          <w:b/>
+          <w:bCs/>
+          <w:kern w:val="0"/>
+          <w:lang w:eastAsia="en-CA"/>
+          <w14:ligatures w14:val="none"/>
+        </w:rPr>
+        <w:t>Interpretability:</w:t>
+      </w:r>
+      <w:r>
+        <w:rPr>
+          <w:rFonts w:eastAsia="Times New Roman" w:cs="Times New Roman"/>
+          <w:kern w:val="0"/>
+          <w:lang w:eastAsia="en-CA"/>
+          <w14:ligatures w14:val="none"/>
+        </w:rPr>
+        <w:t xml:space="preserve"> Explaining RL decisions can be challenging, as the models often operate as black-box systems. This makes it harder to communicate the rationale behind a decision to stakeholders.</w:t>
+      </w:r>
+    </w:p>
+    <w:p>
+      <w:pPr>
         <w:spacing w:after="162" w:line="360" w:lineRule="auto"/>
         <w:ind w:right="60"/>
         <w:rPr>
@@ -1714,34 +3064,6 @@
           <w14:ligatures w14:val="none"/>
         </w:rPr>
       </w:pPr>
-      <w:proofErr w:type="gramStart"/>
-      <w:r>
-        <w:rPr>
-          <w:rFonts w:ascii="Times New Roman" w:eastAsia="Times New Roman" w:hAnsi="Times New Roman" w:cs="Times New Roman"/>
-          <w:bCs/>
-          <w:color w:val="000000"/>
-          <w:kern w:val="0"/>
-          <w:sz w:val="32"/>
-          <w:szCs w:val="32"/>
-          <w:lang w:val="en-US"/>
-          <w14:ligatures w14:val="none"/>
-        </w:rPr>
-        <w:t>Answer</w:t>
-      </w:r>
-      <w:proofErr w:type="gramEnd"/>
-      <w:r>
-        <w:rPr>
-          <w:rFonts w:ascii="Times New Roman" w:eastAsia="Times New Roman" w:hAnsi="Times New Roman" w:cs="Times New Roman"/>
-          <w:bCs/>
-          <w:color w:val="000000"/>
-          <w:kern w:val="0"/>
-          <w:sz w:val="32"/>
-          <w:szCs w:val="32"/>
-          <w:lang w:val="en-US"/>
-          <w14:ligatures w14:val="none"/>
-        </w:rPr>
-        <w:t xml:space="preserve"> here:</w:t>
-      </w:r>
     </w:p>
     <w:p>
       <w:pPr>
@@ -1938,6 +3260,7 @@
           <w:lang w:val="en-US"/>
           <w14:ligatures w14:val="none"/>
         </w:rPr>
+        <w:lastRenderedPageBreak/>
         <w:t xml:space="preserve">      1.2.2 The role of risk management in investment strategies.</w:t>
       </w:r>
     </w:p>
@@ -2140,7 +3463,6 @@
           <w:lang w:val="en-US"/>
           <w14:ligatures w14:val="none"/>
         </w:rPr>
-        <w:lastRenderedPageBreak/>
         <w:t>Explain the financial impact of poor risk management and how reinforcement learning addresses these challenges.</w:t>
       </w:r>
     </w:p>
@@ -2471,6 +3793,7 @@
           <w:lang w:val="en-US"/>
           <w14:ligatures w14:val="none"/>
         </w:rPr>
+        <w:lastRenderedPageBreak/>
         <w:t xml:space="preserve">3.3. </w:t>
       </w:r>
       <w:proofErr w:type="gramStart"/>
@@ -2670,7 +3993,6 @@
           <w:lang w:val="en-US"/>
           <w14:ligatures w14:val="none"/>
         </w:rPr>
-        <w:lastRenderedPageBreak/>
         <w:t xml:space="preserve">2. Justifies why your reinforcement learning-based approach is innovative and effective compared to other solutions. </w:t>
       </w:r>
     </w:p>
@@ -3114,6 +4436,7 @@
           <w:lang w:val="en-US"/>
           <w14:ligatures w14:val="none"/>
         </w:rPr>
+        <w:lastRenderedPageBreak/>
         <w:t xml:space="preserve">5 Analyze the data to identify </w:t>
       </w:r>
       <w:proofErr w:type="gramStart"/>
@@ -3813,16 +5136,59 @@
     </w:p>
     <w:p>
       <w:pPr>
+        <w:pStyle w:val="ListParagraph"/>
+        <w:numPr>
+          <w:ilvl w:val="0"/>
+          <w:numId w:val="13"/>
+        </w:numPr>
         <w:spacing w:after="162" w:line="360" w:lineRule="auto"/>
-        <w:ind w:left="20" w:right="60" w:hanging="10"/>
-        <w:rPr>
-          <w:rFonts w:ascii="Times New Roman" w:eastAsia="Times New Roman" w:hAnsi="Times New Roman" w:cs="Times New Roman"/>
-          <w:color w:val="000000"/>
-          <w:kern w:val="0"/>
-          <w:lang w:val="en-US"/>
-          <w14:ligatures w14:val="none"/>
-        </w:rPr>
-      </w:pPr>
+        <w:ind w:right="60"/>
+      </w:pPr>
+      <w:r>
+        <w:t xml:space="preserve">Investopedia. “What Is Portfolio Management?” [Online]. Available: </w:t>
+      </w:r>
+      <w:hyperlink r:id="rId6" w:tgtFrame="_new" w:history="1">
+        <w:r>
+          <w:rPr>
+            <w:rStyle w:val="Hyperlink"/>
+          </w:rPr>
+          <w:t>https://www.investopedia.com/</w:t>
+        </w:r>
+      </w:hyperlink>
+    </w:p>
+    <w:p>
+      <w:pPr>
+        <w:pStyle w:val="ListParagraph"/>
+        <w:numPr>
+          <w:ilvl w:val="0"/>
+          <w:numId w:val="13"/>
+        </w:numPr>
+        <w:spacing w:after="162" w:line="360" w:lineRule="auto"/>
+        <w:ind w:right="60"/>
+        <w:rPr>
+          <w:rFonts w:ascii="Times New Roman" w:eastAsia="Times New Roman" w:hAnsi="Times New Roman" w:cs="Times New Roman"/>
+          <w:color w:val="000000"/>
+          <w:kern w:val="0"/>
+          <w:lang w:val="en-US"/>
+          <w14:ligatures w14:val="none"/>
+        </w:rPr>
+      </w:pPr>
+      <w:proofErr w:type="spellStart"/>
+      <w:r>
+        <w:t>Groww</w:t>
+      </w:r>
+      <w:proofErr w:type="spellEnd"/>
+      <w:r>
+        <w:t xml:space="preserve">. “Portfolio Management Overview.” [Online]. Available: </w:t>
+      </w:r>
+      <w:hyperlink r:id="rId7" w:tgtFrame="_new" w:history="1">
+        <w:r>
+          <w:rPr>
+            <w:rStyle w:val="Hyperlink"/>
+          </w:rPr>
+          <w:t>https://groww.in/p/portfolio-management</w:t>
+        </w:r>
+      </w:hyperlink>
     </w:p>
     <w:p>
       <w:pPr>
@@ -3893,6 +5259,443 @@
 <file path=word/numbering.xml><?xml version="1.0" encoding="utf-8"?>
 <w:numbering xmlns:wpc="http://schemas.microsoft.com/office/word/2010/wordprocessingCanvas" xmlns:cx="http://schemas.microsoft.com/office/drawing/2014/chartex" xmlns:cx1="http://schemas.microsoft.com/office/drawing/2015/9/8/chartex" xmlns:cx2="http://schemas.microsoft.com/office/drawing/2015/10/21/chartex" xmlns:cx3="http://schemas.microsoft.com/office/drawing/2016/5/9/chartex" xmlns:cx4="http://schemas.microsoft.com/office/drawing/2016/5/10/chartex" xmlns:cx5="http://schemas.microsoft.com/office/drawing/2016/5/11/chartex" xmlns:cx6="http://schemas.microsoft.com/office/drawing/2016/5/12/chartex" xmlns:cx7="http://schemas.microsoft.com/office/drawing/2016/5/13/chartex" xmlns:cx8="http://schemas.microsoft.com/office/drawing/2016/5/14/chartex" xmlns:mc="http://schemas.openxmlformats.org/markup-compatibility/2006" xmlns:aink="http://schemas.microsoft.com/office/drawing/2016/ink" xmlns:am3d="http://schemas.microsoft.com/office/drawing/2017/model3d" xmlns:o="urn:schemas-microsoft-com:office:office" xmlns:oel="http://schemas.microsoft.com/office/2019/extlst" xmlns:r="http://schemas.openxmlformats.org/officeDocument/2006/relationships" xmlns:m="http://schemas.openxmlformats.org/officeDocument/2006/math" xmlns:v="urn:schemas-microsoft-com:vml" xmlns:wp14="http://schemas.microsoft.com/office/word/2010/wordprocessingDrawing" xmlns:wp="http://schemas.openxmlformats.org/drawingml/2006/wordprocessingDrawing" xmlns:w10="urn:schemas-microsoft-com:office:word" xmlns:w="http://schemas.openxmlformats.org/wordprocessingml/2006/main" xmlns:w14="http://schemas.microsoft.com/office/word/2010/wordml" xmlns:w15="http://schemas.microsoft.com/office/word/2012/wordml" xmlns:w16cex="http://schemas.microsoft.com/office/word/2018/wordml/cex" xmlns:w16cid="http://schemas.microsoft.com/office/word/2016/wordml/cid" xmlns:w16="http://schemas.microsoft.com/office/word/2018/wordml" xmlns:w16du="http://schemas.microsoft.com/office/word/2023/wordml/word16du" xmlns:w16sdtdh="http://schemas.microsoft.com/office/word/2020/wordml/sdtdatahash" xmlns:w16sdtfl="http://schemas.microsoft.com/office/word/2024/wordml/sdtformatlock" xmlns:w16se="http://schemas.microsoft.com/office/word/2015/wordml/symex" xmlns:wpg="http://schemas.microsoft.com/office/word/2010/wordprocessingGroup" xmlns:wpi="http://schemas.microsoft.com/office/word/2010/wordprocessingInk" xmlns:wne="http://schemas.microsoft.com/office/word/2006/wordml" xmlns:wps="http://schemas.microsoft.com/office/word/2010/wordprocessingShape" mc:Ignorable="w14 w15 w16se w16cid w16 w16cex w16sdtdh w16sdtfl w16du wp14">
   <w:abstractNum w:abstractNumId="0" w15:restartNumberingAfterBreak="0">
+    <w:nsid w:val="0C7060FD"/>
+    <w:multiLevelType w:val="hybridMultilevel"/>
+    <w:tmpl w:val="F306C2C4"/>
+    <w:lvl w:ilvl="0" w:tplc="1009000F">
+      <w:start w:val="1"/>
+      <w:numFmt w:val="decimal"/>
+      <w:lvlText w:val="%1."/>
+      <w:lvlJc w:val="left"/>
+      <w:pPr>
+        <w:ind w:left="720" w:hanging="360"/>
+      </w:pPr>
+      <w:rPr>
+        <w:rFonts w:hint="default"/>
+      </w:rPr>
+    </w:lvl>
+    <w:lvl w:ilvl="1" w:tplc="10090019" w:tentative="1">
+      <w:start w:val="1"/>
+      <w:numFmt w:val="lowerLetter"/>
+      <w:lvlText w:val="%2."/>
+      <w:lvlJc w:val="left"/>
+      <w:pPr>
+        <w:ind w:left="1440" w:hanging="360"/>
+      </w:pPr>
+    </w:lvl>
+    <w:lvl w:ilvl="2" w:tplc="1009001B" w:tentative="1">
+      <w:start w:val="1"/>
+      <w:numFmt w:val="lowerRoman"/>
+      <w:lvlText w:val="%3."/>
+      <w:lvlJc w:val="right"/>
+      <w:pPr>
+        <w:ind w:left="2160" w:hanging="180"/>
+      </w:pPr>
+    </w:lvl>
+    <w:lvl w:ilvl="3" w:tplc="1009000F" w:tentative="1">
+      <w:start w:val="1"/>
+      <w:numFmt w:val="decimal"/>
+      <w:lvlText w:val="%4."/>
+      <w:lvlJc w:val="left"/>
+      <w:pPr>
+        <w:ind w:left="2880" w:hanging="360"/>
+      </w:pPr>
+    </w:lvl>
+    <w:lvl w:ilvl="4" w:tplc="10090019" w:tentative="1">
+      <w:start w:val="1"/>
+      <w:numFmt w:val="lowerLetter"/>
+      <w:lvlText w:val="%5."/>
+      <w:lvlJc w:val="left"/>
+      <w:pPr>
+        <w:ind w:left="3600" w:hanging="360"/>
+      </w:pPr>
+    </w:lvl>
+    <w:lvl w:ilvl="5" w:tplc="1009001B" w:tentative="1">
+      <w:start w:val="1"/>
+      <w:numFmt w:val="lowerRoman"/>
+      <w:lvlText w:val="%6."/>
+      <w:lvlJc w:val="right"/>
+      <w:pPr>
+        <w:ind w:left="4320" w:hanging="180"/>
+      </w:pPr>
+    </w:lvl>
+    <w:lvl w:ilvl="6" w:tplc="1009000F" w:tentative="1">
+      <w:start w:val="1"/>
+      <w:numFmt w:val="decimal"/>
+      <w:lvlText w:val="%7."/>
+      <w:lvlJc w:val="left"/>
+      <w:pPr>
+        <w:ind w:left="5040" w:hanging="360"/>
+      </w:pPr>
+    </w:lvl>
+    <w:lvl w:ilvl="7" w:tplc="10090019" w:tentative="1">
+      <w:start w:val="1"/>
+      <w:numFmt w:val="lowerLetter"/>
+      <w:lvlText w:val="%8."/>
+      <w:lvlJc w:val="left"/>
+      <w:pPr>
+        <w:ind w:left="5760" w:hanging="360"/>
+      </w:pPr>
+    </w:lvl>
+    <w:lvl w:ilvl="8" w:tplc="1009001B" w:tentative="1">
+      <w:start w:val="1"/>
+      <w:numFmt w:val="lowerRoman"/>
+      <w:lvlText w:val="%9."/>
+      <w:lvlJc w:val="right"/>
+      <w:pPr>
+        <w:ind w:left="6480" w:hanging="180"/>
+      </w:pPr>
+    </w:lvl>
+  </w:abstractNum>
+  <w:abstractNum w:abstractNumId="1" w15:restartNumberingAfterBreak="0">
+    <w:nsid w:val="133622D8"/>
+    <w:multiLevelType w:val="multilevel"/>
+    <w:tmpl w:val="D936658C"/>
+    <w:lvl w:ilvl="0">
+      <w:start w:val="1"/>
+      <w:numFmt w:val="bullet"/>
+      <w:lvlText w:val=""/>
+      <w:lvlJc w:val="left"/>
+      <w:pPr>
+        <w:tabs>
+          <w:tab w:val="num" w:pos="720"/>
+        </w:tabs>
+        <w:ind w:left="720" w:hanging="360"/>
+      </w:pPr>
+      <w:rPr>
+        <w:rFonts w:ascii="Symbol" w:hAnsi="Symbol" w:hint="default"/>
+        <w:sz w:val="20"/>
+      </w:rPr>
+    </w:lvl>
+    <w:lvl w:ilvl="1" w:tentative="1">
+      <w:start w:val="1"/>
+      <w:numFmt w:val="bullet"/>
+      <w:lvlText w:val="o"/>
+      <w:lvlJc w:val="left"/>
+      <w:pPr>
+        <w:tabs>
+          <w:tab w:val="num" w:pos="1440"/>
+        </w:tabs>
+        <w:ind w:left="1440" w:hanging="360"/>
+      </w:pPr>
+      <w:rPr>
+        <w:rFonts w:ascii="Courier New" w:hAnsi="Courier New" w:hint="default"/>
+        <w:sz w:val="20"/>
+      </w:rPr>
+    </w:lvl>
+    <w:lvl w:ilvl="2" w:tentative="1">
+      <w:start w:val="1"/>
+      <w:numFmt w:val="bullet"/>
+      <w:lvlText w:val=""/>
+      <w:lvlJc w:val="left"/>
+      <w:pPr>
+        <w:tabs>
+          <w:tab w:val="num" w:pos="2160"/>
+        </w:tabs>
+        <w:ind w:left="2160" w:hanging="360"/>
+      </w:pPr>
+      <w:rPr>
+        <w:rFonts w:ascii="Wingdings" w:hAnsi="Wingdings" w:hint="default"/>
+        <w:sz w:val="20"/>
+      </w:rPr>
+    </w:lvl>
+    <w:lvl w:ilvl="3" w:tentative="1">
+      <w:start w:val="1"/>
+      <w:numFmt w:val="bullet"/>
+      <w:lvlText w:val=""/>
+      <w:lvlJc w:val="left"/>
+      <w:pPr>
+        <w:tabs>
+          <w:tab w:val="num" w:pos="2880"/>
+        </w:tabs>
+        <w:ind w:left="2880" w:hanging="360"/>
+      </w:pPr>
+      <w:rPr>
+        <w:rFonts w:ascii="Wingdings" w:hAnsi="Wingdings" w:hint="default"/>
+        <w:sz w:val="20"/>
+      </w:rPr>
+    </w:lvl>
+    <w:lvl w:ilvl="4" w:tentative="1">
+      <w:start w:val="1"/>
+      <w:numFmt w:val="bullet"/>
+      <w:lvlText w:val=""/>
+      <w:lvlJc w:val="left"/>
+      <w:pPr>
+        <w:tabs>
+          <w:tab w:val="num" w:pos="3600"/>
+        </w:tabs>
+        <w:ind w:left="3600" w:hanging="360"/>
+      </w:pPr>
+      <w:rPr>
+        <w:rFonts w:ascii="Wingdings" w:hAnsi="Wingdings" w:hint="default"/>
+        <w:sz w:val="20"/>
+      </w:rPr>
+    </w:lvl>
+    <w:lvl w:ilvl="5" w:tentative="1">
+      <w:start w:val="1"/>
+      <w:numFmt w:val="bullet"/>
+      <w:lvlText w:val=""/>
+      <w:lvlJc w:val="left"/>
+      <w:pPr>
+        <w:tabs>
+          <w:tab w:val="num" w:pos="4320"/>
+        </w:tabs>
+        <w:ind w:left="4320" w:hanging="360"/>
+      </w:pPr>
+      <w:rPr>
+        <w:rFonts w:ascii="Wingdings" w:hAnsi="Wingdings" w:hint="default"/>
+        <w:sz w:val="20"/>
+      </w:rPr>
+    </w:lvl>
+    <w:lvl w:ilvl="6" w:tentative="1">
+      <w:start w:val="1"/>
+      <w:numFmt w:val="bullet"/>
+      <w:lvlText w:val=""/>
+      <w:lvlJc w:val="left"/>
+      <w:pPr>
+        <w:tabs>
+          <w:tab w:val="num" w:pos="5040"/>
+        </w:tabs>
+        <w:ind w:left="5040" w:hanging="360"/>
+      </w:pPr>
+      <w:rPr>
+        <w:rFonts w:ascii="Wingdings" w:hAnsi="Wingdings" w:hint="default"/>
+        <w:sz w:val="20"/>
+      </w:rPr>
+    </w:lvl>
+    <w:lvl w:ilvl="7" w:tentative="1">
+      <w:start w:val="1"/>
+      <w:numFmt w:val="bullet"/>
+      <w:lvlText w:val=""/>
+      <w:lvlJc w:val="left"/>
+      <w:pPr>
+        <w:tabs>
+          <w:tab w:val="num" w:pos="5760"/>
+        </w:tabs>
+        <w:ind w:left="5760" w:hanging="360"/>
+      </w:pPr>
+      <w:rPr>
+        <w:rFonts w:ascii="Wingdings" w:hAnsi="Wingdings" w:hint="default"/>
+        <w:sz w:val="20"/>
+      </w:rPr>
+    </w:lvl>
+    <w:lvl w:ilvl="8" w:tentative="1">
+      <w:start w:val="1"/>
+      <w:numFmt w:val="bullet"/>
+      <w:lvlText w:val=""/>
+      <w:lvlJc w:val="left"/>
+      <w:pPr>
+        <w:tabs>
+          <w:tab w:val="num" w:pos="6480"/>
+        </w:tabs>
+        <w:ind w:left="6480" w:hanging="360"/>
+      </w:pPr>
+      <w:rPr>
+        <w:rFonts w:ascii="Wingdings" w:hAnsi="Wingdings" w:hint="default"/>
+        <w:sz w:val="20"/>
+      </w:rPr>
+    </w:lvl>
+  </w:abstractNum>
+  <w:abstractNum w:abstractNumId="2" w15:restartNumberingAfterBreak="0">
+    <w:nsid w:val="1EF4366F"/>
+    <w:multiLevelType w:val="multilevel"/>
+    <w:tmpl w:val="06820DDE"/>
+    <w:lvl w:ilvl="0">
+      <w:start w:val="1"/>
+      <w:numFmt w:val="decimal"/>
+      <w:lvlText w:val="%1."/>
+      <w:lvlJc w:val="left"/>
+      <w:pPr>
+        <w:tabs>
+          <w:tab w:val="num" w:pos="720"/>
+        </w:tabs>
+        <w:ind w:left="720" w:hanging="360"/>
+      </w:pPr>
+    </w:lvl>
+    <w:lvl w:ilvl="1" w:tentative="1">
+      <w:start w:val="1"/>
+      <w:numFmt w:val="decimal"/>
+      <w:lvlText w:val="%2."/>
+      <w:lvlJc w:val="left"/>
+      <w:pPr>
+        <w:tabs>
+          <w:tab w:val="num" w:pos="1440"/>
+        </w:tabs>
+        <w:ind w:left="1440" w:hanging="360"/>
+      </w:pPr>
+    </w:lvl>
+    <w:lvl w:ilvl="2" w:tentative="1">
+      <w:start w:val="1"/>
+      <w:numFmt w:val="decimal"/>
+      <w:lvlText w:val="%3."/>
+      <w:lvlJc w:val="left"/>
+      <w:pPr>
+        <w:tabs>
+          <w:tab w:val="num" w:pos="2160"/>
+        </w:tabs>
+        <w:ind w:left="2160" w:hanging="360"/>
+      </w:pPr>
+    </w:lvl>
+    <w:lvl w:ilvl="3" w:tentative="1">
+      <w:start w:val="1"/>
+      <w:numFmt w:val="decimal"/>
+      <w:lvlText w:val="%4."/>
+      <w:lvlJc w:val="left"/>
+      <w:pPr>
+        <w:tabs>
+          <w:tab w:val="num" w:pos="2880"/>
+        </w:tabs>
+        <w:ind w:left="2880" w:hanging="360"/>
+      </w:pPr>
+    </w:lvl>
+    <w:lvl w:ilvl="4" w:tentative="1">
+      <w:start w:val="1"/>
+      <w:numFmt w:val="decimal"/>
+      <w:lvlText w:val="%5."/>
+      <w:lvlJc w:val="left"/>
+      <w:pPr>
+        <w:tabs>
+          <w:tab w:val="num" w:pos="3600"/>
+        </w:tabs>
+        <w:ind w:left="3600" w:hanging="360"/>
+      </w:pPr>
+    </w:lvl>
+    <w:lvl w:ilvl="5" w:tentative="1">
+      <w:start w:val="1"/>
+      <w:numFmt w:val="decimal"/>
+      <w:lvlText w:val="%6."/>
+      <w:lvlJc w:val="left"/>
+      <w:pPr>
+        <w:tabs>
+          <w:tab w:val="num" w:pos="4320"/>
+        </w:tabs>
+        <w:ind w:left="4320" w:hanging="360"/>
+      </w:pPr>
+    </w:lvl>
+    <w:lvl w:ilvl="6" w:tentative="1">
+      <w:start w:val="1"/>
+      <w:numFmt w:val="decimal"/>
+      <w:lvlText w:val="%7."/>
+      <w:lvlJc w:val="left"/>
+      <w:pPr>
+        <w:tabs>
+          <w:tab w:val="num" w:pos="5040"/>
+        </w:tabs>
+        <w:ind w:left="5040" w:hanging="360"/>
+      </w:pPr>
+    </w:lvl>
+    <w:lvl w:ilvl="7" w:tentative="1">
+      <w:start w:val="1"/>
+      <w:numFmt w:val="decimal"/>
+      <w:lvlText w:val="%8."/>
+      <w:lvlJc w:val="left"/>
+      <w:pPr>
+        <w:tabs>
+          <w:tab w:val="num" w:pos="5760"/>
+        </w:tabs>
+        <w:ind w:left="5760" w:hanging="360"/>
+      </w:pPr>
+    </w:lvl>
+    <w:lvl w:ilvl="8" w:tentative="1">
+      <w:start w:val="1"/>
+      <w:numFmt w:val="decimal"/>
+      <w:lvlText w:val="%9."/>
+      <w:lvlJc w:val="left"/>
+      <w:pPr>
+        <w:tabs>
+          <w:tab w:val="num" w:pos="6480"/>
+        </w:tabs>
+        <w:ind w:left="6480" w:hanging="360"/>
+      </w:pPr>
+    </w:lvl>
+  </w:abstractNum>
+  <w:abstractNum w:abstractNumId="3" w15:restartNumberingAfterBreak="0">
+    <w:nsid w:val="30DD505F"/>
+    <w:multiLevelType w:val="hybridMultilevel"/>
+    <w:tmpl w:val="1ADA9CCA"/>
+    <w:lvl w:ilvl="0" w:tplc="1009000F">
+      <w:start w:val="1"/>
+      <w:numFmt w:val="decimal"/>
+      <w:lvlText w:val="%1."/>
+      <w:lvlJc w:val="left"/>
+      <w:pPr>
+        <w:ind w:left="730" w:hanging="360"/>
+      </w:pPr>
+    </w:lvl>
+    <w:lvl w:ilvl="1" w:tplc="10090019" w:tentative="1">
+      <w:start w:val="1"/>
+      <w:numFmt w:val="lowerLetter"/>
+      <w:lvlText w:val="%2."/>
+      <w:lvlJc w:val="left"/>
+      <w:pPr>
+        <w:ind w:left="1450" w:hanging="360"/>
+      </w:pPr>
+    </w:lvl>
+    <w:lvl w:ilvl="2" w:tplc="1009001B" w:tentative="1">
+      <w:start w:val="1"/>
+      <w:numFmt w:val="lowerRoman"/>
+      <w:lvlText w:val="%3."/>
+      <w:lvlJc w:val="right"/>
+      <w:pPr>
+        <w:ind w:left="2170" w:hanging="180"/>
+      </w:pPr>
+    </w:lvl>
+    <w:lvl w:ilvl="3" w:tplc="1009000F" w:tentative="1">
+      <w:start w:val="1"/>
+      <w:numFmt w:val="decimal"/>
+      <w:lvlText w:val="%4."/>
+      <w:lvlJc w:val="left"/>
+      <w:pPr>
+        <w:ind w:left="2890" w:hanging="360"/>
+      </w:pPr>
+    </w:lvl>
+    <w:lvl w:ilvl="4" w:tplc="10090019" w:tentative="1">
+      <w:start w:val="1"/>
+      <w:numFmt w:val="lowerLetter"/>
+      <w:lvlText w:val="%5."/>
+      <w:lvlJc w:val="left"/>
+      <w:pPr>
+        <w:ind w:left="3610" w:hanging="360"/>
+      </w:pPr>
+    </w:lvl>
+    <w:lvl w:ilvl="5" w:tplc="1009001B" w:tentative="1">
+      <w:start w:val="1"/>
+      <w:numFmt w:val="lowerRoman"/>
+      <w:lvlText w:val="%6."/>
+      <w:lvlJc w:val="right"/>
+      <w:pPr>
+        <w:ind w:left="4330" w:hanging="180"/>
+      </w:pPr>
+    </w:lvl>
+    <w:lvl w:ilvl="6" w:tplc="1009000F" w:tentative="1">
+      <w:start w:val="1"/>
+      <w:numFmt w:val="decimal"/>
+      <w:lvlText w:val="%7."/>
+      <w:lvlJc w:val="left"/>
+      <w:pPr>
+        <w:ind w:left="5050" w:hanging="360"/>
+      </w:pPr>
+    </w:lvl>
+    <w:lvl w:ilvl="7" w:tplc="10090019" w:tentative="1">
+      <w:start w:val="1"/>
+      <w:numFmt w:val="lowerLetter"/>
+      <w:lvlText w:val="%8."/>
+      <w:lvlJc w:val="left"/>
+      <w:pPr>
+        <w:ind w:left="5770" w:hanging="360"/>
+      </w:pPr>
+    </w:lvl>
+    <w:lvl w:ilvl="8" w:tplc="1009001B" w:tentative="1">
+      <w:start w:val="1"/>
+      <w:numFmt w:val="lowerRoman"/>
+      <w:lvlText w:val="%9."/>
+      <w:lvlJc w:val="right"/>
+      <w:pPr>
+        <w:ind w:left="6490" w:hanging="180"/>
+      </w:pPr>
+    </w:lvl>
+  </w:abstractNum>
+  <w:abstractNum w:abstractNumId="4" w15:restartNumberingAfterBreak="0">
     <w:nsid w:val="31A70FD3"/>
     <w:multiLevelType w:val="hybridMultilevel"/>
     <w:tmpl w:val="6AB41DEC"/>
@@ -4005,7 +5808,120 @@
       </w:rPr>
     </w:lvl>
   </w:abstractNum>
-  <w:abstractNum w:abstractNumId="1" w15:restartNumberingAfterBreak="0">
+  <w:abstractNum w:abstractNumId="5" w15:restartNumberingAfterBreak="0">
+    <w:nsid w:val="359C59A7"/>
+    <w:multiLevelType w:val="multilevel"/>
+    <w:tmpl w:val="35A44F20"/>
+    <w:lvl w:ilvl="0">
+      <w:start w:val="1"/>
+      <w:numFmt w:val="decimal"/>
+      <w:lvlText w:val="%1."/>
+      <w:lvlJc w:val="left"/>
+      <w:pPr>
+        <w:tabs>
+          <w:tab w:val="num" w:pos="720"/>
+        </w:tabs>
+        <w:ind w:left="720" w:hanging="360"/>
+      </w:pPr>
+    </w:lvl>
+    <w:lvl w:ilvl="1" w:tentative="1">
+      <w:start w:val="1"/>
+      <w:numFmt w:val="decimal"/>
+      <w:lvlText w:val="%2."/>
+      <w:lvlJc w:val="left"/>
+      <w:pPr>
+        <w:tabs>
+          <w:tab w:val="num" w:pos="1440"/>
+        </w:tabs>
+        <w:ind w:left="1440" w:hanging="360"/>
+      </w:pPr>
+    </w:lvl>
+    <w:lvl w:ilvl="2" w:tentative="1">
+      <w:start w:val="1"/>
+      <w:numFmt w:val="decimal"/>
+      <w:lvlText w:val="%3."/>
+      <w:lvlJc w:val="left"/>
+      <w:pPr>
+        <w:tabs>
+          <w:tab w:val="num" w:pos="2160"/>
+        </w:tabs>
+        <w:ind w:left="2160" w:hanging="360"/>
+      </w:pPr>
+    </w:lvl>
+    <w:lvl w:ilvl="3" w:tentative="1">
+      <w:start w:val="1"/>
+      <w:numFmt w:val="decimal"/>
+      <w:lvlText w:val="%4."/>
+      <w:lvlJc w:val="left"/>
+      <w:pPr>
+        <w:tabs>
+          <w:tab w:val="num" w:pos="2880"/>
+        </w:tabs>
+        <w:ind w:left="2880" w:hanging="360"/>
+      </w:pPr>
+    </w:lvl>
+    <w:lvl w:ilvl="4" w:tentative="1">
+      <w:start w:val="1"/>
+      <w:numFmt w:val="decimal"/>
+      <w:lvlText w:val="%5."/>
+      <w:lvlJc w:val="left"/>
+      <w:pPr>
+        <w:tabs>
+          <w:tab w:val="num" w:pos="3600"/>
+        </w:tabs>
+        <w:ind w:left="3600" w:hanging="360"/>
+      </w:pPr>
+    </w:lvl>
+    <w:lvl w:ilvl="5" w:tentative="1">
+      <w:start w:val="1"/>
+      <w:numFmt w:val="decimal"/>
+      <w:lvlText w:val="%6."/>
+      <w:lvlJc w:val="left"/>
+      <w:pPr>
+        <w:tabs>
+          <w:tab w:val="num" w:pos="4320"/>
+        </w:tabs>
+        <w:ind w:left="4320" w:hanging="360"/>
+      </w:pPr>
+    </w:lvl>
+    <w:lvl w:ilvl="6" w:tentative="1">
+      <w:start w:val="1"/>
+      <w:numFmt w:val="decimal"/>
+      <w:lvlText w:val="%7."/>
+      <w:lvlJc w:val="left"/>
+      <w:pPr>
+        <w:tabs>
+          <w:tab w:val="num" w:pos="5040"/>
+        </w:tabs>
+        <w:ind w:left="5040" w:hanging="360"/>
+      </w:pPr>
+    </w:lvl>
+    <w:lvl w:ilvl="7" w:tentative="1">
+      <w:start w:val="1"/>
+      <w:numFmt w:val="decimal"/>
+      <w:lvlText w:val="%8."/>
+      <w:lvlJc w:val="left"/>
+      <w:pPr>
+        <w:tabs>
+          <w:tab w:val="num" w:pos="5760"/>
+        </w:tabs>
+        <w:ind w:left="5760" w:hanging="360"/>
+      </w:pPr>
+    </w:lvl>
+    <w:lvl w:ilvl="8" w:tentative="1">
+      <w:start w:val="1"/>
+      <w:numFmt w:val="decimal"/>
+      <w:lvlText w:val="%9."/>
+      <w:lvlJc w:val="left"/>
+      <w:pPr>
+        <w:tabs>
+          <w:tab w:val="num" w:pos="6480"/>
+        </w:tabs>
+        <w:ind w:left="6480" w:hanging="360"/>
+      </w:pPr>
+    </w:lvl>
+  </w:abstractNum>
+  <w:abstractNum w:abstractNumId="6" w15:restartNumberingAfterBreak="0">
     <w:nsid w:val="395C3AD6"/>
     <w:multiLevelType w:val="hybridMultilevel"/>
     <w:tmpl w:val="E82ED508"/>
@@ -4091,7 +6007,531 @@
       </w:pPr>
     </w:lvl>
   </w:abstractNum>
-  <w:abstractNum w:abstractNumId="2" w15:restartNumberingAfterBreak="0">
+  <w:abstractNum w:abstractNumId="7" w15:restartNumberingAfterBreak="0">
+    <w:nsid w:val="47E90250"/>
+    <w:multiLevelType w:val="multilevel"/>
+    <w:tmpl w:val="E58CB294"/>
+    <w:lvl w:ilvl="0">
+      <w:start w:val="1"/>
+      <w:numFmt w:val="bullet"/>
+      <w:lvlText w:val=""/>
+      <w:lvlJc w:val="left"/>
+      <w:pPr>
+        <w:tabs>
+          <w:tab w:val="num" w:pos="720"/>
+        </w:tabs>
+        <w:ind w:left="720" w:hanging="360"/>
+      </w:pPr>
+      <w:rPr>
+        <w:rFonts w:ascii="Symbol" w:hAnsi="Symbol" w:hint="default"/>
+        <w:sz w:val="20"/>
+      </w:rPr>
+    </w:lvl>
+    <w:lvl w:ilvl="1" w:tentative="1">
+      <w:start w:val="1"/>
+      <w:numFmt w:val="bullet"/>
+      <w:lvlText w:val="o"/>
+      <w:lvlJc w:val="left"/>
+      <w:pPr>
+        <w:tabs>
+          <w:tab w:val="num" w:pos="1440"/>
+        </w:tabs>
+        <w:ind w:left="1440" w:hanging="360"/>
+      </w:pPr>
+      <w:rPr>
+        <w:rFonts w:ascii="Courier New" w:hAnsi="Courier New" w:hint="default"/>
+        <w:sz w:val="20"/>
+      </w:rPr>
+    </w:lvl>
+    <w:lvl w:ilvl="2" w:tentative="1">
+      <w:start w:val="1"/>
+      <w:numFmt w:val="bullet"/>
+      <w:lvlText w:val=""/>
+      <w:lvlJc w:val="left"/>
+      <w:pPr>
+        <w:tabs>
+          <w:tab w:val="num" w:pos="2160"/>
+        </w:tabs>
+        <w:ind w:left="2160" w:hanging="360"/>
+      </w:pPr>
+      <w:rPr>
+        <w:rFonts w:ascii="Wingdings" w:hAnsi="Wingdings" w:hint="default"/>
+        <w:sz w:val="20"/>
+      </w:rPr>
+    </w:lvl>
+    <w:lvl w:ilvl="3" w:tentative="1">
+      <w:start w:val="1"/>
+      <w:numFmt w:val="bullet"/>
+      <w:lvlText w:val=""/>
+      <w:lvlJc w:val="left"/>
+      <w:pPr>
+        <w:tabs>
+          <w:tab w:val="num" w:pos="2880"/>
+        </w:tabs>
+        <w:ind w:left="2880" w:hanging="360"/>
+      </w:pPr>
+      <w:rPr>
+        <w:rFonts w:ascii="Wingdings" w:hAnsi="Wingdings" w:hint="default"/>
+        <w:sz w:val="20"/>
+      </w:rPr>
+    </w:lvl>
+    <w:lvl w:ilvl="4" w:tentative="1">
+      <w:start w:val="1"/>
+      <w:numFmt w:val="bullet"/>
+      <w:lvlText w:val=""/>
+      <w:lvlJc w:val="left"/>
+      <w:pPr>
+        <w:tabs>
+          <w:tab w:val="num" w:pos="3600"/>
+        </w:tabs>
+        <w:ind w:left="3600" w:hanging="360"/>
+      </w:pPr>
+      <w:rPr>
+        <w:rFonts w:ascii="Wingdings" w:hAnsi="Wingdings" w:hint="default"/>
+        <w:sz w:val="20"/>
+      </w:rPr>
+    </w:lvl>
+    <w:lvl w:ilvl="5" w:tentative="1">
+      <w:start w:val="1"/>
+      <w:numFmt w:val="bullet"/>
+      <w:lvlText w:val=""/>
+      <w:lvlJc w:val="left"/>
+      <w:pPr>
+        <w:tabs>
+          <w:tab w:val="num" w:pos="4320"/>
+        </w:tabs>
+        <w:ind w:left="4320" w:hanging="360"/>
+      </w:pPr>
+      <w:rPr>
+        <w:rFonts w:ascii="Wingdings" w:hAnsi="Wingdings" w:hint="default"/>
+        <w:sz w:val="20"/>
+      </w:rPr>
+    </w:lvl>
+    <w:lvl w:ilvl="6" w:tentative="1">
+      <w:start w:val="1"/>
+      <w:numFmt w:val="bullet"/>
+      <w:lvlText w:val=""/>
+      <w:lvlJc w:val="left"/>
+      <w:pPr>
+        <w:tabs>
+          <w:tab w:val="num" w:pos="5040"/>
+        </w:tabs>
+        <w:ind w:left="5040" w:hanging="360"/>
+      </w:pPr>
+      <w:rPr>
+        <w:rFonts w:ascii="Wingdings" w:hAnsi="Wingdings" w:hint="default"/>
+        <w:sz w:val="20"/>
+      </w:rPr>
+    </w:lvl>
+    <w:lvl w:ilvl="7" w:tentative="1">
+      <w:start w:val="1"/>
+      <w:numFmt w:val="bullet"/>
+      <w:lvlText w:val=""/>
+      <w:lvlJc w:val="left"/>
+      <w:pPr>
+        <w:tabs>
+          <w:tab w:val="num" w:pos="5760"/>
+        </w:tabs>
+        <w:ind w:left="5760" w:hanging="360"/>
+      </w:pPr>
+      <w:rPr>
+        <w:rFonts w:ascii="Wingdings" w:hAnsi="Wingdings" w:hint="default"/>
+        <w:sz w:val="20"/>
+      </w:rPr>
+    </w:lvl>
+    <w:lvl w:ilvl="8" w:tentative="1">
+      <w:start w:val="1"/>
+      <w:numFmt w:val="bullet"/>
+      <w:lvlText w:val=""/>
+      <w:lvlJc w:val="left"/>
+      <w:pPr>
+        <w:tabs>
+          <w:tab w:val="num" w:pos="6480"/>
+        </w:tabs>
+        <w:ind w:left="6480" w:hanging="360"/>
+      </w:pPr>
+      <w:rPr>
+        <w:rFonts w:ascii="Wingdings" w:hAnsi="Wingdings" w:hint="default"/>
+        <w:sz w:val="20"/>
+      </w:rPr>
+    </w:lvl>
+  </w:abstractNum>
+  <w:abstractNum w:abstractNumId="8" w15:restartNumberingAfterBreak="0">
+    <w:nsid w:val="4A3A6830"/>
+    <w:multiLevelType w:val="multilevel"/>
+    <w:tmpl w:val="A17C9372"/>
+    <w:lvl w:ilvl="0">
+      <w:start w:val="1"/>
+      <w:numFmt w:val="bullet"/>
+      <w:lvlText w:val=""/>
+      <w:lvlJc w:val="left"/>
+      <w:pPr>
+        <w:tabs>
+          <w:tab w:val="num" w:pos="720"/>
+        </w:tabs>
+        <w:ind w:left="720" w:hanging="360"/>
+      </w:pPr>
+      <w:rPr>
+        <w:rFonts w:ascii="Symbol" w:hAnsi="Symbol" w:hint="default"/>
+        <w:sz w:val="20"/>
+      </w:rPr>
+    </w:lvl>
+    <w:lvl w:ilvl="1" w:tentative="1">
+      <w:start w:val="1"/>
+      <w:numFmt w:val="bullet"/>
+      <w:lvlText w:val="o"/>
+      <w:lvlJc w:val="left"/>
+      <w:pPr>
+        <w:tabs>
+          <w:tab w:val="num" w:pos="1440"/>
+        </w:tabs>
+        <w:ind w:left="1440" w:hanging="360"/>
+      </w:pPr>
+      <w:rPr>
+        <w:rFonts w:ascii="Courier New" w:hAnsi="Courier New" w:hint="default"/>
+        <w:sz w:val="20"/>
+      </w:rPr>
+    </w:lvl>
+    <w:lvl w:ilvl="2" w:tentative="1">
+      <w:start w:val="1"/>
+      <w:numFmt w:val="bullet"/>
+      <w:lvlText w:val=""/>
+      <w:lvlJc w:val="left"/>
+      <w:pPr>
+        <w:tabs>
+          <w:tab w:val="num" w:pos="2160"/>
+        </w:tabs>
+        <w:ind w:left="2160" w:hanging="360"/>
+      </w:pPr>
+      <w:rPr>
+        <w:rFonts w:ascii="Wingdings" w:hAnsi="Wingdings" w:hint="default"/>
+        <w:sz w:val="20"/>
+      </w:rPr>
+    </w:lvl>
+    <w:lvl w:ilvl="3" w:tentative="1">
+      <w:start w:val="1"/>
+      <w:numFmt w:val="bullet"/>
+      <w:lvlText w:val=""/>
+      <w:lvlJc w:val="left"/>
+      <w:pPr>
+        <w:tabs>
+          <w:tab w:val="num" w:pos="2880"/>
+        </w:tabs>
+        <w:ind w:left="2880" w:hanging="360"/>
+      </w:pPr>
+      <w:rPr>
+        <w:rFonts w:ascii="Wingdings" w:hAnsi="Wingdings" w:hint="default"/>
+        <w:sz w:val="20"/>
+      </w:rPr>
+    </w:lvl>
+    <w:lvl w:ilvl="4" w:tentative="1">
+      <w:start w:val="1"/>
+      <w:numFmt w:val="bullet"/>
+      <w:lvlText w:val=""/>
+      <w:lvlJc w:val="left"/>
+      <w:pPr>
+        <w:tabs>
+          <w:tab w:val="num" w:pos="3600"/>
+        </w:tabs>
+        <w:ind w:left="3600" w:hanging="360"/>
+      </w:pPr>
+      <w:rPr>
+        <w:rFonts w:ascii="Wingdings" w:hAnsi="Wingdings" w:hint="default"/>
+        <w:sz w:val="20"/>
+      </w:rPr>
+    </w:lvl>
+    <w:lvl w:ilvl="5" w:tentative="1">
+      <w:start w:val="1"/>
+      <w:numFmt w:val="bullet"/>
+      <w:lvlText w:val=""/>
+      <w:lvlJc w:val="left"/>
+      <w:pPr>
+        <w:tabs>
+          <w:tab w:val="num" w:pos="4320"/>
+        </w:tabs>
+        <w:ind w:left="4320" w:hanging="360"/>
+      </w:pPr>
+      <w:rPr>
+        <w:rFonts w:ascii="Wingdings" w:hAnsi="Wingdings" w:hint="default"/>
+        <w:sz w:val="20"/>
+      </w:rPr>
+    </w:lvl>
+    <w:lvl w:ilvl="6" w:tentative="1">
+      <w:start w:val="1"/>
+      <w:numFmt w:val="bullet"/>
+      <w:lvlText w:val=""/>
+      <w:lvlJc w:val="left"/>
+      <w:pPr>
+        <w:tabs>
+          <w:tab w:val="num" w:pos="5040"/>
+        </w:tabs>
+        <w:ind w:left="5040" w:hanging="360"/>
+      </w:pPr>
+      <w:rPr>
+        <w:rFonts w:ascii="Wingdings" w:hAnsi="Wingdings" w:hint="default"/>
+        <w:sz w:val="20"/>
+      </w:rPr>
+    </w:lvl>
+    <w:lvl w:ilvl="7" w:tentative="1">
+      <w:start w:val="1"/>
+      <w:numFmt w:val="bullet"/>
+      <w:lvlText w:val=""/>
+      <w:lvlJc w:val="left"/>
+      <w:pPr>
+        <w:tabs>
+          <w:tab w:val="num" w:pos="5760"/>
+        </w:tabs>
+        <w:ind w:left="5760" w:hanging="360"/>
+      </w:pPr>
+      <w:rPr>
+        <w:rFonts w:ascii="Wingdings" w:hAnsi="Wingdings" w:hint="default"/>
+        <w:sz w:val="20"/>
+      </w:rPr>
+    </w:lvl>
+    <w:lvl w:ilvl="8" w:tentative="1">
+      <w:start w:val="1"/>
+      <w:numFmt w:val="bullet"/>
+      <w:lvlText w:val=""/>
+      <w:lvlJc w:val="left"/>
+      <w:pPr>
+        <w:tabs>
+          <w:tab w:val="num" w:pos="6480"/>
+        </w:tabs>
+        <w:ind w:left="6480" w:hanging="360"/>
+      </w:pPr>
+      <w:rPr>
+        <w:rFonts w:ascii="Wingdings" w:hAnsi="Wingdings" w:hint="default"/>
+        <w:sz w:val="20"/>
+      </w:rPr>
+    </w:lvl>
+  </w:abstractNum>
+  <w:abstractNum w:abstractNumId="9" w15:restartNumberingAfterBreak="0">
+    <w:nsid w:val="4BC933F8"/>
+    <w:multiLevelType w:val="multilevel"/>
+    <w:tmpl w:val="DD882376"/>
+    <w:lvl w:ilvl="0">
+      <w:start w:val="1"/>
+      <w:numFmt w:val="decimal"/>
+      <w:lvlText w:val="%1."/>
+      <w:lvlJc w:val="left"/>
+      <w:pPr>
+        <w:tabs>
+          <w:tab w:val="num" w:pos="720"/>
+        </w:tabs>
+        <w:ind w:left="720" w:hanging="360"/>
+      </w:pPr>
+    </w:lvl>
+    <w:lvl w:ilvl="1" w:tentative="1">
+      <w:start w:val="1"/>
+      <w:numFmt w:val="decimal"/>
+      <w:lvlText w:val="%2."/>
+      <w:lvlJc w:val="left"/>
+      <w:pPr>
+        <w:tabs>
+          <w:tab w:val="num" w:pos="1440"/>
+        </w:tabs>
+        <w:ind w:left="1440" w:hanging="360"/>
+      </w:pPr>
+    </w:lvl>
+    <w:lvl w:ilvl="2" w:tentative="1">
+      <w:start w:val="1"/>
+      <w:numFmt w:val="decimal"/>
+      <w:lvlText w:val="%3."/>
+      <w:lvlJc w:val="left"/>
+      <w:pPr>
+        <w:tabs>
+          <w:tab w:val="num" w:pos="2160"/>
+        </w:tabs>
+        <w:ind w:left="2160" w:hanging="360"/>
+      </w:pPr>
+    </w:lvl>
+    <w:lvl w:ilvl="3" w:tentative="1">
+      <w:start w:val="1"/>
+      <w:numFmt w:val="decimal"/>
+      <w:lvlText w:val="%4."/>
+      <w:lvlJc w:val="left"/>
+      <w:pPr>
+        <w:tabs>
+          <w:tab w:val="num" w:pos="2880"/>
+        </w:tabs>
+        <w:ind w:left="2880" w:hanging="360"/>
+      </w:pPr>
+    </w:lvl>
+    <w:lvl w:ilvl="4" w:tentative="1">
+      <w:start w:val="1"/>
+      <w:numFmt w:val="decimal"/>
+      <w:lvlText w:val="%5."/>
+      <w:lvlJc w:val="left"/>
+      <w:pPr>
+        <w:tabs>
+          <w:tab w:val="num" w:pos="3600"/>
+        </w:tabs>
+        <w:ind w:left="3600" w:hanging="360"/>
+      </w:pPr>
+    </w:lvl>
+    <w:lvl w:ilvl="5" w:tentative="1">
+      <w:start w:val="1"/>
+      <w:numFmt w:val="decimal"/>
+      <w:lvlText w:val="%6."/>
+      <w:lvlJc w:val="left"/>
+      <w:pPr>
+        <w:tabs>
+          <w:tab w:val="num" w:pos="4320"/>
+        </w:tabs>
+        <w:ind w:left="4320" w:hanging="360"/>
+      </w:pPr>
+    </w:lvl>
+    <w:lvl w:ilvl="6" w:tentative="1">
+      <w:start w:val="1"/>
+      <w:numFmt w:val="decimal"/>
+      <w:lvlText w:val="%7."/>
+      <w:lvlJc w:val="left"/>
+      <w:pPr>
+        <w:tabs>
+          <w:tab w:val="num" w:pos="5040"/>
+        </w:tabs>
+        <w:ind w:left="5040" w:hanging="360"/>
+      </w:pPr>
+    </w:lvl>
+    <w:lvl w:ilvl="7" w:tentative="1">
+      <w:start w:val="1"/>
+      <w:numFmt w:val="decimal"/>
+      <w:lvlText w:val="%8."/>
+      <w:lvlJc w:val="left"/>
+      <w:pPr>
+        <w:tabs>
+          <w:tab w:val="num" w:pos="5760"/>
+        </w:tabs>
+        <w:ind w:left="5760" w:hanging="360"/>
+      </w:pPr>
+    </w:lvl>
+    <w:lvl w:ilvl="8" w:tentative="1">
+      <w:start w:val="1"/>
+      <w:numFmt w:val="decimal"/>
+      <w:lvlText w:val="%9."/>
+      <w:lvlJc w:val="left"/>
+      <w:pPr>
+        <w:tabs>
+          <w:tab w:val="num" w:pos="6480"/>
+        </w:tabs>
+        <w:ind w:left="6480" w:hanging="360"/>
+      </w:pPr>
+    </w:lvl>
+  </w:abstractNum>
+  <w:abstractNum w:abstractNumId="10" w15:restartNumberingAfterBreak="0">
+    <w:nsid w:val="4CEA62D7"/>
+    <w:multiLevelType w:val="hybridMultilevel"/>
+    <w:tmpl w:val="2CC4A158"/>
+    <w:lvl w:ilvl="0" w:tplc="10090001">
+      <w:start w:val="1"/>
+      <w:numFmt w:val="bullet"/>
+      <w:lvlText w:val=""/>
+      <w:lvlJc w:val="left"/>
+      <w:pPr>
+        <w:ind w:left="720" w:hanging="360"/>
+      </w:pPr>
+      <w:rPr>
+        <w:rFonts w:ascii="Symbol" w:hAnsi="Symbol" w:hint="default"/>
+      </w:rPr>
+    </w:lvl>
+    <w:lvl w:ilvl="1" w:tplc="10090003" w:tentative="1">
+      <w:start w:val="1"/>
+      <w:numFmt w:val="bullet"/>
+      <w:lvlText w:val="o"/>
+      <w:lvlJc w:val="left"/>
+      <w:pPr>
+        <w:ind w:left="1440" w:hanging="360"/>
+      </w:pPr>
+      <w:rPr>
+        <w:rFonts w:ascii="Courier New" w:hAnsi="Courier New" w:cs="Courier New" w:hint="default"/>
+      </w:rPr>
+    </w:lvl>
+    <w:lvl w:ilvl="2" w:tplc="10090005" w:tentative="1">
+      <w:start w:val="1"/>
+      <w:numFmt w:val="bullet"/>
+      <w:lvlText w:val=""/>
+      <w:lvlJc w:val="left"/>
+      <w:pPr>
+        <w:ind w:left="2160" w:hanging="360"/>
+      </w:pPr>
+      <w:rPr>
+        <w:rFonts w:ascii="Wingdings" w:hAnsi="Wingdings" w:hint="default"/>
+      </w:rPr>
+    </w:lvl>
+    <w:lvl w:ilvl="3" w:tplc="10090001" w:tentative="1">
+      <w:start w:val="1"/>
+      <w:numFmt w:val="bullet"/>
+      <w:lvlText w:val=""/>
+      <w:lvlJc w:val="left"/>
+      <w:pPr>
+        <w:ind w:left="2880" w:hanging="360"/>
+      </w:pPr>
+      <w:rPr>
+        <w:rFonts w:ascii="Symbol" w:hAnsi="Symbol" w:hint="default"/>
+      </w:rPr>
+    </w:lvl>
+    <w:lvl w:ilvl="4" w:tplc="10090003" w:tentative="1">
+      <w:start w:val="1"/>
+      <w:numFmt w:val="bullet"/>
+      <w:lvlText w:val="o"/>
+      <w:lvlJc w:val="left"/>
+      <w:pPr>
+        <w:ind w:left="3600" w:hanging="360"/>
+      </w:pPr>
+      <w:rPr>
+        <w:rFonts w:ascii="Courier New" w:hAnsi="Courier New" w:cs="Courier New" w:hint="default"/>
+      </w:rPr>
+    </w:lvl>
+    <w:lvl w:ilvl="5" w:tplc="10090005" w:tentative="1">
+      <w:start w:val="1"/>
+      <w:numFmt w:val="bullet"/>
+      <w:lvlText w:val=""/>
+      <w:lvlJc w:val="left"/>
+      <w:pPr>
+        <w:ind w:left="4320" w:hanging="360"/>
+      </w:pPr>
+      <w:rPr>
+        <w:rFonts w:ascii="Wingdings" w:hAnsi="Wingdings" w:hint="default"/>
+      </w:rPr>
+    </w:lvl>
+    <w:lvl w:ilvl="6" w:tplc="10090001" w:tentative="1">
+      <w:start w:val="1"/>
+      <w:numFmt w:val="bullet"/>
+      <w:lvlText w:val=""/>
+      <w:lvlJc w:val="left"/>
+      <w:pPr>
+        <w:ind w:left="5040" w:hanging="360"/>
+      </w:pPr>
+      <w:rPr>
+        <w:rFonts w:ascii="Symbol" w:hAnsi="Symbol" w:hint="default"/>
+      </w:rPr>
+    </w:lvl>
+    <w:lvl w:ilvl="7" w:tplc="10090003" w:tentative="1">
+      <w:start w:val="1"/>
+      <w:numFmt w:val="bullet"/>
+      <w:lvlText w:val="o"/>
+      <w:lvlJc w:val="left"/>
+      <w:pPr>
+        <w:ind w:left="5760" w:hanging="360"/>
+      </w:pPr>
+      <w:rPr>
+        <w:rFonts w:ascii="Courier New" w:hAnsi="Courier New" w:cs="Courier New" w:hint="default"/>
+      </w:rPr>
+    </w:lvl>
+    <w:lvl w:ilvl="8" w:tplc="10090005" w:tentative="1">
+      <w:start w:val="1"/>
+      <w:numFmt w:val="bullet"/>
+      <w:lvlText w:val=""/>
+      <w:lvlJc w:val="left"/>
+      <w:pPr>
+        <w:ind w:left="6480" w:hanging="360"/>
+      </w:pPr>
+      <w:rPr>
+        <w:rFonts w:ascii="Wingdings" w:hAnsi="Wingdings" w:hint="default"/>
+      </w:rPr>
+    </w:lvl>
+  </w:abstractNum>
+  <w:abstractNum w:abstractNumId="11" w15:restartNumberingAfterBreak="0">
     <w:nsid w:val="4D9224B6"/>
     <w:multiLevelType w:val="multilevel"/>
     <w:tmpl w:val="248A072A"/>
@@ -4240,14 +6680,157 @@
       </w:rPr>
     </w:lvl>
   </w:abstractNum>
+  <w:abstractNum w:abstractNumId="12" w15:restartNumberingAfterBreak="0">
+    <w:nsid w:val="68D174B0"/>
+    <w:multiLevelType w:val="hybridMultilevel"/>
+    <w:tmpl w:val="BC3E2F7E"/>
+    <w:lvl w:ilvl="0" w:tplc="10090001">
+      <w:start w:val="1"/>
+      <w:numFmt w:val="bullet"/>
+      <w:lvlText w:val=""/>
+      <w:lvlJc w:val="left"/>
+      <w:pPr>
+        <w:ind w:left="720" w:hanging="360"/>
+      </w:pPr>
+      <w:rPr>
+        <w:rFonts w:ascii="Symbol" w:hAnsi="Symbol" w:hint="default"/>
+      </w:rPr>
+    </w:lvl>
+    <w:lvl w:ilvl="1" w:tplc="10090003" w:tentative="1">
+      <w:start w:val="1"/>
+      <w:numFmt w:val="bullet"/>
+      <w:lvlText w:val="o"/>
+      <w:lvlJc w:val="left"/>
+      <w:pPr>
+        <w:ind w:left="1440" w:hanging="360"/>
+      </w:pPr>
+      <w:rPr>
+        <w:rFonts w:ascii="Courier New" w:hAnsi="Courier New" w:cs="Courier New" w:hint="default"/>
+      </w:rPr>
+    </w:lvl>
+    <w:lvl w:ilvl="2" w:tplc="10090005" w:tentative="1">
+      <w:start w:val="1"/>
+      <w:numFmt w:val="bullet"/>
+      <w:lvlText w:val=""/>
+      <w:lvlJc w:val="left"/>
+      <w:pPr>
+        <w:ind w:left="2160" w:hanging="360"/>
+      </w:pPr>
+      <w:rPr>
+        <w:rFonts w:ascii="Wingdings" w:hAnsi="Wingdings" w:hint="default"/>
+      </w:rPr>
+    </w:lvl>
+    <w:lvl w:ilvl="3" w:tplc="10090001" w:tentative="1">
+      <w:start w:val="1"/>
+      <w:numFmt w:val="bullet"/>
+      <w:lvlText w:val=""/>
+      <w:lvlJc w:val="left"/>
+      <w:pPr>
+        <w:ind w:left="2880" w:hanging="360"/>
+      </w:pPr>
+      <w:rPr>
+        <w:rFonts w:ascii="Symbol" w:hAnsi="Symbol" w:hint="default"/>
+      </w:rPr>
+    </w:lvl>
+    <w:lvl w:ilvl="4" w:tplc="10090003" w:tentative="1">
+      <w:start w:val="1"/>
+      <w:numFmt w:val="bullet"/>
+      <w:lvlText w:val="o"/>
+      <w:lvlJc w:val="left"/>
+      <w:pPr>
+        <w:ind w:left="3600" w:hanging="360"/>
+      </w:pPr>
+      <w:rPr>
+        <w:rFonts w:ascii="Courier New" w:hAnsi="Courier New" w:cs="Courier New" w:hint="default"/>
+      </w:rPr>
+    </w:lvl>
+    <w:lvl w:ilvl="5" w:tplc="10090005" w:tentative="1">
+      <w:start w:val="1"/>
+      <w:numFmt w:val="bullet"/>
+      <w:lvlText w:val=""/>
+      <w:lvlJc w:val="left"/>
+      <w:pPr>
+        <w:ind w:left="4320" w:hanging="360"/>
+      </w:pPr>
+      <w:rPr>
+        <w:rFonts w:ascii="Wingdings" w:hAnsi="Wingdings" w:hint="default"/>
+      </w:rPr>
+    </w:lvl>
+    <w:lvl w:ilvl="6" w:tplc="10090001" w:tentative="1">
+      <w:start w:val="1"/>
+      <w:numFmt w:val="bullet"/>
+      <w:lvlText w:val=""/>
+      <w:lvlJc w:val="left"/>
+      <w:pPr>
+        <w:ind w:left="5040" w:hanging="360"/>
+      </w:pPr>
+      <w:rPr>
+        <w:rFonts w:ascii="Symbol" w:hAnsi="Symbol" w:hint="default"/>
+      </w:rPr>
+    </w:lvl>
+    <w:lvl w:ilvl="7" w:tplc="10090003" w:tentative="1">
+      <w:start w:val="1"/>
+      <w:numFmt w:val="bullet"/>
+      <w:lvlText w:val="o"/>
+      <w:lvlJc w:val="left"/>
+      <w:pPr>
+        <w:ind w:left="5760" w:hanging="360"/>
+      </w:pPr>
+      <w:rPr>
+        <w:rFonts w:ascii="Courier New" w:hAnsi="Courier New" w:cs="Courier New" w:hint="default"/>
+      </w:rPr>
+    </w:lvl>
+    <w:lvl w:ilvl="8" w:tplc="10090005" w:tentative="1">
+      <w:start w:val="1"/>
+      <w:numFmt w:val="bullet"/>
+      <w:lvlText w:val=""/>
+      <w:lvlJc w:val="left"/>
+      <w:pPr>
+        <w:ind w:left="6480" w:hanging="360"/>
+      </w:pPr>
+      <w:rPr>
+        <w:rFonts w:ascii="Wingdings" w:hAnsi="Wingdings" w:hint="default"/>
+      </w:rPr>
+    </w:lvl>
+  </w:abstractNum>
   <w:num w:numId="1" w16cid:durableId="577835693">
+    <w:abstractNumId w:val="11"/>
+  </w:num>
+  <w:num w:numId="2" w16cid:durableId="92172213">
+    <w:abstractNumId w:val="6"/>
+  </w:num>
+  <w:num w:numId="3" w16cid:durableId="149059239">
+    <w:abstractNumId w:val="4"/>
+  </w:num>
+  <w:num w:numId="4" w16cid:durableId="483281761">
+    <w:abstractNumId w:val="1"/>
+  </w:num>
+  <w:num w:numId="5" w16cid:durableId="124351998">
+    <w:abstractNumId w:val="5"/>
+  </w:num>
+  <w:num w:numId="6" w16cid:durableId="2022774201">
+    <w:abstractNumId w:val="9"/>
+  </w:num>
+  <w:num w:numId="7" w16cid:durableId="36200999">
+    <w:abstractNumId w:val="8"/>
+  </w:num>
+  <w:num w:numId="8" w16cid:durableId="65930082">
+    <w:abstractNumId w:val="12"/>
+  </w:num>
+  <w:num w:numId="9" w16cid:durableId="783354395">
+    <w:abstractNumId w:val="10"/>
+  </w:num>
+  <w:num w:numId="10" w16cid:durableId="681010726">
+    <w:abstractNumId w:val="7"/>
+  </w:num>
+  <w:num w:numId="11" w16cid:durableId="1080642543">
     <w:abstractNumId w:val="2"/>
   </w:num>
-  <w:num w:numId="2" w16cid:durableId="92172213">
-    <w:abstractNumId w:val="1"/>
+  <w:num w:numId="12" w16cid:durableId="2067685165">
+    <w:abstractNumId w:val="0"/>
   </w:num>
-  <w:num w:numId="3" w16cid:durableId="149059239">
-    <w:abstractNumId w:val="0"/>
+  <w:num w:numId="13" w16cid:durableId="1047265547">
+    <w:abstractNumId w:val="3"/>
   </w:num>
 </w:numbering>
 </file>
@@ -4855,7 +7438,6 @@
   <w:style w:type="character" w:default="1" w:styleId="DefaultParagraphFont">
     <w:name w:val="Default Paragraph Font"/>
     <w:uiPriority w:val="1"/>
-    <w:semiHidden/>
     <w:unhideWhenUsed/>
   </w:style>
   <w:style w:type="table" w:default="1" w:styleId="TableNormal">
@@ -5215,6 +7797,29 @@
       </w:tblBorders>
     </w:tblPr>
   </w:style>
+  <w:style w:type="character" w:styleId="Hyperlink">
+    <w:name w:val="Hyperlink"/>
+    <w:basedOn w:val="DefaultParagraphFont"/>
+    <w:uiPriority w:val="99"/>
+    <w:unhideWhenUsed/>
+    <w:rsid w:val="00B33DBF"/>
+    <w:rPr>
+      <w:color w:val="467886" w:themeColor="hyperlink"/>
+      <w:u w:val="single"/>
+    </w:rPr>
+  </w:style>
+  <w:style w:type="character" w:styleId="UnresolvedMention">
+    <w:name w:val="Unresolved Mention"/>
+    <w:basedOn w:val="DefaultParagraphFont"/>
+    <w:uiPriority w:val="99"/>
+    <w:semiHidden/>
+    <w:unhideWhenUsed/>
+    <w:rsid w:val="00196DF1"/>
+    <w:rPr>
+      <w:color w:val="605E5C"/>
+      <w:shd w:val="clear" w:color="auto" w:fill="E1DFDD"/>
+    </w:rPr>
+  </w:style>
 </w:styles>
 </file>
 

</xml_diff>

<commit_message>
Traditional portfolio allocation versus Reinforcement Learning-based methods
</commit_message>
<xml_diff>
--- a/doc/PROJECT REPORT - PROJECT PROPOSAL.docx
+++ b/doc/PROJECT REPORT - PROJECT PROPOSAL.docx
@@ -576,35 +576,7 @@
           <w:lang w:val="en-US"/>
           <w14:ligatures w14:val="none"/>
         </w:rPr>
-        <w:t xml:space="preserve">     1.1 Research the finance </w:t>
-      </w:r>
-      <w:proofErr w:type="gramStart"/>
-      <w:r>
-        <w:rPr>
-          <w:rFonts w:ascii="Times New Roman" w:eastAsia="Times New Roman" w:hAnsi="Times New Roman" w:cs="Times New Roman"/>
-          <w:b/>
-          <w:color w:val="000000"/>
-          <w:kern w:val="0"/>
-          <w:sz w:val="32"/>
-          <w:szCs w:val="32"/>
-          <w:lang w:val="en-US"/>
-          <w14:ligatures w14:val="none"/>
-        </w:rPr>
-        <w:t>domain @</w:t>
-      </w:r>
-      <w:proofErr w:type="gramEnd"/>
-      <w:r>
-        <w:rPr>
-          <w:rFonts w:ascii="Times New Roman" w:eastAsia="Times New Roman" w:hAnsi="Times New Roman" w:cs="Times New Roman"/>
-          <w:b/>
-          <w:color w:val="000000"/>
-          <w:kern w:val="0"/>
-          <w:sz w:val="32"/>
-          <w:szCs w:val="32"/>
-          <w:lang w:val="en-US"/>
-          <w14:ligatures w14:val="none"/>
-        </w:rPr>
-        <w:t xml:space="preserve"> Nikhil Preetha Murali</w:t>
+        <w:t xml:space="preserve">     1.1 Research the finance domain @ Nikhil Preetha Murali</w:t>
       </w:r>
     </w:p>
     <w:p>
@@ -1377,27 +1349,7 @@
                 <w:lang w:eastAsia="en-CA"/>
                 <w14:ligatures w14:val="none"/>
               </w:rPr>
-              <w:t>Black-</w:t>
-            </w:r>
-            <w:proofErr w:type="spellStart"/>
-            <w:r>
-              <w:rPr>
-                <w:rFonts w:ascii="Times New Roman" w:eastAsia="Times New Roman" w:hAnsi="Times New Roman" w:cs="Times New Roman"/>
-                <w:kern w:val="0"/>
-                <w:lang w:eastAsia="en-CA"/>
-                <w14:ligatures w14:val="none"/>
-              </w:rPr>
-              <w:t>Litterman</w:t>
-            </w:r>
-            <w:proofErr w:type="spellEnd"/>
-            <w:r>
-              <w:rPr>
-                <w:rFonts w:ascii="Times New Roman" w:eastAsia="Times New Roman" w:hAnsi="Times New Roman" w:cs="Times New Roman"/>
-                <w:kern w:val="0"/>
-                <w:lang w:eastAsia="en-CA"/>
-                <w14:ligatures w14:val="none"/>
-              </w:rPr>
-              <w:t xml:space="preserve"> Model</w:t>
+              <w:t>Black-Litterman Model</w:t>
             </w:r>
           </w:p>
         </w:tc>
@@ -1631,15 +1583,7 @@
         <w:jc w:val="both"/>
       </w:pPr>
       <w:r>
-        <w:t xml:space="preserve">Risk management in finance refers to the process of identifying, assessing, and controlling potential risks that could negatively impact financial outcomes. It involves understanding the various uncertainties associated with investments, markets, or business operations and implementing strategies to minimize or mitigate those risks. This can include techniques like diversification, hedging, and insurance to protect assets and ensure financial stability. The importance of risk management lies in its ability to safeguard against significant losses, balance risk with potential rewards, and enhance decision-making. By proactively addressing risks, businesses and investors can maintain stability, meet long-term financial goals, comply with regulations, and protect their reputation, all of which contribute to sustained success in an </w:t>
-      </w:r>
-      <w:proofErr w:type="gramStart"/>
-      <w:r>
-        <w:t>often volatile</w:t>
-      </w:r>
-      <w:proofErr w:type="gramEnd"/>
-      <w:r>
-        <w:t xml:space="preserve"> financial environment.</w:t>
+        <w:t>Risk management in finance refers to the process of identifying, assessing, and controlling potential risks that could negatively impact financial outcomes. It involves understanding the various uncertainties associated with investments, markets, or business operations and implementing strategies to minimize or mitigate those risks. This can include techniques like diversification, hedging, and insurance to protect assets and ensure financial stability. The importance of risk management lies in its ability to safeguard against significant losses, balance risk with potential rewards, and enhance decision-making. By proactively addressing risks, businesses and investors can maintain stability, meet long-term financial goals, comply with regulations, and protect their reputation, all of which contribute to sustained success in an often volatile financial environment.</w:t>
       </w:r>
     </w:p>
     <w:p>
@@ -2187,15 +2131,7 @@
         <w:t>Risk-Reward Balancing:</w:t>
       </w:r>
       <w:r>
-        <w:t xml:space="preserve"> RL models use custom reward functions to prioritize risk-adjusted returns, considering metrics like Value-at-Risk (</w:t>
-      </w:r>
-      <w:proofErr w:type="spellStart"/>
-      <w:r>
-        <w:t>VaR</w:t>
-      </w:r>
-      <w:proofErr w:type="spellEnd"/>
-      <w:r>
-        <w:t>) and Conditional Value-at-Risk (CVaR).</w:t>
+        <w:t xml:space="preserve"> RL models use custom reward functions to prioritize risk-adjusted returns, considering metrics like Value-at-Risk (VaR) and Conditional Value-at-Risk (CVaR).</w:t>
       </w:r>
     </w:p>
     <w:p>
@@ -3071,7 +3007,7 @@
         <w:ind w:right="60"/>
         <w:rPr>
           <w:rFonts w:ascii="Times New Roman" w:eastAsia="Times New Roman" w:hAnsi="Times New Roman" w:cs="Times New Roman"/>
-          <w:b/>
+          <w:bCs/>
           <w:color w:val="000000"/>
           <w:kern w:val="0"/>
           <w:sz w:val="32"/>
@@ -3093,62 +3029,6 @@
         </w:rPr>
         <w:t xml:space="preserve">      </w:t>
       </w:r>
-      <w:r>
-        <w:rPr>
-          <w:rFonts w:ascii="Times New Roman" w:eastAsia="Times New Roman" w:hAnsi="Times New Roman" w:cs="Times New Roman"/>
-          <w:b/>
-          <w:color w:val="000000"/>
-          <w:kern w:val="0"/>
-          <w:sz w:val="32"/>
-          <w:szCs w:val="32"/>
-          <w:lang w:val="en-US"/>
-          <w14:ligatures w14:val="none"/>
-        </w:rPr>
-        <w:t xml:space="preserve">1.2 Create visual </w:t>
-      </w:r>
-      <w:proofErr w:type="gramStart"/>
-      <w:r>
-        <w:rPr>
-          <w:rFonts w:ascii="Times New Roman" w:eastAsia="Times New Roman" w:hAnsi="Times New Roman" w:cs="Times New Roman"/>
-          <w:b/>
-          <w:color w:val="000000"/>
-          <w:kern w:val="0"/>
-          <w:sz w:val="32"/>
-          <w:szCs w:val="32"/>
-          <w:lang w:val="en-US"/>
-          <w14:ligatures w14:val="none"/>
-        </w:rPr>
-        <w:t>aids @</w:t>
-      </w:r>
-      <w:proofErr w:type="gramEnd"/>
-      <w:r>
-        <w:rPr>
-          <w:rFonts w:ascii="Times New Roman" w:eastAsia="Times New Roman" w:hAnsi="Times New Roman" w:cs="Times New Roman"/>
-          <w:b/>
-          <w:color w:val="000000"/>
-          <w:kern w:val="0"/>
-          <w:sz w:val="32"/>
-          <w:szCs w:val="32"/>
-          <w:lang w:val="en-US"/>
-          <w14:ligatures w14:val="none"/>
-        </w:rPr>
-        <w:t xml:space="preserve"> Abhishek </w:t>
-      </w:r>
-      <w:proofErr w:type="spellStart"/>
-      <w:r>
-        <w:rPr>
-          <w:rFonts w:ascii="Times New Roman" w:eastAsia="Times New Roman" w:hAnsi="Times New Roman" w:cs="Times New Roman"/>
-          <w:b/>
-          <w:color w:val="000000"/>
-          <w:kern w:val="0"/>
-          <w:sz w:val="32"/>
-          <w:szCs w:val="32"/>
-          <w:lang w:val="en-US"/>
-          <w14:ligatures w14:val="none"/>
-        </w:rPr>
-        <w:t>Mungath</w:t>
-      </w:r>
-      <w:proofErr w:type="spellEnd"/>
     </w:p>
     <w:p>
       <w:pPr>
@@ -3156,28 +3036,15 @@
         <w:ind w:right="60"/>
         <w:rPr>
           <w:rFonts w:ascii="Times New Roman" w:eastAsia="Times New Roman" w:hAnsi="Times New Roman" w:cs="Times New Roman"/>
-          <w:b/>
-          <w:color w:val="000000"/>
-          <w:kern w:val="0"/>
-          <w:sz w:val="32"/>
-          <w:szCs w:val="32"/>
-          <w:lang w:val="en-US"/>
-          <w14:ligatures w14:val="none"/>
-        </w:rPr>
-      </w:pPr>
-      <w:r>
-        <w:rPr>
-          <w:rFonts w:ascii="Times New Roman" w:eastAsia="Times New Roman" w:hAnsi="Times New Roman" w:cs="Times New Roman"/>
-          <w:b/>
-          <w:color w:val="000000"/>
-          <w:kern w:val="0"/>
-          <w:sz w:val="32"/>
-          <w:szCs w:val="32"/>
-          <w:lang w:val="en-US"/>
-          <w14:ligatures w14:val="none"/>
-        </w:rPr>
-        <w:t xml:space="preserve">      1.2.1 Traditional portfolio allocation versus reinforcement learning-based methods</w:t>
-      </w:r>
+          <w:bCs/>
+          <w:color w:val="000000"/>
+          <w:kern w:val="0"/>
+          <w:sz w:val="32"/>
+          <w:szCs w:val="32"/>
+          <w:lang w:val="en-US"/>
+          <w14:ligatures w14:val="none"/>
+        </w:rPr>
+      </w:pPr>
     </w:p>
     <w:p>
       <w:pPr>
@@ -3194,44 +3061,35 @@
           <w14:ligatures w14:val="none"/>
         </w:rPr>
       </w:pPr>
-      <w:r>
-        <w:rPr>
-          <w:rFonts w:ascii="Times New Roman" w:eastAsia="Times New Roman" w:hAnsi="Times New Roman" w:cs="Times New Roman"/>
-          <w:bCs/>
-          <w:color w:val="000000"/>
-          <w:kern w:val="0"/>
-          <w:sz w:val="32"/>
-          <w:szCs w:val="32"/>
-          <w:lang w:val="en-US"/>
-          <w14:ligatures w14:val="none"/>
-        </w:rPr>
-        <w:t>Answer here: -</w:t>
-      </w:r>
-      <w:r>
-        <w:rPr>
-          <w:rFonts w:ascii="Times New Roman" w:eastAsia="Times New Roman" w:hAnsi="Times New Roman" w:cs="Times New Roman"/>
-          <w:bCs/>
-          <w:color w:val="000000"/>
-          <w:kern w:val="0"/>
-          <w:sz w:val="32"/>
-          <w:szCs w:val="32"/>
-          <w:lang w:val="en-US"/>
-          <w14:ligatures w14:val="none"/>
-        </w:rPr>
-        <w:sym w:font="Wingdings" w:char="F0E0"/>
-      </w:r>
-      <w:r>
-        <w:rPr>
-          <w:rFonts w:ascii="Times New Roman" w:eastAsia="Times New Roman" w:hAnsi="Times New Roman" w:cs="Times New Roman"/>
-          <w:bCs/>
-          <w:color w:val="000000"/>
-          <w:kern w:val="0"/>
-          <w:sz w:val="32"/>
-          <w:szCs w:val="32"/>
-          <w:lang w:val="en-US"/>
-          <w14:ligatures w14:val="none"/>
-        </w:rPr>
-        <w:t xml:space="preserve"> flowchart</w:t>
+    </w:p>
+    <w:p>
+      <w:pPr>
+        <w:spacing w:after="162" w:line="360" w:lineRule="auto"/>
+        <w:ind w:right="60" w:firstLine="360"/>
+        <w:rPr>
+          <w:rFonts w:ascii="Times New Roman" w:eastAsia="Times New Roman" w:hAnsi="Times New Roman" w:cs="Times New Roman"/>
+          <w:b/>
+          <w:color w:val="000000"/>
+          <w:kern w:val="0"/>
+          <w:sz w:val="32"/>
+          <w:szCs w:val="32"/>
+          <w:lang w:val="en-US"/>
+          <w14:ligatures w14:val="none"/>
+        </w:rPr>
+      </w:pPr>
+      <w:r>
+        <w:rPr>
+          <w:rFonts w:ascii="Times New Roman" w:eastAsia="Times New Roman" w:hAnsi="Times New Roman" w:cs="Times New Roman"/>
+          <w:b/>
+          <w:color w:val="000000"/>
+          <w:kern w:val="0"/>
+          <w:sz w:val="32"/>
+          <w:szCs w:val="32"/>
+          <w:lang w:val="en-US"/>
+          <w14:ligatures w14:val="none"/>
+        </w:rPr>
+        <w:lastRenderedPageBreak/>
+        <w:t>1.2 Create visual aids @ Abhishek Mungath</w:t>
       </w:r>
     </w:p>
     <w:p>
@@ -3260,8 +3118,33 @@
           <w:lang w:val="en-US"/>
           <w14:ligatures w14:val="none"/>
         </w:rPr>
-        <w:lastRenderedPageBreak/>
-        <w:t xml:space="preserve">      1.2.2 The role of risk management in investment strategies.</w:t>
+        <w:t xml:space="preserve">    </w:t>
+      </w:r>
+      <w:r>
+        <w:rPr>
+          <w:rFonts w:ascii="Times New Roman" w:eastAsia="Times New Roman" w:hAnsi="Times New Roman" w:cs="Times New Roman"/>
+          <w:b/>
+          <w:color w:val="000000"/>
+          <w:kern w:val="0"/>
+          <w:sz w:val="32"/>
+          <w:szCs w:val="32"/>
+          <w:lang w:val="en-US"/>
+          <w14:ligatures w14:val="none"/>
+        </w:rPr>
+        <w:t xml:space="preserve"> </w:t>
+      </w:r>
+      <w:r>
+        <w:rPr>
+          <w:rFonts w:ascii="Times New Roman" w:eastAsia="Times New Roman" w:hAnsi="Times New Roman" w:cs="Times New Roman"/>
+          <w:b/>
+          <w:color w:val="000000"/>
+          <w:kern w:val="0"/>
+          <w:sz w:val="32"/>
+          <w:szCs w:val="32"/>
+          <w:lang w:val="en-US"/>
+          <w14:ligatures w14:val="none"/>
+        </w:rPr>
+        <w:t>1.2.1 Traditional portfolio allocation versus reinforcement learning-based methods</w:t>
       </w:r>
     </w:p>
     <w:p>
@@ -3270,53 +3153,67 @@
         <w:ind w:right="60"/>
         <w:rPr>
           <w:rFonts w:ascii="Times New Roman" w:eastAsia="Times New Roman" w:hAnsi="Times New Roman" w:cs="Times New Roman"/>
-          <w:bCs/>
-          <w:color w:val="000000"/>
-          <w:kern w:val="0"/>
-          <w:sz w:val="32"/>
-          <w:szCs w:val="32"/>
-          <w:lang w:val="en-US"/>
-          <w14:ligatures w14:val="none"/>
-        </w:rPr>
-      </w:pPr>
-      <w:r>
-        <w:rPr>
-          <w:rFonts w:ascii="Times New Roman" w:eastAsia="Times New Roman" w:hAnsi="Times New Roman" w:cs="Times New Roman"/>
-          <w:bCs/>
-          <w:color w:val="000000"/>
-          <w:kern w:val="0"/>
-          <w:sz w:val="32"/>
-          <w:szCs w:val="32"/>
-          <w:lang w:val="en-US"/>
-          <w14:ligatures w14:val="none"/>
-        </w:rPr>
-        <w:t>Answer here:</w:t>
-      </w:r>
-      <w:r>
-        <w:rPr>
-          <w:rFonts w:ascii="Times New Roman" w:eastAsia="Times New Roman" w:hAnsi="Times New Roman" w:cs="Times New Roman"/>
-          <w:bCs/>
-          <w:color w:val="000000"/>
-          <w:kern w:val="0"/>
-          <w:sz w:val="32"/>
-          <w:szCs w:val="32"/>
-          <w:lang w:val="en-US"/>
-          <w14:ligatures w14:val="none"/>
-        </w:rPr>
-        <w:sym w:font="Wingdings" w:char="F0E0"/>
-      </w:r>
-      <w:r>
-        <w:rPr>
-          <w:rFonts w:ascii="Times New Roman" w:eastAsia="Times New Roman" w:hAnsi="Times New Roman" w:cs="Times New Roman"/>
-          <w:bCs/>
-          <w:color w:val="000000"/>
-          <w:kern w:val="0"/>
-          <w:sz w:val="32"/>
-          <w:szCs w:val="32"/>
-          <w:lang w:val="en-US"/>
-          <w14:ligatures w14:val="none"/>
-        </w:rPr>
-        <w:t xml:space="preserve"> flowchart</w:t>
+          <w:b/>
+          <w:color w:val="000000"/>
+          <w:kern w:val="0"/>
+          <w:sz w:val="32"/>
+          <w:szCs w:val="32"/>
+          <w:lang w:val="en-US"/>
+          <w14:ligatures w14:val="none"/>
+        </w:rPr>
+      </w:pPr>
+      <w:r>
+        <w:rPr>
+          <w:noProof/>
+        </w:rPr>
+        <w:drawing>
+          <wp:inline distT="0" distB="0" distL="0" distR="0" wp14:anchorId="7C86A189" wp14:editId="654FFC63">
+            <wp:extent cx="5943600" cy="4457700"/>
+            <wp:effectExtent l="0" t="0" r="0" b="0"/>
+            <wp:docPr id="534297611" name="Picture 2" descr="A diagram of a method&#10;&#10;Description automatically generated"/>
+            <wp:cNvGraphicFramePr>
+              <a:graphicFrameLocks xmlns:a="http://schemas.openxmlformats.org/drawingml/2006/main" noChangeAspect="1"/>
+            </wp:cNvGraphicFramePr>
+            <a:graphic xmlns:a="http://schemas.openxmlformats.org/drawingml/2006/main">
+              <a:graphicData uri="http://schemas.openxmlformats.org/drawingml/2006/picture">
+                <pic:pic xmlns:pic="http://schemas.openxmlformats.org/drawingml/2006/picture">
+                  <pic:nvPicPr>
+                    <pic:cNvPr id="534297611" name="Picture 2" descr="A diagram of a method&#10;&#10;Description automatically generated"/>
+                    <pic:cNvPicPr>
+                      <a:picLocks noChangeAspect="1" noChangeArrowheads="1"/>
+                    </pic:cNvPicPr>
+                  </pic:nvPicPr>
+                  <pic:blipFill>
+                    <a:blip r:embed="rId6">
+                      <a:extLst>
+                        <a:ext uri="{28A0092B-C50C-407E-A947-70E740481C1C}">
+                          <a14:useLocalDpi xmlns:a14="http://schemas.microsoft.com/office/drawing/2010/main" val="0"/>
+                        </a:ext>
+                      </a:extLst>
+                    </a:blip>
+                    <a:srcRect/>
+                    <a:stretch>
+                      <a:fillRect/>
+                    </a:stretch>
+                  </pic:blipFill>
+                  <pic:spPr bwMode="auto">
+                    <a:xfrm>
+                      <a:off x="0" y="0"/>
+                      <a:ext cx="5943600" cy="4457700"/>
+                    </a:xfrm>
+                    <a:prstGeom prst="rect">
+                      <a:avLst/>
+                    </a:prstGeom>
+                    <a:noFill/>
+                    <a:ln>
+                      <a:noFill/>
+                    </a:ln>
+                  </pic:spPr>
+                </pic:pic>
+              </a:graphicData>
+            </a:graphic>
+          </wp:inline>
+        </w:drawing>
       </w:r>
     </w:p>
     <w:p>
@@ -3334,6 +3231,19 @@
           <w14:ligatures w14:val="none"/>
         </w:rPr>
       </w:pPr>
+      <w:r>
+        <w:rPr>
+          <w:rFonts w:ascii="Times New Roman" w:eastAsia="Times New Roman" w:hAnsi="Times New Roman" w:cs="Times New Roman"/>
+          <w:b/>
+          <w:color w:val="000000"/>
+          <w:kern w:val="0"/>
+          <w:sz w:val="32"/>
+          <w:szCs w:val="32"/>
+          <w:lang w:val="en-US"/>
+          <w14:ligatures w14:val="none"/>
+        </w:rPr>
+        <w:t xml:space="preserve">      1.2.2 The role of risk management in investment strategies.</w:t>
+      </w:r>
     </w:p>
     <w:p>
       <w:pPr>
@@ -3341,15 +3251,54 @@
         <w:ind w:right="60"/>
         <w:rPr>
           <w:rFonts w:ascii="Times New Roman" w:eastAsia="Times New Roman" w:hAnsi="Times New Roman" w:cs="Times New Roman"/>
-          <w:b/>
-          <w:color w:val="000000"/>
-          <w:kern w:val="0"/>
-          <w:sz w:val="32"/>
-          <w:szCs w:val="32"/>
-          <w:lang w:val="en-US"/>
-          <w14:ligatures w14:val="none"/>
-        </w:rPr>
-      </w:pPr>
+          <w:bCs/>
+          <w:color w:val="000000"/>
+          <w:kern w:val="0"/>
+          <w:sz w:val="32"/>
+          <w:szCs w:val="32"/>
+          <w:lang w:val="en-US"/>
+          <w14:ligatures w14:val="none"/>
+        </w:rPr>
+      </w:pPr>
+      <w:r>
+        <w:rPr>
+          <w:rFonts w:ascii="Times New Roman" w:eastAsia="Times New Roman" w:hAnsi="Times New Roman" w:cs="Times New Roman"/>
+          <w:bCs/>
+          <w:color w:val="000000"/>
+          <w:kern w:val="0"/>
+          <w:sz w:val="32"/>
+          <w:szCs w:val="32"/>
+          <w:lang w:val="en-US"/>
+          <w14:ligatures w14:val="none"/>
+        </w:rPr>
+        <w:t>Answer here:</w:t>
+      </w:r>
+      <w:r>
+        <w:rPr>
+          <w:rFonts w:ascii="Times New Roman" w:eastAsia="Times New Roman" w:hAnsi="Times New Roman" w:cs="Times New Roman"/>
+          <w:bCs/>
+          <w:color w:val="000000"/>
+          <w:kern w:val="0"/>
+          <w:sz w:val="32"/>
+          <w:szCs w:val="32"/>
+          <w:lang w:val="en-US"/>
+          <w14:ligatures w14:val="none"/>
+        </w:rPr>
+        <w:sym w:font="Wingdings" w:char="F0E0"/>
+      </w:r>
+      <w:r>
+        <w:rPr>
+          <w:rFonts w:ascii="Times New Roman" w:eastAsia="Times New Roman" w:hAnsi="Times New Roman" w:cs="Times New Roman"/>
+          <w:bCs/>
+          <w:color w:val="000000"/>
+          <w:kern w:val="0"/>
+          <w:sz w:val="32"/>
+          <w:szCs w:val="32"/>
+          <w:lang w:val="en-US"/>
+          <w14:ligatures w14:val="none"/>
+        </w:rPr>
+        <w:t xml:space="preserve"> flowchart</w:t>
+      </w:r>
     </w:p>
     <w:p>
       <w:pPr>
@@ -3366,47 +3315,6 @@
           <w14:ligatures w14:val="none"/>
         </w:rPr>
       </w:pPr>
-      <w:r>
-        <w:rPr>
-          <w:rFonts w:ascii="Times New Roman" w:eastAsia="Times New Roman" w:hAnsi="Times New Roman" w:cs="Times New Roman"/>
-          <w:b/>
-          <w:color w:val="000000"/>
-          <w:kern w:val="0"/>
-          <w:sz w:val="32"/>
-          <w:szCs w:val="32"/>
-          <w:lang w:val="en-US"/>
-          <w14:ligatures w14:val="none"/>
-        </w:rPr>
-        <w:t xml:space="preserve">2. Defining the </w:t>
-      </w:r>
-      <w:proofErr w:type="gramStart"/>
-      <w:r>
-        <w:rPr>
-          <w:rFonts w:ascii="Times New Roman" w:eastAsia="Times New Roman" w:hAnsi="Times New Roman" w:cs="Times New Roman"/>
-          <w:b/>
-          <w:color w:val="000000"/>
-          <w:kern w:val="0"/>
-          <w:sz w:val="32"/>
-          <w:szCs w:val="32"/>
-          <w:lang w:val="en-US"/>
-          <w14:ligatures w14:val="none"/>
-        </w:rPr>
-        <w:t>Problem @</w:t>
-      </w:r>
-      <w:proofErr w:type="gramEnd"/>
-      <w:r>
-        <w:rPr>
-          <w:rFonts w:ascii="Times New Roman" w:eastAsia="Times New Roman" w:hAnsi="Times New Roman" w:cs="Times New Roman"/>
-          <w:b/>
-          <w:color w:val="000000"/>
-          <w:kern w:val="0"/>
-          <w:sz w:val="32"/>
-          <w:szCs w:val="32"/>
-          <w:lang w:val="en-US"/>
-          <w14:ligatures w14:val="none"/>
-        </w:rPr>
-        <w:t>Tarun Samuel</w:t>
-      </w:r>
     </w:p>
     <w:p>
       <w:pPr>
@@ -3414,28 +3322,15 @@
         <w:ind w:right="60"/>
         <w:rPr>
           <w:rFonts w:ascii="Times New Roman" w:eastAsia="Times New Roman" w:hAnsi="Times New Roman" w:cs="Times New Roman"/>
-          <w:bCs/>
-          <w:color w:val="000000"/>
-          <w:kern w:val="0"/>
-          <w:sz w:val="32"/>
-          <w:szCs w:val="32"/>
-          <w:lang w:val="en-US"/>
-          <w14:ligatures w14:val="none"/>
-        </w:rPr>
-      </w:pPr>
-      <w:r>
-        <w:rPr>
-          <w:rFonts w:ascii="Times New Roman" w:eastAsia="Times New Roman" w:hAnsi="Times New Roman" w:cs="Times New Roman"/>
-          <w:bCs/>
-          <w:color w:val="000000"/>
-          <w:kern w:val="0"/>
-          <w:sz w:val="32"/>
-          <w:szCs w:val="32"/>
-          <w:lang w:val="en-US"/>
-          <w14:ligatures w14:val="none"/>
-        </w:rPr>
-        <w:t>Focus on challenges investors face with traditional portfolio allocation methods.</w:t>
-      </w:r>
+          <w:b/>
+          <w:color w:val="000000"/>
+          <w:kern w:val="0"/>
+          <w:sz w:val="32"/>
+          <w:szCs w:val="32"/>
+          <w:lang w:val="en-US"/>
+          <w14:ligatures w14:val="none"/>
+        </w:rPr>
+      </w:pPr>
     </w:p>
     <w:p>
       <w:pPr>
@@ -3443,27 +3338,27 @@
         <w:ind w:right="60"/>
         <w:rPr>
           <w:rFonts w:ascii="Times New Roman" w:eastAsia="Times New Roman" w:hAnsi="Times New Roman" w:cs="Times New Roman"/>
-          <w:bCs/>
-          <w:color w:val="000000"/>
-          <w:kern w:val="0"/>
-          <w:sz w:val="32"/>
-          <w:szCs w:val="32"/>
-          <w:lang w:val="en-US"/>
-          <w14:ligatures w14:val="none"/>
-        </w:rPr>
-      </w:pPr>
-      <w:r>
-        <w:rPr>
-          <w:rFonts w:ascii="Times New Roman" w:eastAsia="Times New Roman" w:hAnsi="Times New Roman" w:cs="Times New Roman"/>
-          <w:bCs/>
-          <w:color w:val="000000"/>
-          <w:kern w:val="0"/>
-          <w:sz w:val="32"/>
-          <w:szCs w:val="32"/>
-          <w:lang w:val="en-US"/>
-          <w14:ligatures w14:val="none"/>
-        </w:rPr>
-        <w:t>Explain the financial impact of poor risk management and how reinforcement learning addresses these challenges.</w:t>
+          <w:b/>
+          <w:color w:val="000000"/>
+          <w:kern w:val="0"/>
+          <w:sz w:val="32"/>
+          <w:szCs w:val="32"/>
+          <w:lang w:val="en-US"/>
+          <w14:ligatures w14:val="none"/>
+        </w:rPr>
+      </w:pPr>
+      <w:r>
+        <w:rPr>
+          <w:rFonts w:ascii="Times New Roman" w:eastAsia="Times New Roman" w:hAnsi="Times New Roman" w:cs="Times New Roman"/>
+          <w:b/>
+          <w:color w:val="000000"/>
+          <w:kern w:val="0"/>
+          <w:sz w:val="32"/>
+          <w:szCs w:val="32"/>
+          <w:lang w:val="en-US"/>
+          <w14:ligatures w14:val="none"/>
+        </w:rPr>
+        <w:t>2. Defining the Problem @Tarun Samuel</w:t>
       </w:r>
     </w:p>
     <w:p>
@@ -3492,20 +3387,8 @@
           <w:lang w:val="en-US"/>
           <w14:ligatures w14:val="none"/>
         </w:rPr>
-        <w:t xml:space="preserve">Answer here </w:t>
-      </w:r>
-      <w:r>
-        <w:rPr>
-          <w:rFonts w:ascii="Times New Roman" w:eastAsia="Times New Roman" w:hAnsi="Times New Roman" w:cs="Times New Roman"/>
-          <w:bCs/>
-          <w:color w:val="000000"/>
-          <w:kern w:val="0"/>
-          <w:sz w:val="32"/>
-          <w:szCs w:val="32"/>
-          <w:lang w:val="en-US"/>
-          <w14:ligatures w14:val="none"/>
-        </w:rPr>
-        <w:sym w:font="Wingdings" w:char="F0E0"/>
+        <w:lastRenderedPageBreak/>
+        <w:t>Focus on challenges investors face with traditional portfolio allocation methods.</w:t>
       </w:r>
     </w:p>
     <w:p>
@@ -3514,15 +3397,28 @@
         <w:ind w:right="60"/>
         <w:rPr>
           <w:rFonts w:ascii="Times New Roman" w:eastAsia="Times New Roman" w:hAnsi="Times New Roman" w:cs="Times New Roman"/>
-          <w:b/>
-          <w:color w:val="000000"/>
-          <w:kern w:val="0"/>
-          <w:sz w:val="32"/>
-          <w:szCs w:val="32"/>
-          <w:lang w:val="en-US"/>
-          <w14:ligatures w14:val="none"/>
-        </w:rPr>
-      </w:pPr>
+          <w:bCs/>
+          <w:color w:val="000000"/>
+          <w:kern w:val="0"/>
+          <w:sz w:val="32"/>
+          <w:szCs w:val="32"/>
+          <w:lang w:val="en-US"/>
+          <w14:ligatures w14:val="none"/>
+        </w:rPr>
+      </w:pPr>
+      <w:r>
+        <w:rPr>
+          <w:rFonts w:ascii="Times New Roman" w:eastAsia="Times New Roman" w:hAnsi="Times New Roman" w:cs="Times New Roman"/>
+          <w:bCs/>
+          <w:color w:val="000000"/>
+          <w:kern w:val="0"/>
+          <w:sz w:val="32"/>
+          <w:szCs w:val="32"/>
+          <w:lang w:val="en-US"/>
+          <w14:ligatures w14:val="none"/>
+        </w:rPr>
+        <w:t>Explain the financial impact of poor risk management and how reinforcement learning addresses these challenges.</w:t>
+      </w:r>
     </w:p>
     <w:p>
       <w:pPr>
@@ -3530,6 +3426,64 @@
         <w:ind w:right="60"/>
         <w:rPr>
           <w:rFonts w:ascii="Times New Roman" w:eastAsia="Times New Roman" w:hAnsi="Times New Roman" w:cs="Times New Roman"/>
+          <w:bCs/>
+          <w:color w:val="000000"/>
+          <w:kern w:val="0"/>
+          <w:sz w:val="32"/>
+          <w:szCs w:val="32"/>
+          <w:lang w:val="en-US"/>
+          <w14:ligatures w14:val="none"/>
+        </w:rPr>
+      </w:pPr>
+      <w:r>
+        <w:rPr>
+          <w:rFonts w:ascii="Times New Roman" w:eastAsia="Times New Roman" w:hAnsi="Times New Roman" w:cs="Times New Roman"/>
+          <w:bCs/>
+          <w:color w:val="000000"/>
+          <w:kern w:val="0"/>
+          <w:sz w:val="32"/>
+          <w:szCs w:val="32"/>
+          <w:lang w:val="en-US"/>
+          <w14:ligatures w14:val="none"/>
+        </w:rPr>
+        <w:t xml:space="preserve">Answer here </w:t>
+      </w:r>
+      <w:r>
+        <w:rPr>
+          <w:rFonts w:ascii="Times New Roman" w:eastAsia="Times New Roman" w:hAnsi="Times New Roman" w:cs="Times New Roman"/>
+          <w:bCs/>
+          <w:color w:val="000000"/>
+          <w:kern w:val="0"/>
+          <w:sz w:val="32"/>
+          <w:szCs w:val="32"/>
+          <w:lang w:val="en-US"/>
+          <w14:ligatures w14:val="none"/>
+        </w:rPr>
+        <w:sym w:font="Wingdings" w:char="F0E0"/>
+      </w:r>
+    </w:p>
+    <w:p>
+      <w:pPr>
+        <w:spacing w:after="162" w:line="360" w:lineRule="auto"/>
+        <w:ind w:right="60"/>
+        <w:rPr>
+          <w:rFonts w:ascii="Times New Roman" w:eastAsia="Times New Roman" w:hAnsi="Times New Roman" w:cs="Times New Roman"/>
+          <w:b/>
+          <w:color w:val="000000"/>
+          <w:kern w:val="0"/>
+          <w:sz w:val="32"/>
+          <w:szCs w:val="32"/>
+          <w:lang w:val="en-US"/>
+          <w14:ligatures w14:val="none"/>
+        </w:rPr>
+      </w:pPr>
+    </w:p>
+    <w:p>
+      <w:pPr>
+        <w:spacing w:after="162" w:line="360" w:lineRule="auto"/>
+        <w:ind w:right="60"/>
+        <w:rPr>
+          <w:rFonts w:ascii="Times New Roman" w:eastAsia="Times New Roman" w:hAnsi="Times New Roman" w:cs="Times New Roman"/>
           <w:b/>
           <w:color w:val="000000"/>
           <w:kern w:val="0"/>
@@ -3566,63 +3520,7 @@
           <w:lang w:val="en-US"/>
           <w14:ligatures w14:val="none"/>
         </w:rPr>
-        <w:t xml:space="preserve">3 </w:t>
-      </w:r>
-      <w:proofErr w:type="gramStart"/>
-      <w:r>
-        <w:rPr>
-          <w:rFonts w:ascii="Times New Roman" w:eastAsia="Times New Roman" w:hAnsi="Times New Roman" w:cs="Times New Roman"/>
-          <w:b/>
-          <w:color w:val="000000"/>
-          <w:kern w:val="0"/>
-          <w:sz w:val="32"/>
-          <w:szCs w:val="32"/>
-          <w:lang w:val="en-US"/>
-          <w14:ligatures w14:val="none"/>
-        </w:rPr>
-        <w:t>Differentiation @</w:t>
-      </w:r>
-      <w:proofErr w:type="gramEnd"/>
-      <w:r>
-        <w:rPr>
-          <w:rFonts w:ascii="Times New Roman" w:eastAsia="Times New Roman" w:hAnsi="Times New Roman" w:cs="Times New Roman"/>
-          <w:b/>
-          <w:color w:val="000000"/>
-          <w:kern w:val="0"/>
-          <w:sz w:val="32"/>
-          <w:szCs w:val="32"/>
-          <w:lang w:val="en-US"/>
-          <w14:ligatures w14:val="none"/>
-        </w:rPr>
-        <w:t xml:space="preserve"> </w:t>
-      </w:r>
-      <w:proofErr w:type="spellStart"/>
-      <w:r>
-        <w:rPr>
-          <w:rFonts w:ascii="Times New Roman" w:eastAsia="Times New Roman" w:hAnsi="Times New Roman" w:cs="Times New Roman"/>
-          <w:b/>
-          <w:color w:val="000000"/>
-          <w:kern w:val="0"/>
-          <w:sz w:val="32"/>
-          <w:szCs w:val="32"/>
-          <w:lang w:val="en-US"/>
-          <w14:ligatures w14:val="none"/>
-        </w:rPr>
-        <w:t>Riyo</w:t>
-      </w:r>
-      <w:proofErr w:type="spellEnd"/>
-      <w:r>
-        <w:rPr>
-          <w:rFonts w:ascii="Times New Roman" w:eastAsia="Times New Roman" w:hAnsi="Times New Roman" w:cs="Times New Roman"/>
-          <w:b/>
-          <w:color w:val="000000"/>
-          <w:kern w:val="0"/>
-          <w:sz w:val="32"/>
-          <w:szCs w:val="32"/>
-          <w:lang w:val="en-US"/>
-          <w14:ligatures w14:val="none"/>
-        </w:rPr>
-        <w:t xml:space="preserve"> Sebastian</w:t>
+        <w:t>3 Differentiation @ Riyo Sebastian</w:t>
       </w:r>
     </w:p>
     <w:p>
@@ -3793,36 +3691,7 @@
           <w:lang w:val="en-US"/>
           <w14:ligatures w14:val="none"/>
         </w:rPr>
-        <w:lastRenderedPageBreak/>
-        <w:t xml:space="preserve">3.3. </w:t>
-      </w:r>
-      <w:proofErr w:type="gramStart"/>
-      <w:r>
-        <w:rPr>
-          <w:rFonts w:ascii="Times New Roman" w:eastAsia="Times New Roman" w:hAnsi="Times New Roman" w:cs="Times New Roman"/>
-          <w:bCs/>
-          <w:color w:val="000000"/>
-          <w:kern w:val="0"/>
-          <w:sz w:val="32"/>
-          <w:szCs w:val="32"/>
-          <w:lang w:val="en-US"/>
-          <w14:ligatures w14:val="none"/>
-        </w:rPr>
-        <w:t>Explains</w:t>
-      </w:r>
-      <w:proofErr w:type="gramEnd"/>
-      <w:r>
-        <w:rPr>
-          <w:rFonts w:ascii="Times New Roman" w:eastAsia="Times New Roman" w:hAnsi="Times New Roman" w:cs="Times New Roman"/>
-          <w:bCs/>
-          <w:color w:val="000000"/>
-          <w:kern w:val="0"/>
-          <w:sz w:val="32"/>
-          <w:szCs w:val="32"/>
-          <w:lang w:val="en-US"/>
-          <w14:ligatures w14:val="none"/>
-        </w:rPr>
-        <w:t xml:space="preserve"> how your project/solution addresses these gaps and provides a unique value proposition.</w:t>
+        <w:t>3.3. Explains how your project/solution addresses these gaps and provides a unique value proposition.</w:t>
       </w:r>
     </w:p>
     <w:p>
@@ -3951,6 +3820,7 @@
           <w:lang w:val="en-US"/>
           <w14:ligatures w14:val="none"/>
         </w:rPr>
+        <w:lastRenderedPageBreak/>
         <w:t xml:space="preserve">Answer here </w:t>
       </w:r>
       <w:r>
@@ -4112,107 +3982,8 @@
           <w:lang w:val="en-US"/>
           <w14:ligatures w14:val="none"/>
         </w:rPr>
-        <w:t xml:space="preserve">4 Data Gathering and </w:t>
-      </w:r>
-      <w:proofErr w:type="gramStart"/>
-      <w:r>
-        <w:rPr>
-          <w:rFonts w:ascii="Times New Roman" w:eastAsia="Times New Roman" w:hAnsi="Times New Roman" w:cs="Times New Roman"/>
-          <w:b/>
-          <w:color w:val="000000"/>
-          <w:kern w:val="0"/>
-          <w:sz w:val="32"/>
-          <w:szCs w:val="32"/>
-          <w:lang w:val="en-US"/>
-          <w14:ligatures w14:val="none"/>
-        </w:rPr>
-        <w:t>Insights @</w:t>
-      </w:r>
-      <w:proofErr w:type="gramEnd"/>
-      <w:r>
-        <w:rPr>
-          <w:rFonts w:ascii="Times New Roman" w:eastAsia="Times New Roman" w:hAnsi="Times New Roman" w:cs="Times New Roman"/>
-          <w:b/>
-          <w:color w:val="000000"/>
-          <w:kern w:val="0"/>
-          <w:sz w:val="32"/>
-          <w:szCs w:val="32"/>
-          <w:lang w:val="en-US"/>
-          <w14:ligatures w14:val="none"/>
-        </w:rPr>
-        <w:t xml:space="preserve"> </w:t>
-      </w:r>
-      <w:proofErr w:type="spellStart"/>
-      <w:r>
-        <w:rPr>
-          <w:rFonts w:ascii="Times New Roman" w:eastAsia="Times New Roman" w:hAnsi="Times New Roman" w:cs="Times New Roman"/>
-          <w:b/>
-          <w:color w:val="000000"/>
-          <w:kern w:val="0"/>
-          <w:sz w:val="32"/>
-          <w:szCs w:val="32"/>
-          <w:lang w:val="en-US"/>
-          <w14:ligatures w14:val="none"/>
-        </w:rPr>
-        <w:t>Rajkaran</w:t>
-      </w:r>
-      <w:proofErr w:type="spellEnd"/>
-      <w:r>
-        <w:rPr>
-          <w:rFonts w:ascii="Times New Roman" w:eastAsia="Times New Roman" w:hAnsi="Times New Roman" w:cs="Times New Roman"/>
-          <w:b/>
-          <w:color w:val="000000"/>
-          <w:kern w:val="0"/>
-          <w:sz w:val="32"/>
-          <w:szCs w:val="32"/>
-          <w:lang w:val="en-US"/>
-          <w14:ligatures w14:val="none"/>
-        </w:rPr>
-        <w:t xml:space="preserve"> </w:t>
-      </w:r>
-      <w:proofErr w:type="spellStart"/>
-      <w:r>
-        <w:rPr>
-          <w:rFonts w:ascii="Times New Roman" w:eastAsia="Times New Roman" w:hAnsi="Times New Roman" w:cs="Times New Roman"/>
-          <w:b/>
-          <w:color w:val="000000"/>
-          <w:kern w:val="0"/>
-          <w:sz w:val="32"/>
-          <w:szCs w:val="32"/>
-          <w:lang w:val="en-US"/>
-          <w14:ligatures w14:val="none"/>
-        </w:rPr>
-        <w:t>Yasodhadevi</w:t>
-      </w:r>
-      <w:proofErr w:type="spellEnd"/>
-      <w:r>
-        <w:rPr>
-          <w:rFonts w:ascii="Times New Roman" w:eastAsia="Times New Roman" w:hAnsi="Times New Roman" w:cs="Times New Roman"/>
-          <w:b/>
-          <w:color w:val="000000"/>
-          <w:kern w:val="0"/>
-          <w:sz w:val="32"/>
-          <w:szCs w:val="32"/>
-          <w:lang w:val="en-US"/>
-          <w14:ligatures w14:val="none"/>
-        </w:rPr>
-        <w:t xml:space="preserve"> </w:t>
-      </w:r>
-      <w:proofErr w:type="spellStart"/>
-      <w:r>
-        <w:rPr>
-          <w:rFonts w:ascii="Times New Roman" w:eastAsia="Times New Roman" w:hAnsi="Times New Roman" w:cs="Times New Roman"/>
-          <w:b/>
-          <w:color w:val="000000"/>
-          <w:kern w:val="0"/>
-          <w:sz w:val="32"/>
-          <w:szCs w:val="32"/>
-          <w:lang w:val="en-US"/>
-          <w14:ligatures w14:val="none"/>
-        </w:rPr>
-        <w:t>Ponnuvelusamy</w:t>
-      </w:r>
-      <w:proofErr w:type="spellEnd"/>
+        <w:t>4 Data Gathering and Insights @ Rajkaran Yasodhadevi Ponnuvelusamy</w:t>
+      </w:r>
     </w:p>
     <w:p>
       <w:pPr>
@@ -4240,35 +4011,7 @@
           <w:lang w:val="en-US"/>
           <w14:ligatures w14:val="none"/>
         </w:rPr>
-        <w:t xml:space="preserve">    4.1Collect datasets from the given links (</w:t>
-      </w:r>
-      <w:proofErr w:type="spellStart"/>
-      <w:r>
-        <w:rPr>
-          <w:rFonts w:ascii="Times New Roman" w:eastAsia="Times New Roman" w:hAnsi="Times New Roman" w:cs="Times New Roman"/>
-          <w:bCs/>
-          <w:color w:val="000000"/>
-          <w:kern w:val="0"/>
-          <w:sz w:val="32"/>
-          <w:szCs w:val="32"/>
-          <w:lang w:val="en-US"/>
-          <w14:ligatures w14:val="none"/>
-        </w:rPr>
-        <w:t>FinRL</w:t>
-      </w:r>
-      <w:proofErr w:type="spellEnd"/>
-      <w:r>
-        <w:rPr>
-          <w:rFonts w:ascii="Times New Roman" w:eastAsia="Times New Roman" w:hAnsi="Times New Roman" w:cs="Times New Roman"/>
-          <w:bCs/>
-          <w:color w:val="000000"/>
-          <w:kern w:val="0"/>
-          <w:sz w:val="32"/>
-          <w:szCs w:val="32"/>
-          <w:lang w:val="en-US"/>
-          <w14:ligatures w14:val="none"/>
-        </w:rPr>
-        <w:t xml:space="preserve"> GitHub and Yahoo Finance). -</w:t>
+        <w:t xml:space="preserve">    4.1Collect datasets from the given links (FinRL GitHub and Yahoo Finance). -</w:t>
       </w:r>
       <w:r>
         <w:rPr>
@@ -4436,22 +4179,7 @@
           <w:lang w:val="en-US"/>
           <w14:ligatures w14:val="none"/>
         </w:rPr>
-        <w:lastRenderedPageBreak/>
-        <w:t xml:space="preserve">5 Analyze the data to identify </w:t>
-      </w:r>
-      <w:proofErr w:type="gramStart"/>
-      <w:r>
-        <w:rPr>
-          <w:rFonts w:ascii="Times New Roman" w:eastAsia="Times New Roman" w:hAnsi="Times New Roman" w:cs="Times New Roman"/>
-          <w:b/>
-          <w:color w:val="000000"/>
-          <w:kern w:val="0"/>
-          <w:sz w:val="32"/>
-          <w:szCs w:val="32"/>
-          <w:lang w:val="en-US"/>
-          <w14:ligatures w14:val="none"/>
-        </w:rPr>
-        <w:t>patterns</w:t>
+        <w:t>5 Analyze the data to identify patterns</w:t>
       </w:r>
       <w:r>
         <w:rPr>
@@ -4477,21 +4205,7 @@
           <w:lang w:val="en-US"/>
           <w14:ligatures w14:val="none"/>
         </w:rPr>
-        <w:t>@</w:t>
-      </w:r>
-      <w:proofErr w:type="gramEnd"/>
-      <w:r>
-        <w:rPr>
-          <w:rFonts w:ascii="Times New Roman" w:eastAsia="Times New Roman" w:hAnsi="Times New Roman" w:cs="Times New Roman"/>
-          <w:b/>
-          <w:color w:val="000000"/>
-          <w:kern w:val="0"/>
-          <w:sz w:val="32"/>
-          <w:szCs w:val="32"/>
-          <w:lang w:val="en-US"/>
-          <w14:ligatures w14:val="none"/>
-        </w:rPr>
-        <w:t xml:space="preserve"> Jobina Joy</w:t>
+        <w:t>@ Jobina Joy</w:t>
       </w:r>
     </w:p>
     <w:p>
@@ -4636,6 +4350,7 @@
           <w:lang w:val="en-US"/>
           <w14:ligatures w14:val="none"/>
         </w:rPr>
+        <w:lastRenderedPageBreak/>
         <w:t>Use tools like Python, pandas, or NumPy.</w:t>
       </w:r>
     </w:p>
@@ -4752,37 +4467,7 @@
           <w:lang w:eastAsia="en-CA"/>
           <w14:ligatures w14:val="none"/>
         </w:rPr>
-        <w:t xml:space="preserve">: @ Anand </w:t>
-      </w:r>
-      <w:proofErr w:type="spellStart"/>
-      <w:r>
-        <w:rPr>
-          <w:rFonts w:ascii="Times New Roman" w:eastAsia="Times New Roman" w:hAnsi="Times New Roman" w:cs="Times New Roman"/>
-          <w:b/>
-          <w:bCs/>
-          <w:color w:val="000000"/>
-          <w:kern w:val="0"/>
-          <w:sz w:val="32"/>
-          <w:szCs w:val="32"/>
-          <w:lang w:eastAsia="en-CA"/>
-          <w14:ligatures w14:val="none"/>
-        </w:rPr>
-        <w:t>Chathananickal</w:t>
-      </w:r>
-      <w:proofErr w:type="spellEnd"/>
-      <w:r>
-        <w:rPr>
-          <w:rFonts w:ascii="Times New Roman" w:eastAsia="Times New Roman" w:hAnsi="Times New Roman" w:cs="Times New Roman"/>
-          <w:b/>
-          <w:bCs/>
-          <w:color w:val="000000"/>
-          <w:kern w:val="0"/>
-          <w:sz w:val="32"/>
-          <w:szCs w:val="32"/>
-          <w:lang w:eastAsia="en-CA"/>
-          <w14:ligatures w14:val="none"/>
-        </w:rPr>
-        <w:t xml:space="preserve"> Sajeevan</w:t>
+        <w:t>: @ Anand Chathananickal Sajeevan</w:t>
       </w:r>
       <w:r>
         <w:rPr>
@@ -4892,37 +4577,7 @@
           <w:lang w:eastAsia="en-CA"/>
           <w14:ligatures w14:val="none"/>
         </w:rPr>
-        <w:t xml:space="preserve">7 Design wireframes and pipelines: @ </w:t>
-      </w:r>
-      <w:proofErr w:type="spellStart"/>
-      <w:r>
-        <w:rPr>
-          <w:rFonts w:ascii="Times New Roman" w:eastAsia="Times New Roman" w:hAnsi="Times New Roman" w:cs="Times New Roman"/>
-          <w:b/>
-          <w:bCs/>
-          <w:color w:val="000000"/>
-          <w:kern w:val="0"/>
-          <w:sz w:val="32"/>
-          <w:szCs w:val="32"/>
-          <w:lang w:eastAsia="en-CA"/>
-          <w14:ligatures w14:val="none"/>
-        </w:rPr>
-        <w:t>Jeffin</w:t>
-      </w:r>
-      <w:proofErr w:type="spellEnd"/>
-      <w:r>
-        <w:rPr>
-          <w:rFonts w:ascii="Times New Roman" w:eastAsia="Times New Roman" w:hAnsi="Times New Roman" w:cs="Times New Roman"/>
-          <w:b/>
-          <w:bCs/>
-          <w:color w:val="000000"/>
-          <w:kern w:val="0"/>
-          <w:sz w:val="32"/>
-          <w:szCs w:val="32"/>
-          <w:lang w:eastAsia="en-CA"/>
-          <w14:ligatures w14:val="none"/>
-        </w:rPr>
-        <w:t xml:space="preserve"> Kochurani Ravi</w:t>
+        <w:t>7 Design wireframes and pipelines: @ Jeffin Kochurani Ravi</w:t>
       </w:r>
     </w:p>
     <w:p>
@@ -5147,7 +4802,7 @@
       <w:r>
         <w:t xml:space="preserve">Investopedia. “What Is Portfolio Management?” [Online]. Available: </w:t>
       </w:r>
-      <w:hyperlink r:id="rId6" w:tgtFrame="_new" w:history="1">
+      <w:hyperlink r:id="rId7" w:tgtFrame="_new" w:history="1">
         <w:r>
           <w:rPr>
             <w:rStyle w:val="Hyperlink"/>
@@ -5173,15 +4828,10 @@
           <w14:ligatures w14:val="none"/>
         </w:rPr>
       </w:pPr>
-      <w:proofErr w:type="spellStart"/>
-      <w:r>
-        <w:t>Groww</w:t>
-      </w:r>
-      <w:proofErr w:type="spellEnd"/>
-      <w:r>
-        <w:t xml:space="preserve">. “Portfolio Management Overview.” [Online]. Available: </w:t>
-      </w:r>
-      <w:hyperlink r:id="rId7" w:tgtFrame="_new" w:history="1">
+      <w:r>
+        <w:t xml:space="preserve">Groww. “Portfolio Management Overview.” [Online]. Available: </w:t>
+      </w:r>
+      <w:hyperlink r:id="rId8" w:tgtFrame="_new" w:history="1">
         <w:r>
           <w:rPr>
             <w:rStyle w:val="Hyperlink"/>
@@ -7438,6 +7088,7 @@
   <w:style w:type="character" w:default="1" w:styleId="DefaultParagraphFont">
     <w:name w:val="Default Paragraph Font"/>
     <w:uiPriority w:val="1"/>
+    <w:semiHidden/>
     <w:unhideWhenUsed/>
   </w:style>
   <w:style w:type="table" w:default="1" w:styleId="TableNormal">

</xml_diff>

<commit_message>
Big Data Pipeline + Analysis of data
</commit_message>
<xml_diff>
--- a/doc/PROJECT REPORT - PROJECT PROPOSAL.docx
+++ b/doc/PROJECT REPORT - PROJECT PROPOSAL.docx
@@ -4184,6 +4184,19 @@
       <w:r>
         <w:rPr>
           <w:rFonts w:ascii="Times New Roman" w:eastAsia="Times New Roman" w:hAnsi="Times New Roman" w:cs="Times New Roman"/>
+          <w:b/>
+          <w:color w:val="000000"/>
+          <w:kern w:val="0"/>
+          <w:sz w:val="32"/>
+          <w:szCs w:val="32"/>
+          <w:lang w:val="en-US"/>
+          <w14:ligatures w14:val="none"/>
+        </w:rPr>
+        <w:t xml:space="preserve"> and visualization for analysis</w:t>
+      </w:r>
+      <w:r>
+        <w:rPr>
+          <w:rFonts w:ascii="Times New Roman" w:eastAsia="Times New Roman" w:hAnsi="Times New Roman" w:cs="Times New Roman"/>
           <w:bCs/>
           <w:color w:val="000000"/>
           <w:kern w:val="0"/>
@@ -4206,6 +4219,19 @@
           <w14:ligatures w14:val="none"/>
         </w:rPr>
         <w:t>@ Jobina Joy</w:t>
+      </w:r>
+      <w:r>
+        <w:rPr>
+          <w:rFonts w:ascii="Times New Roman" w:eastAsia="Times New Roman" w:hAnsi="Times New Roman" w:cs="Times New Roman"/>
+          <w:b/>
+          <w:color w:val="000000"/>
+          <w:kern w:val="0"/>
+          <w:sz w:val="32"/>
+          <w:szCs w:val="32"/>
+          <w:lang w:val="en-US"/>
+          <w14:ligatures w14:val="none"/>
+        </w:rPr>
+        <w:t xml:space="preserve"> and @Anand Chathananickal Sajeevan</w:t>
       </w:r>
     </w:p>
     <w:p>
@@ -4243,27 +4269,90 @@
         <w:ind w:left="20" w:right="60" w:hanging="10"/>
         <w:rPr>
           <w:rFonts w:ascii="Times New Roman" w:eastAsia="Times New Roman" w:hAnsi="Times New Roman" w:cs="Times New Roman"/>
-          <w:bCs/>
-          <w:color w:val="000000"/>
-          <w:kern w:val="0"/>
-          <w:sz w:val="32"/>
-          <w:szCs w:val="32"/>
-          <w:lang w:val="en-US"/>
-          <w14:ligatures w14:val="none"/>
-        </w:rPr>
-      </w:pPr>
-      <w:r>
-        <w:rPr>
-          <w:rFonts w:ascii="Times New Roman" w:eastAsia="Times New Roman" w:hAnsi="Times New Roman" w:cs="Times New Roman"/>
-          <w:bCs/>
-          <w:color w:val="000000"/>
-          <w:kern w:val="0"/>
-          <w:sz w:val="32"/>
-          <w:szCs w:val="32"/>
-          <w:lang w:val="en-US"/>
-          <w14:ligatures w14:val="none"/>
-        </w:rPr>
-        <w:t>Trends in stock price volatility.</w:t>
+          <w:color w:val="000000"/>
+          <w:kern w:val="0"/>
+          <w:sz w:val="32"/>
+          <w:szCs w:val="32"/>
+          <w:lang w:eastAsia="en-CA"/>
+          <w14:ligatures w14:val="none"/>
+        </w:rPr>
+      </w:pPr>
+      <w:r>
+        <w:rPr>
+          <w:rFonts w:ascii="Times New Roman" w:eastAsia="Times New Roman" w:hAnsi="Times New Roman" w:cs="Times New Roman"/>
+          <w:bCs/>
+          <w:color w:val="000000"/>
+          <w:kern w:val="0"/>
+          <w:sz w:val="32"/>
+          <w:szCs w:val="32"/>
+          <w:lang w:val="en-US"/>
+          <w14:ligatures w14:val="none"/>
+        </w:rPr>
+        <w:t>Use tools like Python, pandas, or NumPy</w:t>
+      </w:r>
+      <w:r>
+        <w:rPr>
+          <w:rFonts w:ascii="Times New Roman" w:eastAsia="Times New Roman" w:hAnsi="Times New Roman" w:cs="Times New Roman"/>
+          <w:color w:val="000000"/>
+          <w:kern w:val="0"/>
+          <w:sz w:val="32"/>
+          <w:szCs w:val="32"/>
+          <w:lang w:eastAsia="en-CA"/>
+          <w14:ligatures w14:val="none"/>
+        </w:rPr>
+        <w:br/>
+        <w:t>Create graphs, heatmaps, or visualizations for:</w:t>
+      </w:r>
+      <w:r>
+        <w:rPr>
+          <w:rFonts w:ascii="Times New Roman" w:eastAsia="Times New Roman" w:hAnsi="Times New Roman" w:cs="Times New Roman"/>
+          <w:color w:val="000000"/>
+          <w:kern w:val="0"/>
+          <w:sz w:val="32"/>
+          <w:szCs w:val="32"/>
+          <w:lang w:eastAsia="en-CA"/>
+          <w14:ligatures w14:val="none"/>
+        </w:rPr>
+        <w:br/>
+      </w:r>
+      <w:r>
+        <w:rPr>
+          <w:rFonts w:ascii="Times New Roman" w:eastAsia="Times New Roman" w:hAnsi="Times New Roman" w:cs="Times New Roman"/>
+          <w:color w:val="000000"/>
+          <w:kern w:val="0"/>
+          <w:sz w:val="32"/>
+          <w:szCs w:val="32"/>
+          <w:lang w:eastAsia="en-CA"/>
+          <w14:ligatures w14:val="none"/>
+        </w:rPr>
+        <w:lastRenderedPageBreak/>
+        <w:t>Stock price trends.</w:t>
+      </w:r>
+      <w:r>
+        <w:rPr>
+          <w:rFonts w:ascii="Times New Roman" w:eastAsia="Times New Roman" w:hAnsi="Times New Roman" w:cs="Times New Roman"/>
+          <w:color w:val="000000"/>
+          <w:kern w:val="0"/>
+          <w:sz w:val="32"/>
+          <w:szCs w:val="32"/>
+          <w:lang w:eastAsia="en-CA"/>
+          <w14:ligatures w14:val="none"/>
+        </w:rPr>
+        <w:br/>
+        <w:t>Portfolio performance comparisons.</w:t>
+      </w:r>
+      <w:r>
+        <w:rPr>
+          <w:rFonts w:ascii="Times New Roman" w:eastAsia="Times New Roman" w:hAnsi="Times New Roman" w:cs="Times New Roman"/>
+          <w:color w:val="000000"/>
+          <w:kern w:val="0"/>
+          <w:sz w:val="32"/>
+          <w:szCs w:val="32"/>
+          <w:lang w:eastAsia="en-CA"/>
+          <w14:ligatures w14:val="none"/>
+        </w:rPr>
+        <w:br/>
+        <w:t>Risk-return scatter plots.</w:t>
       </w:r>
     </w:p>
     <w:p>
@@ -4272,27 +4361,25 @@
         <w:ind w:left="20" w:right="60" w:hanging="10"/>
         <w:rPr>
           <w:rFonts w:ascii="Times New Roman" w:eastAsia="Times New Roman" w:hAnsi="Times New Roman" w:cs="Times New Roman"/>
-          <w:bCs/>
-          <w:color w:val="000000"/>
-          <w:kern w:val="0"/>
-          <w:sz w:val="32"/>
-          <w:szCs w:val="32"/>
-          <w:lang w:val="en-US"/>
-          <w14:ligatures w14:val="none"/>
-        </w:rPr>
-      </w:pPr>
-      <w:r>
-        <w:rPr>
-          <w:rFonts w:ascii="Times New Roman" w:eastAsia="Times New Roman" w:hAnsi="Times New Roman" w:cs="Times New Roman"/>
-          <w:bCs/>
-          <w:color w:val="000000"/>
-          <w:kern w:val="0"/>
-          <w:sz w:val="32"/>
-          <w:szCs w:val="32"/>
-          <w:lang w:val="en-US"/>
-          <w14:ligatures w14:val="none"/>
-        </w:rPr>
-        <w:t>How reinforcement learning models outperform baselines.</w:t>
+          <w:color w:val="000000"/>
+          <w:kern w:val="0"/>
+          <w:sz w:val="32"/>
+          <w:szCs w:val="32"/>
+          <w:lang w:eastAsia="en-CA"/>
+          <w14:ligatures w14:val="none"/>
+        </w:rPr>
+      </w:pPr>
+      <w:r>
+        <w:rPr>
+          <w:rFonts w:ascii="Times New Roman" w:eastAsia="Times New Roman" w:hAnsi="Times New Roman" w:cs="Times New Roman"/>
+          <w:color w:val="000000"/>
+          <w:kern w:val="0"/>
+          <w:sz w:val="32"/>
+          <w:szCs w:val="32"/>
+          <w:lang w:eastAsia="en-CA"/>
+          <w14:ligatures w14:val="none"/>
+        </w:rPr>
+        <w:t>Anand:</w:t>
       </w:r>
     </w:p>
     <w:p>
@@ -4321,7 +4408,41 @@
           <w:lang w:val="en-US"/>
           <w14:ligatures w14:val="none"/>
         </w:rPr>
-        <w:t>Risk-adjusted return improvements.</w:t>
+        <w:drawing>
+          <wp:inline distT="0" distB="0" distL="0" distR="0" wp14:anchorId="7DF7AB4B" wp14:editId="51C9CBE9">
+            <wp:extent cx="5943600" cy="3966845"/>
+            <wp:effectExtent l="0" t="0" r="0" b="0"/>
+            <wp:docPr id="1939451013" name="Picture 1" descr="A graph of a stable stock&#10;&#10;Description automatically generated with medium confidence"/>
+            <wp:cNvGraphicFramePr>
+              <a:graphicFrameLocks xmlns:a="http://schemas.openxmlformats.org/drawingml/2006/main" noChangeAspect="1"/>
+            </wp:cNvGraphicFramePr>
+            <a:graphic xmlns:a="http://schemas.openxmlformats.org/drawingml/2006/main">
+              <a:graphicData uri="http://schemas.openxmlformats.org/drawingml/2006/picture">
+                <pic:pic xmlns:pic="http://schemas.openxmlformats.org/drawingml/2006/picture">
+                  <pic:nvPicPr>
+                    <pic:cNvPr id="1939451013" name="Picture 1" descr="A graph of a stable stock&#10;&#10;Description automatically generated with medium confidence"/>
+                    <pic:cNvPicPr/>
+                  </pic:nvPicPr>
+                  <pic:blipFill>
+                    <a:blip r:embed="rId7"/>
+                    <a:stretch>
+                      <a:fillRect/>
+                    </a:stretch>
+                  </pic:blipFill>
+                  <pic:spPr>
+                    <a:xfrm>
+                      <a:off x="0" y="0"/>
+                      <a:ext cx="5943600" cy="3966845"/>
+                    </a:xfrm>
+                    <a:prstGeom prst="rect">
+                      <a:avLst/>
+                    </a:prstGeom>
+                  </pic:spPr>
+                </pic:pic>
+              </a:graphicData>
+            </a:graphic>
+          </wp:inline>
+        </w:drawing>
       </w:r>
     </w:p>
     <w:p>
@@ -4351,7 +4472,41 @@
           <w14:ligatures w14:val="none"/>
         </w:rPr>
         <w:lastRenderedPageBreak/>
-        <w:t>Use tools like Python, pandas, or NumPy.</w:t>
+        <w:drawing>
+          <wp:inline distT="0" distB="0" distL="0" distR="0" wp14:anchorId="38FD133B" wp14:editId="37BAB48B">
+            <wp:extent cx="5943600" cy="4622800"/>
+            <wp:effectExtent l="0" t="0" r="0" b="6350"/>
+            <wp:docPr id="1573048193" name="Picture 1" descr="A graph of a graph of different colored bars&#10;&#10;Description automatically generated with medium confidence"/>
+            <wp:cNvGraphicFramePr>
+              <a:graphicFrameLocks xmlns:a="http://schemas.openxmlformats.org/drawingml/2006/main" noChangeAspect="1"/>
+            </wp:cNvGraphicFramePr>
+            <a:graphic xmlns:a="http://schemas.openxmlformats.org/drawingml/2006/main">
+              <a:graphicData uri="http://schemas.openxmlformats.org/drawingml/2006/picture">
+                <pic:pic xmlns:pic="http://schemas.openxmlformats.org/drawingml/2006/picture">
+                  <pic:nvPicPr>
+                    <pic:cNvPr id="1573048193" name="Picture 1" descr="A graph of a graph of different colored bars&#10;&#10;Description automatically generated with medium confidence"/>
+                    <pic:cNvPicPr/>
+                  </pic:nvPicPr>
+                  <pic:blipFill>
+                    <a:blip r:embed="rId8"/>
+                    <a:stretch>
+                      <a:fillRect/>
+                    </a:stretch>
+                  </pic:blipFill>
+                  <pic:spPr>
+                    <a:xfrm>
+                      <a:off x="0" y="0"/>
+                      <a:ext cx="5943600" cy="4622800"/>
+                    </a:xfrm>
+                    <a:prstGeom prst="rect">
+                      <a:avLst/>
+                    </a:prstGeom>
+                  </pic:spPr>
+                </pic:pic>
+              </a:graphicData>
+            </a:graphic>
+          </wp:inline>
+        </w:drawing>
       </w:r>
     </w:p>
     <w:p>
@@ -4369,6 +4524,134 @@
           <w14:ligatures w14:val="none"/>
         </w:rPr>
       </w:pPr>
+      <w:r>
+        <w:rPr>
+          <w:rFonts w:ascii="Times New Roman" w:eastAsia="Times New Roman" w:hAnsi="Times New Roman" w:cs="Times New Roman"/>
+          <w:bCs/>
+          <w:color w:val="000000"/>
+          <w:kern w:val="0"/>
+          <w:sz w:val="32"/>
+          <w:szCs w:val="32"/>
+          <w:lang w:val="en-US"/>
+          <w14:ligatures w14:val="none"/>
+        </w:rPr>
+        <w:t>Jobina:</w:t>
+      </w:r>
+      <w:r>
+        <w:rPr>
+          <w:rFonts w:ascii="Times New Roman" w:eastAsia="Times New Roman" w:hAnsi="Times New Roman" w:cs="Times New Roman"/>
+          <w:bCs/>
+          <w:color w:val="000000"/>
+          <w:kern w:val="0"/>
+          <w:sz w:val="32"/>
+          <w:szCs w:val="32"/>
+          <w:lang w:val="en-US"/>
+          <w14:ligatures w14:val="none"/>
+        </w:rPr>
+        <w:br/>
+      </w:r>
+    </w:p>
+    <w:p>
+      <w:pPr>
+        <w:spacing w:after="200" w:line="276" w:lineRule="auto"/>
+        <w:rPr>
+          <w:rFonts w:ascii="Times New Roman" w:eastAsia="Times New Roman" w:hAnsi="Times New Roman" w:cs="Times New Roman"/>
+          <w:color w:val="000000"/>
+          <w:kern w:val="0"/>
+          <w:sz w:val="32"/>
+          <w:szCs w:val="32"/>
+          <w:lang w:eastAsia="en-CA"/>
+          <w14:ligatures w14:val="none"/>
+        </w:rPr>
+      </w:pPr>
+    </w:p>
+    <w:p>
+      <w:pPr>
+        <w:spacing w:after="200" w:line="276" w:lineRule="auto"/>
+        <w:rPr>
+          <w:rFonts w:ascii="Times New Roman" w:eastAsia="Times New Roman" w:hAnsi="Times New Roman" w:cs="Times New Roman"/>
+          <w:color w:val="000000"/>
+          <w:kern w:val="0"/>
+          <w:sz w:val="32"/>
+          <w:szCs w:val="32"/>
+          <w:lang w:eastAsia="en-CA"/>
+          <w14:ligatures w14:val="none"/>
+        </w:rPr>
+      </w:pPr>
+    </w:p>
+    <w:p>
+      <w:pPr>
+        <w:spacing w:after="200" w:line="276" w:lineRule="auto"/>
+        <w:rPr>
+          <w:rFonts w:ascii="Times New Roman" w:eastAsia="Times New Roman" w:hAnsi="Times New Roman" w:cs="Times New Roman"/>
+          <w:b/>
+          <w:bCs/>
+          <w:color w:val="000000"/>
+          <w:kern w:val="0"/>
+          <w:sz w:val="32"/>
+          <w:szCs w:val="32"/>
+          <w:lang w:eastAsia="en-CA"/>
+          <w14:ligatures w14:val="none"/>
+        </w:rPr>
+      </w:pPr>
+      <w:r>
+        <w:rPr>
+          <w:rFonts w:ascii="Times New Roman" w:eastAsia="Times New Roman" w:hAnsi="Times New Roman" w:cs="Times New Roman"/>
+          <w:b/>
+          <w:bCs/>
+          <w:color w:val="000000"/>
+          <w:kern w:val="0"/>
+          <w:sz w:val="32"/>
+          <w:szCs w:val="32"/>
+          <w:lang w:eastAsia="en-CA"/>
+          <w14:ligatures w14:val="none"/>
+        </w:rPr>
+        <w:t>7 Design wireframes: @ Jeffin Kochurani Ravi</w:t>
+      </w:r>
+    </w:p>
+    <w:p>
+      <w:pPr>
+        <w:spacing w:after="200" w:line="276" w:lineRule="auto"/>
+        <w:rPr>
+          <w:rFonts w:ascii="Times New Roman" w:eastAsia="Times New Roman" w:hAnsi="Times New Roman" w:cs="Times New Roman"/>
+          <w:b/>
+          <w:bCs/>
+          <w:color w:val="000000"/>
+          <w:kern w:val="0"/>
+          <w:sz w:val="32"/>
+          <w:szCs w:val="32"/>
+          <w:lang w:eastAsia="en-CA"/>
+          <w14:ligatures w14:val="none"/>
+        </w:rPr>
+      </w:pPr>
+      <w:r>
+        <w:rPr>
+          <w:rFonts w:ascii="Times New Roman" w:eastAsia="Times New Roman" w:hAnsi="Times New Roman" w:cs="Times New Roman"/>
+          <w:b/>
+          <w:bCs/>
+          <w:color w:val="000000"/>
+          <w:kern w:val="0"/>
+          <w:sz w:val="32"/>
+          <w:szCs w:val="32"/>
+          <w:lang w:eastAsia="en-CA"/>
+          <w14:ligatures w14:val="none"/>
+        </w:rPr>
+        <w:t>8</w:t>
+      </w:r>
+      <w:r>
+        <w:rPr>
+          <w:rFonts w:ascii="Times New Roman" w:eastAsia="Times New Roman" w:hAnsi="Times New Roman" w:cs="Times New Roman"/>
+          <w:b/>
+          <w:bCs/>
+          <w:color w:val="000000"/>
+          <w:kern w:val="0"/>
+          <w:sz w:val="32"/>
+          <w:szCs w:val="32"/>
+          <w:lang w:eastAsia="en-CA"/>
+          <w14:ligatures w14:val="none"/>
+        </w:rPr>
+        <w:t xml:space="preserve"> Big Data Pipeline @ Anand Chathananickal Sajeevan</w:t>
+      </w:r>
     </w:p>
     <w:p>
       <w:pPr>
@@ -4388,200 +4671,6 @@
     </w:p>
     <w:p>
       <w:pPr>
-        <w:spacing w:after="200" w:line="276" w:lineRule="auto"/>
-        <w:rPr>
-          <w:rFonts w:ascii="Times New Roman" w:eastAsia="Times New Roman" w:hAnsi="Times New Roman" w:cs="Times New Roman"/>
-          <w:b/>
-          <w:color w:val="000000"/>
-          <w:kern w:val="0"/>
-          <w:sz w:val="32"/>
-          <w:szCs w:val="32"/>
-          <w:lang w:val="en-US"/>
-          <w14:ligatures w14:val="none"/>
-        </w:rPr>
-      </w:pPr>
-    </w:p>
-    <w:p>
-      <w:pPr>
-        <w:spacing w:after="200" w:line="276" w:lineRule="auto"/>
-        <w:rPr>
-          <w:rFonts w:ascii="Times New Roman" w:eastAsia="Times New Roman" w:hAnsi="Times New Roman" w:cs="Times New Roman"/>
-          <w:b/>
-          <w:color w:val="000000"/>
-          <w:kern w:val="0"/>
-          <w:sz w:val="32"/>
-          <w:szCs w:val="32"/>
-          <w:lang w:val="en-US"/>
-          <w14:ligatures w14:val="none"/>
-        </w:rPr>
-      </w:pPr>
-    </w:p>
-    <w:p>
-      <w:pPr>
-        <w:spacing w:after="200" w:line="276" w:lineRule="auto"/>
-        <w:rPr>
-          <w:rFonts w:ascii="Times New Roman" w:eastAsia="Times New Roman" w:hAnsi="Times New Roman" w:cs="Times New Roman"/>
-          <w:color w:val="000000"/>
-          <w:kern w:val="0"/>
-          <w:sz w:val="32"/>
-          <w:szCs w:val="32"/>
-          <w:lang w:eastAsia="en-CA"/>
-          <w14:ligatures w14:val="none"/>
-        </w:rPr>
-      </w:pPr>
-      <w:r>
-        <w:rPr>
-          <w:rFonts w:ascii="Times New Roman" w:eastAsia="Times New Roman" w:hAnsi="Times New Roman" w:cs="Times New Roman"/>
-          <w:b/>
-          <w:color w:val="000000"/>
-          <w:kern w:val="0"/>
-          <w:sz w:val="32"/>
-          <w:szCs w:val="32"/>
-          <w:lang w:val="en-US"/>
-          <w14:ligatures w14:val="none"/>
-        </w:rPr>
-        <w:t xml:space="preserve">6 </w:t>
-      </w:r>
-      <w:r>
-        <w:rPr>
-          <w:rFonts w:ascii="Times New Roman" w:eastAsia="Times New Roman" w:hAnsi="Times New Roman" w:cs="Times New Roman"/>
-          <w:b/>
-          <w:color w:val="000000"/>
-          <w:kern w:val="0"/>
-          <w:sz w:val="32"/>
-          <w:szCs w:val="32"/>
-          <w:lang w:eastAsia="en-CA"/>
-          <w14:ligatures w14:val="none"/>
-        </w:rPr>
-        <w:t>Visualization</w:t>
-      </w:r>
-      <w:r>
-        <w:rPr>
-          <w:rFonts w:ascii="Times New Roman" w:eastAsia="Times New Roman" w:hAnsi="Times New Roman" w:cs="Times New Roman"/>
-          <w:b/>
-          <w:bCs/>
-          <w:color w:val="000000"/>
-          <w:kern w:val="0"/>
-          <w:sz w:val="32"/>
-          <w:szCs w:val="32"/>
-          <w:lang w:eastAsia="en-CA"/>
-          <w14:ligatures w14:val="none"/>
-        </w:rPr>
-        <w:t>: @ Anand Chathananickal Sajeevan</w:t>
-      </w:r>
-      <w:r>
-        <w:rPr>
-          <w:rFonts w:ascii="Times New Roman" w:eastAsia="Times New Roman" w:hAnsi="Times New Roman" w:cs="Times New Roman"/>
-          <w:color w:val="000000"/>
-          <w:kern w:val="0"/>
-          <w:sz w:val="32"/>
-          <w:szCs w:val="32"/>
-          <w:lang w:eastAsia="en-CA"/>
-          <w14:ligatures w14:val="none"/>
-        </w:rPr>
-        <w:br/>
-        <w:t>Create graphs, heatmaps, or visualizations for:</w:t>
-      </w:r>
-      <w:r>
-        <w:rPr>
-          <w:rFonts w:ascii="Times New Roman" w:eastAsia="Times New Roman" w:hAnsi="Times New Roman" w:cs="Times New Roman"/>
-          <w:color w:val="000000"/>
-          <w:kern w:val="0"/>
-          <w:sz w:val="32"/>
-          <w:szCs w:val="32"/>
-          <w:lang w:eastAsia="en-CA"/>
-          <w14:ligatures w14:val="none"/>
-        </w:rPr>
-        <w:br/>
-        <w:t>Stock price trends.</w:t>
-      </w:r>
-      <w:r>
-        <w:rPr>
-          <w:rFonts w:ascii="Times New Roman" w:eastAsia="Times New Roman" w:hAnsi="Times New Roman" w:cs="Times New Roman"/>
-          <w:color w:val="000000"/>
-          <w:kern w:val="0"/>
-          <w:sz w:val="32"/>
-          <w:szCs w:val="32"/>
-          <w:lang w:eastAsia="en-CA"/>
-          <w14:ligatures w14:val="none"/>
-        </w:rPr>
-        <w:br/>
-        <w:t>Portfolio performance comparisons.</w:t>
-      </w:r>
-      <w:r>
-        <w:rPr>
-          <w:rFonts w:ascii="Times New Roman" w:eastAsia="Times New Roman" w:hAnsi="Times New Roman" w:cs="Times New Roman"/>
-          <w:color w:val="000000"/>
-          <w:kern w:val="0"/>
-          <w:sz w:val="32"/>
-          <w:szCs w:val="32"/>
-          <w:lang w:eastAsia="en-CA"/>
-          <w14:ligatures w14:val="none"/>
-        </w:rPr>
-        <w:br/>
-        <w:t>Risk-return scatter plots.</w:t>
-      </w:r>
-    </w:p>
-    <w:p>
-      <w:pPr>
-        <w:spacing w:after="200" w:line="276" w:lineRule="auto"/>
-        <w:rPr>
-          <w:rFonts w:ascii="Times New Roman" w:eastAsia="Times New Roman" w:hAnsi="Times New Roman" w:cs="Times New Roman"/>
-          <w:color w:val="000000"/>
-          <w:kern w:val="0"/>
-          <w:sz w:val="32"/>
-          <w:szCs w:val="32"/>
-          <w:lang w:eastAsia="en-CA"/>
-          <w14:ligatures w14:val="none"/>
-        </w:rPr>
-      </w:pPr>
-    </w:p>
-    <w:p>
-      <w:pPr>
-        <w:spacing w:after="200" w:line="276" w:lineRule="auto"/>
-        <w:rPr>
-          <w:rFonts w:ascii="Times New Roman" w:eastAsia="Times New Roman" w:hAnsi="Times New Roman" w:cs="Times New Roman"/>
-          <w:color w:val="000000"/>
-          <w:kern w:val="0"/>
-          <w:sz w:val="32"/>
-          <w:szCs w:val="32"/>
-          <w:lang w:eastAsia="en-CA"/>
-          <w14:ligatures w14:val="none"/>
-        </w:rPr>
-      </w:pPr>
-    </w:p>
-    <w:p>
-      <w:pPr>
-        <w:spacing w:after="200" w:line="276" w:lineRule="auto"/>
-        <w:rPr>
-          <w:rFonts w:ascii="Aptos Narrow" w:eastAsia="Times New Roman" w:hAnsi="Aptos Narrow" w:cs="Times New Roman"/>
-          <w:b/>
-          <w:bCs/>
-          <w:color w:val="000000"/>
-          <w:kern w:val="0"/>
-          <w:sz w:val="22"/>
-          <w:szCs w:val="22"/>
-          <w:lang w:eastAsia="en-CA"/>
-          <w14:ligatures w14:val="none"/>
-        </w:rPr>
-      </w:pPr>
-      <w:r>
-        <w:rPr>
-          <w:rFonts w:ascii="Times New Roman" w:eastAsia="Times New Roman" w:hAnsi="Times New Roman" w:cs="Times New Roman"/>
-          <w:b/>
-          <w:bCs/>
-          <w:color w:val="000000"/>
-          <w:kern w:val="0"/>
-          <w:sz w:val="32"/>
-          <w:szCs w:val="32"/>
-          <w:lang w:eastAsia="en-CA"/>
-          <w14:ligatures w14:val="none"/>
-        </w:rPr>
-        <w:t>7 Design wireframes and pipelines: @ Jeffin Kochurani Ravi</w:t>
-      </w:r>
-    </w:p>
-    <w:p>
-      <w:pPr>
         <w:spacing w:after="162" w:line="360" w:lineRule="auto"/>
         <w:ind w:left="20" w:right="60" w:hanging="10"/>
         <w:rPr>
@@ -4611,22 +4700,54 @@
           <w14:ligatures w14:val="none"/>
         </w:rPr>
       </w:pPr>
-    </w:p>
-    <w:p>
-      <w:pPr>
-        <w:spacing w:after="162" w:line="360" w:lineRule="auto"/>
-        <w:ind w:left="20" w:right="60" w:hanging="10"/>
-        <w:rPr>
-          <w:rFonts w:ascii="Times New Roman" w:eastAsia="Times New Roman" w:hAnsi="Times New Roman" w:cs="Times New Roman"/>
-          <w:bCs/>
-          <w:color w:val="000000"/>
-          <w:kern w:val="0"/>
-          <w:sz w:val="32"/>
-          <w:szCs w:val="32"/>
-          <w:lang w:val="en-US"/>
-          <w14:ligatures w14:val="none"/>
-        </w:rPr>
-      </w:pPr>
+      <w:r>
+        <w:rPr>
+          <w:rFonts w:ascii="Times New Roman" w:eastAsia="Times New Roman" w:hAnsi="Times New Roman" w:cs="Times New Roman"/>
+          <w:bCs/>
+          <w:color w:val="000000"/>
+          <w:kern w:val="0"/>
+          <w:sz w:val="32"/>
+          <w:szCs w:val="32"/>
+          <w:lang w:val="en-US"/>
+          <w14:ligatures w14:val="none"/>
+        </w:rPr>
+        <w:lastRenderedPageBreak/>
+        <w:drawing>
+          <wp:inline distT="0" distB="0" distL="0" distR="0" wp14:anchorId="31F97C4A" wp14:editId="7AFFB41A">
+            <wp:extent cx="5943600" cy="2768600"/>
+            <wp:effectExtent l="0" t="0" r="0" b="0"/>
+            <wp:docPr id="38859966" name="Picture 1" descr="A diagram of a model&#10;&#10;Description automatically generated"/>
+            <wp:cNvGraphicFramePr>
+              <a:graphicFrameLocks xmlns:a="http://schemas.openxmlformats.org/drawingml/2006/main" noChangeAspect="1"/>
+            </wp:cNvGraphicFramePr>
+            <a:graphic xmlns:a="http://schemas.openxmlformats.org/drawingml/2006/main">
+              <a:graphicData uri="http://schemas.openxmlformats.org/drawingml/2006/picture">
+                <pic:pic xmlns:pic="http://schemas.openxmlformats.org/drawingml/2006/picture">
+                  <pic:nvPicPr>
+                    <pic:cNvPr id="38859966" name="Picture 1" descr="A diagram of a model&#10;&#10;Description automatically generated"/>
+                    <pic:cNvPicPr/>
+                  </pic:nvPicPr>
+                  <pic:blipFill>
+                    <a:blip r:embed="rId9"/>
+                    <a:stretch>
+                      <a:fillRect/>
+                    </a:stretch>
+                  </pic:blipFill>
+                  <pic:spPr>
+                    <a:xfrm>
+                      <a:off x="0" y="0"/>
+                      <a:ext cx="5943600" cy="2768600"/>
+                    </a:xfrm>
+                    <a:prstGeom prst="rect">
+                      <a:avLst/>
+                    </a:prstGeom>
+                  </pic:spPr>
+                </pic:pic>
+              </a:graphicData>
+            </a:graphic>
+          </wp:inline>
+        </w:drawing>
+      </w:r>
     </w:p>
     <w:p>
       <w:pPr>
@@ -4802,7 +4923,7 @@
       <w:r>
         <w:t xml:space="preserve">Investopedia. “What Is Portfolio Management?” [Online]. Available: </w:t>
       </w:r>
-      <w:hyperlink r:id="rId7" w:tgtFrame="_new" w:history="1">
+      <w:hyperlink r:id="rId10" w:tgtFrame="_new" w:history="1">
         <w:r>
           <w:rPr>
             <w:rStyle w:val="Hyperlink"/>
@@ -4831,7 +4952,7 @@
       <w:r>
         <w:t xml:space="preserve">Groww. “Portfolio Management Overview.” [Online]. Available: </w:t>
       </w:r>
-      <w:hyperlink r:id="rId8" w:tgtFrame="_new" w:history="1">
+      <w:hyperlink r:id="rId11" w:tgtFrame="_new" w:history="1">
         <w:r>
           <w:rPr>
             <w:rStyle w:val="Hyperlink"/>

</xml_diff>

<commit_message>
adding the flowchart to the project proposal
</commit_message>
<xml_diff>
--- a/doc/PROJECT REPORT - PROJECT PROPOSAL.docx
+++ b/doc/PROJECT REPORT - PROJECT PROPOSAL.docx
@@ -1349,27 +1349,7 @@
                 <w:lang w:eastAsia="en-CA"/>
                 <w14:ligatures w14:val="none"/>
               </w:rPr>
-              <w:t>Black-</w:t>
-            </w:r>
-            <w:proofErr w:type="spellStart"/>
-            <w:r>
-              <w:rPr>
-                <w:rFonts w:ascii="Times New Roman" w:eastAsia="Times New Roman" w:hAnsi="Times New Roman" w:cs="Times New Roman"/>
-                <w:kern w:val="0"/>
-                <w:lang w:eastAsia="en-CA"/>
-                <w14:ligatures w14:val="none"/>
-              </w:rPr>
-              <w:t>Litterman</w:t>
-            </w:r>
-            <w:proofErr w:type="spellEnd"/>
-            <w:r>
-              <w:rPr>
-                <w:rFonts w:ascii="Times New Roman" w:eastAsia="Times New Roman" w:hAnsi="Times New Roman" w:cs="Times New Roman"/>
-                <w:kern w:val="0"/>
-                <w:lang w:eastAsia="en-CA"/>
-                <w14:ligatures w14:val="none"/>
-              </w:rPr>
-              <w:t xml:space="preserve"> Model</w:t>
+              <w:t>Black-Litterman Model</w:t>
             </w:r>
           </w:p>
         </w:tc>
@@ -2151,15 +2131,7 @@
         <w:t>Risk-Reward Balancing:</w:t>
       </w:r>
       <w:r>
-        <w:t xml:space="preserve"> RL models use custom reward functions to prioritize risk-adjusted returns, considering metrics like Value-at-Risk (</w:t>
-      </w:r>
-      <w:proofErr w:type="spellStart"/>
-      <w:r>
-        <w:t>VaR</w:t>
-      </w:r>
-      <w:proofErr w:type="spellEnd"/>
-      <w:r>
-        <w:t>) and Conditional Value-at-Risk (CVaR).</w:t>
+        <w:t xml:space="preserve"> RL models use custom reward functions to prioritize risk-adjusted returns, considering metrics like Value-at-Risk (VaR) and Conditional Value-at-Risk (CVaR).</w:t>
       </w:r>
     </w:p>
     <w:p>
@@ -3117,23 +3089,8 @@
           <w14:ligatures w14:val="none"/>
         </w:rPr>
         <w:lastRenderedPageBreak/>
-        <w:t xml:space="preserve">1.2 Create visual aids @ Abhishek </w:t>
-      </w:r>
-      <w:proofErr w:type="spellStart"/>
-      <w:r>
-        <w:rPr>
-          <w:rFonts w:ascii="Times New Roman" w:eastAsia="Times New Roman" w:hAnsi="Times New Roman" w:cs="Times New Roman"/>
-          <w:b/>
-          <w:color w:val="000000"/>
-          <w:kern w:val="0"/>
-          <w:sz w:val="32"/>
-          <w:szCs w:val="32"/>
-          <w:lang w:val="en-US"/>
-          <w14:ligatures w14:val="none"/>
-        </w:rPr>
-        <w:t>Mungath</w:t>
-      </w:r>
-      <w:proofErr w:type="spellEnd"/>
+        <w:t>1.2 Create visual aids @ Abhishek Mungath</w:t>
+      </w:r>
     </w:p>
     <w:p>
       <w:pPr>
@@ -3294,53 +3251,68 @@
         <w:ind w:right="60"/>
         <w:rPr>
           <w:rFonts w:ascii="Times New Roman" w:eastAsia="Times New Roman" w:hAnsi="Times New Roman" w:cs="Times New Roman"/>
-          <w:bCs/>
-          <w:color w:val="000000"/>
-          <w:kern w:val="0"/>
-          <w:sz w:val="32"/>
-          <w:szCs w:val="32"/>
-          <w:lang w:val="en-US"/>
-          <w14:ligatures w14:val="none"/>
-        </w:rPr>
-      </w:pPr>
-      <w:r>
-        <w:rPr>
-          <w:rFonts w:ascii="Times New Roman" w:eastAsia="Times New Roman" w:hAnsi="Times New Roman" w:cs="Times New Roman"/>
-          <w:bCs/>
-          <w:color w:val="000000"/>
-          <w:kern w:val="0"/>
-          <w:sz w:val="32"/>
-          <w:szCs w:val="32"/>
-          <w:lang w:val="en-US"/>
-          <w14:ligatures w14:val="none"/>
-        </w:rPr>
-        <w:t>Answer here:</w:t>
-      </w:r>
-      <w:r>
-        <w:rPr>
-          <w:rFonts w:ascii="Times New Roman" w:eastAsia="Times New Roman" w:hAnsi="Times New Roman" w:cs="Times New Roman"/>
-          <w:bCs/>
-          <w:color w:val="000000"/>
-          <w:kern w:val="0"/>
-          <w:sz w:val="32"/>
-          <w:szCs w:val="32"/>
-          <w:lang w:val="en-US"/>
-          <w14:ligatures w14:val="none"/>
-        </w:rPr>
-        <w:sym w:font="Wingdings" w:char="F0E0"/>
-      </w:r>
-      <w:r>
-        <w:rPr>
-          <w:rFonts w:ascii="Times New Roman" w:eastAsia="Times New Roman" w:hAnsi="Times New Roman" w:cs="Times New Roman"/>
-          <w:bCs/>
-          <w:color w:val="000000"/>
-          <w:kern w:val="0"/>
-          <w:sz w:val="32"/>
-          <w:szCs w:val="32"/>
-          <w:lang w:val="en-US"/>
-          <w14:ligatures w14:val="none"/>
-        </w:rPr>
-        <w:t xml:space="preserve"> flowchart</w:t>
+          <w:b/>
+          <w:color w:val="000000"/>
+          <w:kern w:val="0"/>
+          <w:sz w:val="32"/>
+          <w:szCs w:val="32"/>
+          <w:lang w:val="en-US"/>
+          <w14:ligatures w14:val="none"/>
+        </w:rPr>
+      </w:pPr>
+      <w:r>
+        <w:rPr>
+          <w:noProof/>
+        </w:rPr>
+        <w:lastRenderedPageBreak/>
+        <w:drawing>
+          <wp:inline distT="0" distB="0" distL="0" distR="0" wp14:anchorId="2C928CE2" wp14:editId="0D0D3383">
+            <wp:extent cx="5943600" cy="4457700"/>
+            <wp:effectExtent l="0" t="0" r="0" b="0"/>
+            <wp:docPr id="1899796644" name="Picture 1"/>
+            <wp:cNvGraphicFramePr>
+              <a:graphicFrameLocks xmlns:a="http://schemas.openxmlformats.org/drawingml/2006/main" noChangeAspect="1"/>
+            </wp:cNvGraphicFramePr>
+            <a:graphic xmlns:a="http://schemas.openxmlformats.org/drawingml/2006/main">
+              <a:graphicData uri="http://schemas.openxmlformats.org/drawingml/2006/picture">
+                <pic:pic xmlns:pic="http://schemas.openxmlformats.org/drawingml/2006/picture">
+                  <pic:nvPicPr>
+                    <pic:cNvPr id="0" name="Picture 1"/>
+                    <pic:cNvPicPr>
+                      <a:picLocks noChangeAspect="1" noChangeArrowheads="1"/>
+                    </pic:cNvPicPr>
+                  </pic:nvPicPr>
+                  <pic:blipFill>
+                    <a:blip r:embed="rId7">
+                      <a:extLst>
+                        <a:ext uri="{28A0092B-C50C-407E-A947-70E740481C1C}">
+                          <a14:useLocalDpi xmlns:a14="http://schemas.microsoft.com/office/drawing/2010/main" val="0"/>
+                        </a:ext>
+                      </a:extLst>
+                    </a:blip>
+                    <a:srcRect/>
+                    <a:stretch>
+                      <a:fillRect/>
+                    </a:stretch>
+                  </pic:blipFill>
+                  <pic:spPr bwMode="auto">
+                    <a:xfrm>
+                      <a:off x="0" y="0"/>
+                      <a:ext cx="5943600" cy="4457700"/>
+                    </a:xfrm>
+                    <a:prstGeom prst="rect">
+                      <a:avLst/>
+                    </a:prstGeom>
+                    <a:noFill/>
+                    <a:ln>
+                      <a:noFill/>
+                    </a:ln>
+                  </pic:spPr>
+                </pic:pic>
+              </a:graphicData>
+            </a:graphic>
+          </wp:inline>
+        </w:drawing>
       </w:r>
     </w:p>
     <w:p>
@@ -3374,6 +3346,19 @@
           <w14:ligatures w14:val="none"/>
         </w:rPr>
       </w:pPr>
+      <w:r>
+        <w:rPr>
+          <w:rFonts w:ascii="Times New Roman" w:eastAsia="Times New Roman" w:hAnsi="Times New Roman" w:cs="Times New Roman"/>
+          <w:b/>
+          <w:color w:val="000000"/>
+          <w:kern w:val="0"/>
+          <w:sz w:val="32"/>
+          <w:szCs w:val="32"/>
+          <w:lang w:val="en-US"/>
+          <w14:ligatures w14:val="none"/>
+        </w:rPr>
+        <w:t>2. Defining the Problem @Tarun Samuel</w:t>
+      </w:r>
     </w:p>
     <w:p>
       <w:pPr>
@@ -3381,56 +3366,26 @@
         <w:ind w:right="60"/>
         <w:rPr>
           <w:rFonts w:ascii="Times New Roman" w:eastAsia="Times New Roman" w:hAnsi="Times New Roman" w:cs="Times New Roman"/>
-          <w:b/>
-          <w:color w:val="000000"/>
-          <w:kern w:val="0"/>
-          <w:sz w:val="32"/>
-          <w:szCs w:val="32"/>
-          <w:lang w:val="en-US"/>
-          <w14:ligatures w14:val="none"/>
-        </w:rPr>
-      </w:pPr>
-      <w:r>
-        <w:rPr>
-          <w:rFonts w:ascii="Times New Roman" w:eastAsia="Times New Roman" w:hAnsi="Times New Roman" w:cs="Times New Roman"/>
-          <w:b/>
-          <w:color w:val="000000"/>
-          <w:kern w:val="0"/>
-          <w:sz w:val="32"/>
-          <w:szCs w:val="32"/>
-          <w:lang w:val="en-US"/>
-          <w14:ligatures w14:val="none"/>
-        </w:rPr>
-        <w:t>2. Defining the Problem @Tarun Samuel</w:t>
-      </w:r>
-    </w:p>
-    <w:p>
-      <w:pPr>
-        <w:spacing w:after="162" w:line="360" w:lineRule="auto"/>
-        <w:ind w:right="60"/>
-        <w:rPr>
-          <w:rFonts w:ascii="Times New Roman" w:eastAsia="Times New Roman" w:hAnsi="Times New Roman" w:cs="Times New Roman"/>
-          <w:bCs/>
-          <w:color w:val="000000"/>
-          <w:kern w:val="0"/>
-          <w:sz w:val="32"/>
-          <w:szCs w:val="32"/>
-          <w:lang w:val="en-US"/>
-          <w14:ligatures w14:val="none"/>
-        </w:rPr>
-      </w:pPr>
-      <w:r>
-        <w:rPr>
-          <w:rFonts w:ascii="Times New Roman" w:eastAsia="Times New Roman" w:hAnsi="Times New Roman" w:cs="Times New Roman"/>
-          <w:bCs/>
-          <w:color w:val="000000"/>
-          <w:kern w:val="0"/>
-          <w:sz w:val="32"/>
-          <w:szCs w:val="32"/>
-          <w:lang w:val="en-US"/>
-          <w14:ligatures w14:val="none"/>
-        </w:rPr>
-        <w:lastRenderedPageBreak/>
+          <w:bCs/>
+          <w:color w:val="000000"/>
+          <w:kern w:val="0"/>
+          <w:sz w:val="32"/>
+          <w:szCs w:val="32"/>
+          <w:lang w:val="en-US"/>
+          <w14:ligatures w14:val="none"/>
+        </w:rPr>
+      </w:pPr>
+      <w:r>
+        <w:rPr>
+          <w:rFonts w:ascii="Times New Roman" w:eastAsia="Times New Roman" w:hAnsi="Times New Roman" w:cs="Times New Roman"/>
+          <w:bCs/>
+          <w:color w:val="000000"/>
+          <w:kern w:val="0"/>
+          <w:sz w:val="32"/>
+          <w:szCs w:val="32"/>
+          <w:lang w:val="en-US"/>
+          <w14:ligatures w14:val="none"/>
+        </w:rPr>
         <w:t>Focus on challenges investors face with traditional portfolio allocation methods.</w:t>
       </w:r>
     </w:p>
@@ -3653,7 +3608,7 @@
         </w:rPr>
         <w:t>Modern Portfolio Theory, introduced by American economist Harry Markowitz in his paper </w:t>
       </w:r>
-      <w:hyperlink r:id="rId7" w:tgtFrame="_blank" w:history="1">
+      <w:hyperlink r:id="rId8" w:tgtFrame="_blank" w:history="1">
         <w:r>
           <w:rPr>
             <w:rStyle w:val="Hyperlink"/>
@@ -3727,12 +3682,6 @@
           <w:rFonts w:ascii="Times New Roman" w:hAnsi="Times New Roman" w:cs="Times New Roman"/>
         </w:rPr>
         <w:br/>
-      </w:r>
-      <w:r>
-        <w:rPr>
-          <w:rFonts w:ascii="Times New Roman" w:hAnsi="Times New Roman" w:cs="Times New Roman"/>
-        </w:rPr>
-        <w:lastRenderedPageBreak/>
         <w:t>3. Covariance: The measure of how two assets move in relation to each other</w:t>
       </w:r>
       <w:r>
@@ -3972,87 +3921,20 @@
           <w:b/>
           <w:bCs/>
         </w:rPr>
-        <w:t>The Black-</w:t>
-      </w:r>
-      <w:proofErr w:type="spellStart"/>
-      <w:r>
-        <w:rPr>
-          <w:rFonts w:ascii="Times New Roman" w:hAnsi="Times New Roman" w:cs="Times New Roman"/>
-          <w:b/>
-          <w:bCs/>
-        </w:rPr>
-        <w:t>Litterman</w:t>
-      </w:r>
-      <w:proofErr w:type="spellEnd"/>
-      <w:r>
-        <w:rPr>
-          <w:rFonts w:ascii="Times New Roman" w:hAnsi="Times New Roman" w:cs="Times New Roman"/>
-          <w:b/>
-          <w:bCs/>
-        </w:rPr>
-        <w:t xml:space="preserve"> Approach</w:t>
-      </w:r>
-    </w:p>
-    <w:p>
-      <w:pPr>
-        <w:rPr>
-          <w:rFonts w:ascii="Times New Roman" w:hAnsi="Times New Roman" w:cs="Times New Roman"/>
-        </w:rPr>
-      </w:pPr>
-      <w:r>
-        <w:rPr>
-          <w:rFonts w:ascii="Times New Roman" w:hAnsi="Times New Roman" w:cs="Times New Roman"/>
-        </w:rPr>
-        <w:t>The Black-</w:t>
-      </w:r>
-      <w:proofErr w:type="spellStart"/>
-      <w:r>
-        <w:rPr>
-          <w:rFonts w:ascii="Times New Roman" w:hAnsi="Times New Roman" w:cs="Times New Roman"/>
-        </w:rPr>
-        <w:t>Litterman</w:t>
-      </w:r>
-      <w:proofErr w:type="spellEnd"/>
-      <w:r>
-        <w:rPr>
-          <w:rFonts w:ascii="Times New Roman" w:hAnsi="Times New Roman" w:cs="Times New Roman"/>
-        </w:rPr>
-        <w:t xml:space="preserve"> model was developed to address these issues by reversing the MVO process. In contrast to starting with expected returns and deriving the optimal portfolio, Black-</w:t>
-      </w:r>
-      <w:proofErr w:type="spellStart"/>
-      <w:r>
-        <w:rPr>
-          <w:rFonts w:ascii="Times New Roman" w:hAnsi="Times New Roman" w:cs="Times New Roman"/>
-        </w:rPr>
-        <w:t>Litterman</w:t>
-      </w:r>
-      <w:proofErr w:type="spellEnd"/>
-      <w:r>
-        <w:rPr>
-          <w:rFonts w:ascii="Times New Roman" w:hAnsi="Times New Roman" w:cs="Times New Roman"/>
-        </w:rPr>
-        <w:t xml:space="preserve"> begins with a neutral portfolio — typically a market cap-weighted portfolio — and adjusts expected returns and covariances based on investors’ views. It enforces a sophisticated </w:t>
-      </w:r>
-      <w:r>
-        <w:rPr>
-          <w:rFonts w:ascii="Times New Roman" w:hAnsi="Times New Roman" w:cs="Times New Roman"/>
-        </w:rPr>
-        <w:lastRenderedPageBreak/>
-        <w:t>portfolio construction method that overcomes the problem of unintuitive, highly-concentrated portfolios, input sensitivity, and estimation error maximization, which are known shortcomings of mean-variance optimization. A Black-</w:t>
-      </w:r>
-      <w:proofErr w:type="spellStart"/>
-      <w:r>
-        <w:rPr>
-          <w:rFonts w:ascii="Times New Roman" w:hAnsi="Times New Roman" w:cs="Times New Roman"/>
-        </w:rPr>
-        <w:t>Litterman</w:t>
-      </w:r>
-      <w:proofErr w:type="spellEnd"/>
-      <w:r>
-        <w:rPr>
-          <w:rFonts w:ascii="Times New Roman" w:hAnsi="Times New Roman" w:cs="Times New Roman"/>
-        </w:rPr>
-        <w:t xml:space="preserve"> model calculates stable expected returns which are fed into a Mean-Variance Optimizer, which uses the returns in conjunction with different risk predictions and measures to calculate a robust portfolio.</w:t>
+        <w:t>The Black-Litterman Approach</w:t>
+      </w:r>
+    </w:p>
+    <w:p>
+      <w:pPr>
+        <w:rPr>
+          <w:rFonts w:ascii="Times New Roman" w:hAnsi="Times New Roman" w:cs="Times New Roman"/>
+        </w:rPr>
+      </w:pPr>
+      <w:r>
+        <w:rPr>
+          <w:rFonts w:ascii="Times New Roman" w:hAnsi="Times New Roman" w:cs="Times New Roman"/>
+        </w:rPr>
+        <w:t>The Black-Litterman model was developed to address these issues by reversing the MVO process. In contrast to starting with expected returns and deriving the optimal portfolio, Black-Litterman begins with a neutral portfolio — typically a market cap-weighted portfolio — and adjusts expected returns and covariances based on investors’ views. It enforces a sophisticated portfolio construction method that overcomes the problem of unintuitive, highly-concentrated portfolios, input sensitivity, and estimation error maximization, which are known shortcomings of mean-variance optimization. A Black-Litterman model calculates stable expected returns which are fed into a Mean-Variance Optimizer, which uses the returns in conjunction with different risk predictions and measures to calculate a robust portfolio.</w:t>
       </w:r>
     </w:p>
     <w:p>
@@ -4141,6 +4023,7 @@
         <w:rPr>
           <w:rFonts w:ascii="Times New Roman" w:hAnsi="Times New Roman" w:cs="Times New Roman"/>
         </w:rPr>
+        <w:lastRenderedPageBreak/>
         <w:t> With the model starting from the equilibrium portfolio and making small adjustments based on the investor’s views, the model is less likely to suggest extreme positions for the portfolio.</w:t>
       </w:r>
     </w:p>
@@ -4322,7 +4205,7 @@
           <w:rFonts w:ascii="Times New Roman" w:hAnsi="Times New Roman" w:cs="Times New Roman"/>
         </w:rPr>
       </w:pPr>
-      <w:hyperlink r:id="rId8" w:history="1">
+      <w:hyperlink r:id="rId9" w:history="1">
         <w:r>
           <w:rPr>
             <w:rStyle w:val="Hyperlink"/>
@@ -4384,7 +4267,6 @@
         <w:rPr>
           <w:rFonts w:ascii="Times New Roman" w:hAnsi="Times New Roman" w:cs="Times New Roman"/>
         </w:rPr>
-        <w:lastRenderedPageBreak/>
         <w:t xml:space="preserve"> Requires accurate and consistent volatility estimates, which may not always hold in volatile markets.</w:t>
       </w:r>
     </w:p>
@@ -4458,6 +4340,7 @@
         <w:rPr>
           <w:rFonts w:ascii="Times New Roman" w:hAnsi="Times New Roman" w:cs="Times New Roman"/>
         </w:rPr>
+        <w:lastRenderedPageBreak/>
         <w:t>Limitations:</w:t>
       </w:r>
     </w:p>
@@ -4684,7 +4567,6 @@
           <w:b/>
           <w:bCs/>
         </w:rPr>
-        <w:lastRenderedPageBreak/>
         <w:t>Sector-Specific Risks:</w:t>
       </w:r>
       <w:r>
@@ -4782,7 +4664,14 @@
         <w:rPr>
           <w:rFonts w:ascii="Times New Roman" w:hAnsi="Times New Roman" w:cs="Times New Roman"/>
         </w:rPr>
-        <w:t>Principal component analysis (PCA) is a dimensionality reduction technique that can be used to identify the main sources of variation in a dataset, such as asset returns. By transforming the original variables into a smaller set of uncorrelated principal components, PCA can help simplify portfolio optimization problems and improve estimation accuracy. Principal component-based methods can be particularly useful for large, high-dimensional datasets, where traditional optimization techniques may struggle with estimation errors and overfitting. By incorporating PCA into the portfolio optimization process, traders/investors can better understand the underlying drivers of asset returns and construct more efficient portfolios.</w:t>
+        <w:t xml:space="preserve">Principal component analysis (PCA) is a dimensionality reduction technique that can be used to identify the main sources of variation in a dataset, such as asset returns. By transforming the original variables into a smaller set of uncorrelated principal components, PCA can help simplify portfolio optimization problems and improve estimation accuracy. Principal component-based methods can be particularly useful for large, high-dimensional datasets, where traditional </w:t>
+      </w:r>
+      <w:r>
+        <w:rPr>
+          <w:rFonts w:ascii="Times New Roman" w:hAnsi="Times New Roman" w:cs="Times New Roman"/>
+        </w:rPr>
+        <w:lastRenderedPageBreak/>
+        <w:t>optimization techniques may struggle with estimation errors and overfitting. By incorporating PCA into the portfolio optimization process, traders/investors can better understand the underlying drivers of asset returns and construct more efficient portfolios.</w:t>
       </w:r>
     </w:p>
     <w:p>
@@ -4998,7 +4887,6 @@
           <w:b/>
           <w:bCs/>
         </w:rPr>
-        <w:lastRenderedPageBreak/>
         <w:t>Graphical Representation:</w:t>
       </w:r>
       <w:r>
@@ -5127,6 +5015,7 @@
           <w:b/>
           <w:bCs/>
         </w:rPr>
+        <w:lastRenderedPageBreak/>
         <w:t>Computational Intensity:</w:t>
       </w:r>
       <w:r>
@@ -5557,19 +5446,8 @@
                 <w:sz w:val="22"/>
                 <w:szCs w:val="22"/>
               </w:rPr>
-              <w:lastRenderedPageBreak/>
-              <w:t>Black-</w:t>
+              <w:t>Black-Litterman</w:t>
             </w:r>
-            <w:proofErr w:type="spellStart"/>
-            <w:r>
-              <w:rPr>
-                <w:rFonts w:ascii="Times New Roman" w:hAnsi="Times New Roman" w:cs="Times New Roman"/>
-                <w:sz w:val="22"/>
-                <w:szCs w:val="22"/>
-              </w:rPr>
-              <w:t>Litterman</w:t>
-            </w:r>
-            <w:proofErr w:type="spellEnd"/>
           </w:p>
         </w:tc>
         <w:tc>
@@ -5880,6 +5758,7 @@
                 <w:sz w:val="22"/>
                 <w:szCs w:val="22"/>
               </w:rPr>
+              <w:lastRenderedPageBreak/>
               <w:t>Hierarchical Risk Parity</w:t>
             </w:r>
           </w:p>
@@ -6357,7 +6236,6 @@
           <w:lang w:val="en-US"/>
           <w14:ligatures w14:val="none"/>
         </w:rPr>
-        <w:lastRenderedPageBreak/>
         <w:t>1.Differentiates your solution from competitors.</w:t>
       </w:r>
     </w:p>
@@ -6548,79 +6426,8 @@
           <w:lang w:val="en-US"/>
           <w14:ligatures w14:val="none"/>
         </w:rPr>
-        <w:t xml:space="preserve">4 Data Gathering and Insights @ </w:t>
-      </w:r>
-      <w:proofErr w:type="spellStart"/>
-      <w:r>
-        <w:rPr>
-          <w:rFonts w:ascii="Times New Roman" w:eastAsia="Times New Roman" w:hAnsi="Times New Roman" w:cs="Times New Roman"/>
-          <w:b/>
-          <w:color w:val="000000"/>
-          <w:kern w:val="0"/>
-          <w:sz w:val="32"/>
-          <w:szCs w:val="32"/>
-          <w:lang w:val="en-US"/>
-          <w14:ligatures w14:val="none"/>
-        </w:rPr>
-        <w:t>Rajkaran</w:t>
-      </w:r>
-      <w:proofErr w:type="spellEnd"/>
-      <w:r>
-        <w:rPr>
-          <w:rFonts w:ascii="Times New Roman" w:eastAsia="Times New Roman" w:hAnsi="Times New Roman" w:cs="Times New Roman"/>
-          <w:b/>
-          <w:color w:val="000000"/>
-          <w:kern w:val="0"/>
-          <w:sz w:val="32"/>
-          <w:szCs w:val="32"/>
-          <w:lang w:val="en-US"/>
-          <w14:ligatures w14:val="none"/>
-        </w:rPr>
-        <w:t xml:space="preserve"> </w:t>
-      </w:r>
-      <w:proofErr w:type="spellStart"/>
-      <w:r>
-        <w:rPr>
-          <w:rFonts w:ascii="Times New Roman" w:eastAsia="Times New Roman" w:hAnsi="Times New Roman" w:cs="Times New Roman"/>
-          <w:b/>
-          <w:color w:val="000000"/>
-          <w:kern w:val="0"/>
-          <w:sz w:val="32"/>
-          <w:szCs w:val="32"/>
-          <w:lang w:val="en-US"/>
-          <w14:ligatures w14:val="none"/>
-        </w:rPr>
-        <w:t>Yasodhadevi</w:t>
-      </w:r>
-      <w:proofErr w:type="spellEnd"/>
-      <w:r>
-        <w:rPr>
-          <w:rFonts w:ascii="Times New Roman" w:eastAsia="Times New Roman" w:hAnsi="Times New Roman" w:cs="Times New Roman"/>
-          <w:b/>
-          <w:color w:val="000000"/>
-          <w:kern w:val="0"/>
-          <w:sz w:val="32"/>
-          <w:szCs w:val="32"/>
-          <w:lang w:val="en-US"/>
-          <w14:ligatures w14:val="none"/>
-        </w:rPr>
-        <w:t xml:space="preserve"> </w:t>
-      </w:r>
-      <w:proofErr w:type="spellStart"/>
-      <w:r>
-        <w:rPr>
-          <w:rFonts w:ascii="Times New Roman" w:eastAsia="Times New Roman" w:hAnsi="Times New Roman" w:cs="Times New Roman"/>
-          <w:b/>
-          <w:color w:val="000000"/>
-          <w:kern w:val="0"/>
-          <w:sz w:val="32"/>
-          <w:szCs w:val="32"/>
-          <w:lang w:val="en-US"/>
-          <w14:ligatures w14:val="none"/>
-        </w:rPr>
-        <w:t>Ponnuvelusamy</w:t>
-      </w:r>
-      <w:proofErr w:type="spellEnd"/>
+        <w:t>4 Data Gathering and Insights @ Rajkaran Yasodhadevi Ponnuvelusamy</w:t>
+      </w:r>
     </w:p>
     <w:p>
       <w:pPr>
@@ -6648,35 +6455,7 @@
           <w:lang w:val="en-US"/>
           <w14:ligatures w14:val="none"/>
         </w:rPr>
-        <w:t xml:space="preserve">    4.1Collect datasets from the given links (</w:t>
-      </w:r>
-      <w:proofErr w:type="spellStart"/>
-      <w:r>
-        <w:rPr>
-          <w:rFonts w:ascii="Times New Roman" w:eastAsia="Times New Roman" w:hAnsi="Times New Roman" w:cs="Times New Roman"/>
-          <w:bCs/>
-          <w:color w:val="000000"/>
-          <w:kern w:val="0"/>
-          <w:sz w:val="32"/>
-          <w:szCs w:val="32"/>
-          <w:lang w:val="en-US"/>
-          <w14:ligatures w14:val="none"/>
-        </w:rPr>
-        <w:t>FinRL</w:t>
-      </w:r>
-      <w:proofErr w:type="spellEnd"/>
-      <w:r>
-        <w:rPr>
-          <w:rFonts w:ascii="Times New Roman" w:eastAsia="Times New Roman" w:hAnsi="Times New Roman" w:cs="Times New Roman"/>
-          <w:bCs/>
-          <w:color w:val="000000"/>
-          <w:kern w:val="0"/>
-          <w:sz w:val="32"/>
-          <w:szCs w:val="32"/>
-          <w:lang w:val="en-US"/>
-          <w14:ligatures w14:val="none"/>
-        </w:rPr>
-        <w:t xml:space="preserve"> GitHub and Yahoo Finance). -</w:t>
+        <w:t xml:space="preserve">    4.1Collect datasets from the given links (FinRL GitHub and Yahoo Finance). -</w:t>
       </w:r>
       <w:r>
         <w:rPr>
@@ -6896,35 +6675,7 @@
           <w:lang w:val="en-US"/>
           <w14:ligatures w14:val="none"/>
         </w:rPr>
-        <w:t xml:space="preserve"> and @Anand </w:t>
-      </w:r>
-      <w:proofErr w:type="spellStart"/>
-      <w:r>
-        <w:rPr>
-          <w:rFonts w:ascii="Times New Roman" w:eastAsia="Times New Roman" w:hAnsi="Times New Roman" w:cs="Times New Roman"/>
-          <w:b/>
-          <w:color w:val="000000"/>
-          <w:kern w:val="0"/>
-          <w:sz w:val="32"/>
-          <w:szCs w:val="32"/>
-          <w:lang w:val="en-US"/>
-          <w14:ligatures w14:val="none"/>
-        </w:rPr>
-        <w:t>Chathananickal</w:t>
-      </w:r>
-      <w:proofErr w:type="spellEnd"/>
-      <w:r>
-        <w:rPr>
-          <w:rFonts w:ascii="Times New Roman" w:eastAsia="Times New Roman" w:hAnsi="Times New Roman" w:cs="Times New Roman"/>
-          <w:b/>
-          <w:color w:val="000000"/>
-          <w:kern w:val="0"/>
-          <w:sz w:val="32"/>
-          <w:szCs w:val="32"/>
-          <w:lang w:val="en-US"/>
-          <w14:ligatures w14:val="none"/>
-        </w:rPr>
-        <w:t xml:space="preserve"> Sajeevan</w:t>
+        <w:t xml:space="preserve"> and @Anand Chathananickal Sajeevan</w:t>
       </w:r>
     </w:p>
     <w:p>
@@ -6981,7 +6732,6 @@
           <w:lang w:val="en-US"/>
           <w14:ligatures w14:val="none"/>
         </w:rPr>
-        <w:lastRenderedPageBreak/>
         <w:t>Use tools like Python, pandas, or NumPy</w:t>
       </w:r>
       <w:r>
@@ -7091,6 +6841,7 @@
           <w:lang w:val="en-US"/>
           <w14:ligatures w14:val="none"/>
         </w:rPr>
+        <w:lastRenderedPageBreak/>
         <w:drawing>
           <wp:inline distT="0" distB="0" distL="0" distR="0" wp14:anchorId="7DF7AB4B" wp14:editId="51C9CBE9">
             <wp:extent cx="5943600" cy="3966845"/>
@@ -7107,7 +6858,7 @@
                     <pic:cNvPicPr/>
                   </pic:nvPicPr>
                   <pic:blipFill>
-                    <a:blip r:embed="rId9"/>
+                    <a:blip r:embed="rId10"/>
                     <a:stretch>
                       <a:fillRect/>
                     </a:stretch>
@@ -7172,7 +6923,7 @@
                     <pic:cNvPicPr/>
                   </pic:nvPicPr>
                   <pic:blipFill>
-                    <a:blip r:embed="rId10"/>
+                    <a:blip r:embed="rId11"/>
                     <a:stretch>
                       <a:fillRect/>
                     </a:stretch>
@@ -7290,10 +7041,12 @@
           <w:lang w:eastAsia="en-CA"/>
           <w14:ligatures w14:val="none"/>
         </w:rPr>
-        <w:t xml:space="preserve">7 Design wireframes: @ </w:t>
-      </w:r>
-      <w:proofErr w:type="spellStart"/>
-      <w:r>
+        <w:t>7 Design wireframes: @ Jeffin Kochurani Ravi</w:t>
+      </w:r>
+    </w:p>
+    <w:p>
+      <w:pPr>
+        <w:spacing w:after="200" w:line="276" w:lineRule="auto"/>
         <w:rPr>
           <w:rFonts w:ascii="Times New Roman" w:eastAsia="Times New Roman" w:hAnsi="Times New Roman" w:cs="Times New Roman"/>
           <w:b/>
@@ -7305,9 +7058,7 @@
           <w:lang w:eastAsia="en-CA"/>
           <w14:ligatures w14:val="none"/>
         </w:rPr>
-        <w:t>Jeffin</w:t>
-      </w:r>
-      <w:proofErr w:type="spellEnd"/>
+      </w:pPr>
       <w:r>
         <w:rPr>
           <w:rFonts w:ascii="Times New Roman" w:eastAsia="Times New Roman" w:hAnsi="Times New Roman" w:cs="Times New Roman"/>
@@ -7320,12 +7071,9 @@
           <w:lang w:eastAsia="en-CA"/>
           <w14:ligatures w14:val="none"/>
         </w:rPr>
-        <w:t xml:space="preserve"> Kochurani Ravi</w:t>
-      </w:r>
-    </w:p>
-    <w:p>
-      <w:pPr>
-        <w:spacing w:after="200" w:line="276" w:lineRule="auto"/>
+        <w:t>8</w:t>
+      </w:r>
+      <w:r>
         <w:rPr>
           <w:rFonts w:ascii="Times New Roman" w:eastAsia="Times New Roman" w:hAnsi="Times New Roman" w:cs="Times New Roman"/>
           <w:b/>
@@ -7337,64 +7085,7 @@
           <w:lang w:eastAsia="en-CA"/>
           <w14:ligatures w14:val="none"/>
         </w:rPr>
-      </w:pPr>
-      <w:r>
-        <w:rPr>
-          <w:rFonts w:ascii="Times New Roman" w:eastAsia="Times New Roman" w:hAnsi="Times New Roman" w:cs="Times New Roman"/>
-          <w:b/>
-          <w:bCs/>
-          <w:color w:val="000000"/>
-          <w:kern w:val="0"/>
-          <w:sz w:val="32"/>
-          <w:szCs w:val="32"/>
-          <w:lang w:eastAsia="en-CA"/>
-          <w14:ligatures w14:val="none"/>
-        </w:rPr>
-        <w:t>8</w:t>
-      </w:r>
-      <w:r>
-        <w:rPr>
-          <w:rFonts w:ascii="Times New Roman" w:eastAsia="Times New Roman" w:hAnsi="Times New Roman" w:cs="Times New Roman"/>
-          <w:b/>
-          <w:bCs/>
-          <w:color w:val="000000"/>
-          <w:kern w:val="0"/>
-          <w:sz w:val="32"/>
-          <w:szCs w:val="32"/>
-          <w:lang w:eastAsia="en-CA"/>
-          <w14:ligatures w14:val="none"/>
-        </w:rPr>
-        <w:t xml:space="preserve"> Big Data Pipeline @ Anand </w:t>
-      </w:r>
-      <w:proofErr w:type="spellStart"/>
-      <w:r>
-        <w:rPr>
-          <w:rFonts w:ascii="Times New Roman" w:eastAsia="Times New Roman" w:hAnsi="Times New Roman" w:cs="Times New Roman"/>
-          <w:b/>
-          <w:bCs/>
-          <w:color w:val="000000"/>
-          <w:kern w:val="0"/>
-          <w:sz w:val="32"/>
-          <w:szCs w:val="32"/>
-          <w:lang w:eastAsia="en-CA"/>
-          <w14:ligatures w14:val="none"/>
-        </w:rPr>
-        <w:t>Chathananickal</w:t>
-      </w:r>
-      <w:proofErr w:type="spellEnd"/>
-      <w:r>
-        <w:rPr>
-          <w:rFonts w:ascii="Times New Roman" w:eastAsia="Times New Roman" w:hAnsi="Times New Roman" w:cs="Times New Roman"/>
-          <w:b/>
-          <w:bCs/>
-          <w:color w:val="000000"/>
-          <w:kern w:val="0"/>
-          <w:sz w:val="32"/>
-          <w:szCs w:val="32"/>
-          <w:lang w:eastAsia="en-CA"/>
-          <w14:ligatures w14:val="none"/>
-        </w:rPr>
-        <w:t xml:space="preserve"> Sajeevan</w:t>
+        <w:t xml:space="preserve"> Big Data Pipeline @ Anand Chathananickal Sajeevan</w:t>
       </w:r>
     </w:p>
     <w:p>
@@ -7473,7 +7164,7 @@
                     <pic:cNvPicPr/>
                   </pic:nvPicPr>
                   <pic:blipFill>
-                    <a:blip r:embed="rId11"/>
+                    <a:blip r:embed="rId12"/>
                     <a:stretch>
                       <a:fillRect/>
                     </a:stretch>
@@ -7668,7 +7359,7 @@
       <w:r>
         <w:t xml:space="preserve">Investopedia. “What Is Portfolio Management?” [Online]. Available: </w:t>
       </w:r>
-      <w:hyperlink r:id="rId12" w:tgtFrame="_new" w:history="1">
+      <w:hyperlink r:id="rId13" w:tgtFrame="_new" w:history="1">
         <w:r>
           <w:rPr>
             <w:rStyle w:val="Hyperlink"/>
@@ -7694,15 +7385,10 @@
           <w14:ligatures w14:val="none"/>
         </w:rPr>
       </w:pPr>
-      <w:proofErr w:type="spellStart"/>
-      <w:r>
-        <w:t>Groww</w:t>
-      </w:r>
-      <w:proofErr w:type="spellEnd"/>
-      <w:r>
-        <w:t xml:space="preserve">. “Portfolio Management Overview.” [Online]. Available: </w:t>
-      </w:r>
-      <w:hyperlink r:id="rId13" w:tgtFrame="_new" w:history="1">
+      <w:r>
+        <w:t xml:space="preserve">Groww. “Portfolio Management Overview.” [Online]. Available: </w:t>
+      </w:r>
+      <w:hyperlink r:id="rId14" w:tgtFrame="_new" w:history="1">
         <w:r>
           <w:rPr>
             <w:rStyle w:val="Hyperlink"/>
@@ -7754,7 +7440,7 @@
           <w:lang w:val="en-US"/>
         </w:rPr>
       </w:pPr>
-      <w:hyperlink r:id="rId14" w:history="1">
+      <w:hyperlink r:id="rId15" w:history="1">
         <w:r>
           <w:rPr>
             <w:rStyle w:val="Hyperlink"/>
@@ -7804,7 +7490,7 @@
           <w:lang w:val="en-US"/>
         </w:rPr>
       </w:pPr>
-      <w:hyperlink r:id="rId15" w:history="1">
+      <w:hyperlink r:id="rId16" w:history="1">
         <w:r>
           <w:rPr>
             <w:rStyle w:val="Hyperlink"/>
@@ -7834,7 +7520,7 @@
           <w:lang w:val="en-US"/>
         </w:rPr>
       </w:pPr>
-      <w:hyperlink r:id="rId16" w:history="1">
+      <w:hyperlink r:id="rId17" w:history="1">
         <w:r>
           <w:rPr>
             <w:rStyle w:val="Hyperlink"/>

</xml_diff>

<commit_message>
Added the code for visulaization for Analysis + Insight drawn from the Analysis.
</commit_message>
<xml_diff>
--- a/doc/PROJECT REPORT - PROJECT PROPOSAL.docx
+++ b/doc/PROJECT REPORT - PROJECT PROPOSAL.docx
@@ -6576,7 +6576,7 @@
     <w:p>
       <w:pPr>
         <w:spacing w:after="162" w:line="360" w:lineRule="auto"/>
-        <w:ind w:left="20" w:right="60" w:hanging="10"/>
+        <w:ind w:right="60"/>
         <w:rPr>
           <w:rFonts w:ascii="Times New Roman" w:eastAsia="Times New Roman" w:hAnsi="Times New Roman" w:cs="Times New Roman"/>
           <w:bCs/>
@@ -6590,22 +6590,620 @@
       </w:pPr>
       <w:r>
         <w:rPr>
-          <w:rFonts w:ascii="Times New Roman" w:eastAsia="Times New Roman" w:hAnsi="Times New Roman" w:cs="Times New Roman"/>
-          <w:bCs/>
+          <w:rFonts w:ascii="Times New Roman" w:hAnsi="Times New Roman" w:cs="Times New Roman"/>
+          <w:b/>
+          <w:bCs/>
+          <w:u w:val="single"/>
+        </w:rPr>
+        <w:t>Analysis and Insights</w:t>
+      </w:r>
+    </w:p>
+    <w:p>
+      <w:pPr>
+        <w:rPr>
+          <w:rFonts w:ascii="Times New Roman" w:hAnsi="Times New Roman" w:cs="Times New Roman"/>
+        </w:rPr>
+      </w:pPr>
+      <w:r>
+        <w:rPr>
+          <w:rFonts w:ascii="Times New Roman" w:hAnsi="Times New Roman" w:cs="Times New Roman"/>
+        </w:rPr>
+        <w:t>Monthly cost price difference – Taken top 6 high valued tickers (highest Volume* Close value) or company to understand the cost price deflection compared to the cost price of the start day.</w:t>
+      </w:r>
+    </w:p>
+    <w:p>
+      <w:pPr>
+        <w:rPr>
+          <w:rFonts w:ascii="Times New Roman" w:hAnsi="Times New Roman" w:cs="Times New Roman"/>
+        </w:rPr>
+      </w:pPr>
+      <w:r>
+        <w:rPr>
+          <w:rFonts w:ascii="Times New Roman" w:hAnsi="Times New Roman" w:cs="Times New Roman"/>
+        </w:rPr>
+        <w:t>Top 6 high valued sectors are:</w:t>
+      </w:r>
+    </w:p>
+    <w:tbl>
+      <w:tblPr>
+        <w:tblStyle w:val="TableGrid"/>
+        <w:tblW w:w="0" w:type="auto"/>
+        <w:tblLayout w:type="fixed"/>
+        <w:tblLook w:val="06A0" w:firstRow="1" w:lastRow="0" w:firstColumn="1" w:lastColumn="0" w:noHBand="1" w:noVBand="1"/>
+      </w:tblPr>
+      <w:tblGrid>
+        <w:gridCol w:w="2254"/>
+        <w:gridCol w:w="2254"/>
+        <w:gridCol w:w="2254"/>
+        <w:gridCol w:w="2254"/>
+      </w:tblGrid>
+      <w:tr>
+        <w:trPr>
+          <w:trHeight w:val="300"/>
+        </w:trPr>
+        <w:tc>
+          <w:tcPr>
+            <w:tcW w:w="2254" w:type="dxa"/>
+            <w:shd w:val="clear" w:color="auto" w:fill="F6C5AC" w:themeFill="accent2" w:themeFillTint="66"/>
+          </w:tcPr>
+          <w:p>
+            <w:pPr>
+              <w:rPr>
+                <w:rFonts w:ascii="Times New Roman" w:hAnsi="Times New Roman" w:cs="Times New Roman"/>
+              </w:rPr>
+            </w:pPr>
+            <w:r>
+              <w:rPr>
+                <w:rFonts w:ascii="Times New Roman" w:hAnsi="Times New Roman" w:cs="Times New Roman"/>
+              </w:rPr>
+              <w:t>Sector</w:t>
+            </w:r>
+          </w:p>
+        </w:tc>
+        <w:tc>
+          <w:tcPr>
+            <w:tcW w:w="2254" w:type="dxa"/>
+            <w:shd w:val="clear" w:color="auto" w:fill="F6C5AC" w:themeFill="accent2" w:themeFillTint="66"/>
+          </w:tcPr>
+          <w:p>
+            <w:pPr>
+              <w:rPr>
+                <w:rFonts w:ascii="Times New Roman" w:hAnsi="Times New Roman" w:cs="Times New Roman"/>
+              </w:rPr>
+            </w:pPr>
+            <w:r>
+              <w:rPr>
+                <w:rFonts w:ascii="Times New Roman" w:hAnsi="Times New Roman" w:cs="Times New Roman"/>
+              </w:rPr>
+              <w:t>Name</w:t>
+            </w:r>
+          </w:p>
+        </w:tc>
+        <w:tc>
+          <w:tcPr>
+            <w:tcW w:w="2254" w:type="dxa"/>
+            <w:shd w:val="clear" w:color="auto" w:fill="F6C5AC" w:themeFill="accent2" w:themeFillTint="66"/>
+          </w:tcPr>
+          <w:p>
+            <w:pPr>
+              <w:rPr>
+                <w:rFonts w:ascii="Times New Roman" w:hAnsi="Times New Roman" w:cs="Times New Roman"/>
+              </w:rPr>
+            </w:pPr>
+            <w:r>
+              <w:rPr>
+                <w:rFonts w:ascii="Times New Roman" w:hAnsi="Times New Roman" w:cs="Times New Roman"/>
+              </w:rPr>
+              <w:t>Sector</w:t>
+            </w:r>
+          </w:p>
+        </w:tc>
+        <w:tc>
+          <w:tcPr>
+            <w:tcW w:w="2254" w:type="dxa"/>
+            <w:shd w:val="clear" w:color="auto" w:fill="F6C5AC" w:themeFill="accent2" w:themeFillTint="66"/>
+          </w:tcPr>
+          <w:p>
+            <w:pPr>
+              <w:rPr>
+                <w:rFonts w:ascii="Times New Roman" w:hAnsi="Times New Roman" w:cs="Times New Roman"/>
+              </w:rPr>
+            </w:pPr>
+            <w:r>
+              <w:rPr>
+                <w:rFonts w:ascii="Times New Roman" w:hAnsi="Times New Roman" w:cs="Times New Roman"/>
+              </w:rPr>
+              <w:t>Industry</w:t>
+            </w:r>
+          </w:p>
+        </w:tc>
+      </w:tr>
+      <w:tr>
+        <w:trPr>
+          <w:trHeight w:val="300"/>
+        </w:trPr>
+        <w:tc>
+          <w:tcPr>
+            <w:tcW w:w="2254" w:type="dxa"/>
+          </w:tcPr>
+          <w:p>
+            <w:pPr>
+              <w:rPr>
+                <w:rFonts w:ascii="Times New Roman" w:hAnsi="Times New Roman" w:cs="Times New Roman"/>
+              </w:rPr>
+            </w:pPr>
+            <w:r>
+              <w:rPr>
+                <w:rFonts w:ascii="Times New Roman" w:hAnsi="Times New Roman" w:cs="Times New Roman"/>
+              </w:rPr>
+              <w:t>CNQ.TO</w:t>
+            </w:r>
+          </w:p>
+        </w:tc>
+        <w:tc>
+          <w:tcPr>
+            <w:tcW w:w="2254" w:type="dxa"/>
+          </w:tcPr>
+          <w:p>
+            <w:pPr>
+              <w:rPr>
+                <w:rFonts w:ascii="Times New Roman" w:hAnsi="Times New Roman" w:cs="Times New Roman"/>
+              </w:rPr>
+            </w:pPr>
+            <w:r>
+              <w:rPr>
+                <w:rFonts w:ascii="Times New Roman" w:hAnsi="Times New Roman" w:cs="Times New Roman"/>
+              </w:rPr>
+              <w:t>CDN NATURAL RES</w:t>
+            </w:r>
+          </w:p>
+        </w:tc>
+        <w:tc>
+          <w:tcPr>
+            <w:tcW w:w="2254" w:type="dxa"/>
+          </w:tcPr>
+          <w:p>
+            <w:pPr>
+              <w:rPr>
+                <w:rFonts w:ascii="Times New Roman" w:hAnsi="Times New Roman" w:cs="Times New Roman"/>
+              </w:rPr>
+            </w:pPr>
+            <w:r>
+              <w:rPr>
+                <w:rFonts w:ascii="Times New Roman" w:hAnsi="Times New Roman" w:cs="Times New Roman"/>
+              </w:rPr>
+              <w:t>Energy</w:t>
+            </w:r>
+          </w:p>
+        </w:tc>
+        <w:tc>
+          <w:tcPr>
+            <w:tcW w:w="2254" w:type="dxa"/>
+          </w:tcPr>
+          <w:p>
+            <w:pPr>
+              <w:rPr>
+                <w:rFonts w:ascii="Times New Roman" w:hAnsi="Times New Roman" w:cs="Times New Roman"/>
+              </w:rPr>
+            </w:pPr>
+            <w:r>
+              <w:rPr>
+                <w:rFonts w:ascii="Times New Roman" w:hAnsi="Times New Roman" w:cs="Times New Roman"/>
+              </w:rPr>
+              <w:t>Oil &amp; Gas E&amp;P</w:t>
+            </w:r>
+          </w:p>
+        </w:tc>
+      </w:tr>
+      <w:tr>
+        <w:trPr>
+          <w:trHeight w:val="300"/>
+        </w:trPr>
+        <w:tc>
+          <w:tcPr>
+            <w:tcW w:w="2254" w:type="dxa"/>
+          </w:tcPr>
+          <w:p>
+            <w:pPr>
+              <w:rPr>
+                <w:rFonts w:ascii="Times New Roman" w:hAnsi="Times New Roman" w:cs="Times New Roman"/>
+              </w:rPr>
+            </w:pPr>
+            <w:r>
+              <w:rPr>
+                <w:rFonts w:ascii="Times New Roman" w:hAnsi="Times New Roman" w:cs="Times New Roman"/>
+              </w:rPr>
+              <w:t>BMO.TO</w:t>
+            </w:r>
+          </w:p>
+        </w:tc>
+        <w:tc>
+          <w:tcPr>
+            <w:tcW w:w="2254" w:type="dxa"/>
+          </w:tcPr>
+          <w:p>
+            <w:pPr>
+              <w:rPr>
+                <w:rFonts w:ascii="Times New Roman" w:hAnsi="Times New Roman" w:cs="Times New Roman"/>
+              </w:rPr>
+            </w:pPr>
+            <w:r>
+              <w:rPr>
+                <w:rFonts w:ascii="Times New Roman" w:hAnsi="Times New Roman" w:cs="Times New Roman"/>
+              </w:rPr>
+              <w:t>BANK OF MONTREAL</w:t>
+            </w:r>
+          </w:p>
+        </w:tc>
+        <w:tc>
+          <w:tcPr>
+            <w:tcW w:w="2254" w:type="dxa"/>
+          </w:tcPr>
+          <w:p>
+            <w:pPr>
+              <w:rPr>
+                <w:rFonts w:ascii="Times New Roman" w:hAnsi="Times New Roman" w:cs="Times New Roman"/>
+              </w:rPr>
+            </w:pPr>
+            <w:r>
+              <w:rPr>
+                <w:rFonts w:ascii="Times New Roman" w:hAnsi="Times New Roman" w:cs="Times New Roman"/>
+              </w:rPr>
+              <w:t>Financial Services</w:t>
+            </w:r>
+          </w:p>
+        </w:tc>
+        <w:tc>
+          <w:tcPr>
+            <w:tcW w:w="2254" w:type="dxa"/>
+          </w:tcPr>
+          <w:p>
+            <w:pPr>
+              <w:rPr>
+                <w:rFonts w:ascii="Times New Roman" w:hAnsi="Times New Roman" w:cs="Times New Roman"/>
+              </w:rPr>
+            </w:pPr>
+            <w:r>
+              <w:rPr>
+                <w:rFonts w:ascii="Times New Roman" w:hAnsi="Times New Roman" w:cs="Times New Roman"/>
+              </w:rPr>
+              <w:t>Banks - Diversified</w:t>
+            </w:r>
+          </w:p>
+        </w:tc>
+      </w:tr>
+      <w:tr>
+        <w:trPr>
+          <w:trHeight w:val="300"/>
+        </w:trPr>
+        <w:tc>
+          <w:tcPr>
+            <w:tcW w:w="2254" w:type="dxa"/>
+          </w:tcPr>
+          <w:p>
+            <w:pPr>
+              <w:rPr>
+                <w:rFonts w:ascii="Times New Roman" w:hAnsi="Times New Roman" w:cs="Times New Roman"/>
+              </w:rPr>
+            </w:pPr>
+            <w:r>
+              <w:rPr>
+                <w:rFonts w:ascii="Times New Roman" w:hAnsi="Times New Roman" w:cs="Times New Roman"/>
+              </w:rPr>
+              <w:t>CM.TO</w:t>
+            </w:r>
+          </w:p>
+        </w:tc>
+        <w:tc>
+          <w:tcPr>
+            <w:tcW w:w="2254" w:type="dxa"/>
+          </w:tcPr>
+          <w:p>
+            <w:pPr>
+              <w:rPr>
+                <w:rFonts w:ascii="Times New Roman" w:hAnsi="Times New Roman" w:cs="Times New Roman"/>
+              </w:rPr>
+            </w:pPr>
+            <w:r>
+              <w:rPr>
+                <w:rFonts w:ascii="Times New Roman" w:hAnsi="Times New Roman" w:cs="Times New Roman"/>
+              </w:rPr>
+              <w:t>CANADIAN IMPERIAL BANK OF COMME</w:t>
+            </w:r>
+          </w:p>
+        </w:tc>
+        <w:tc>
+          <w:tcPr>
+            <w:tcW w:w="2254" w:type="dxa"/>
+          </w:tcPr>
+          <w:p>
+            <w:pPr>
+              <w:rPr>
+                <w:rFonts w:ascii="Times New Roman" w:hAnsi="Times New Roman" w:cs="Times New Roman"/>
+              </w:rPr>
+            </w:pPr>
+            <w:r>
+              <w:rPr>
+                <w:rFonts w:ascii="Times New Roman" w:hAnsi="Times New Roman" w:cs="Times New Roman"/>
+              </w:rPr>
+              <w:t>Financial Services</w:t>
+            </w:r>
+          </w:p>
+        </w:tc>
+        <w:tc>
+          <w:tcPr>
+            <w:tcW w:w="2254" w:type="dxa"/>
+          </w:tcPr>
+          <w:p>
+            <w:pPr>
+              <w:rPr>
+                <w:rFonts w:ascii="Times New Roman" w:hAnsi="Times New Roman" w:cs="Times New Roman"/>
+              </w:rPr>
+            </w:pPr>
+            <w:r>
+              <w:rPr>
+                <w:rFonts w:ascii="Times New Roman" w:hAnsi="Times New Roman" w:cs="Times New Roman"/>
+              </w:rPr>
+              <w:t>Banks - Diversified</w:t>
+            </w:r>
+          </w:p>
+        </w:tc>
+      </w:tr>
+      <w:tr>
+        <w:trPr>
+          <w:trHeight w:val="300"/>
+        </w:trPr>
+        <w:tc>
+          <w:tcPr>
+            <w:tcW w:w="2254" w:type="dxa"/>
+          </w:tcPr>
+          <w:p>
+            <w:pPr>
+              <w:rPr>
+                <w:rFonts w:ascii="Times New Roman" w:hAnsi="Times New Roman" w:cs="Times New Roman"/>
+              </w:rPr>
+            </w:pPr>
+            <w:r>
+              <w:rPr>
+                <w:rFonts w:ascii="Times New Roman" w:hAnsi="Times New Roman" w:cs="Times New Roman"/>
+              </w:rPr>
+              <w:lastRenderedPageBreak/>
+              <w:t>CNR.TO</w:t>
+            </w:r>
+          </w:p>
+        </w:tc>
+        <w:tc>
+          <w:tcPr>
+            <w:tcW w:w="2254" w:type="dxa"/>
+          </w:tcPr>
+          <w:p>
+            <w:pPr>
+              <w:rPr>
+                <w:rFonts w:ascii="Times New Roman" w:hAnsi="Times New Roman" w:cs="Times New Roman"/>
+              </w:rPr>
+            </w:pPr>
+            <w:r>
+              <w:rPr>
+                <w:rFonts w:ascii="Times New Roman" w:hAnsi="Times New Roman" w:cs="Times New Roman"/>
+              </w:rPr>
+              <w:t>CANADIAN NATIONAL RAILWAY CO.</w:t>
+            </w:r>
+          </w:p>
+        </w:tc>
+        <w:tc>
+          <w:tcPr>
+            <w:tcW w:w="2254" w:type="dxa"/>
+          </w:tcPr>
+          <w:p>
+            <w:pPr>
+              <w:rPr>
+                <w:rFonts w:ascii="Times New Roman" w:hAnsi="Times New Roman" w:cs="Times New Roman"/>
+              </w:rPr>
+            </w:pPr>
+            <w:r>
+              <w:rPr>
+                <w:rFonts w:ascii="Times New Roman" w:hAnsi="Times New Roman" w:cs="Times New Roman"/>
+              </w:rPr>
+              <w:t>Industrials</w:t>
+            </w:r>
+          </w:p>
+        </w:tc>
+        <w:tc>
+          <w:tcPr>
+            <w:tcW w:w="2254" w:type="dxa"/>
+          </w:tcPr>
+          <w:p>
+            <w:pPr>
+              <w:rPr>
+                <w:rFonts w:ascii="Times New Roman" w:hAnsi="Times New Roman" w:cs="Times New Roman"/>
+              </w:rPr>
+            </w:pPr>
+            <w:r>
+              <w:rPr>
+                <w:rFonts w:ascii="Times New Roman" w:hAnsi="Times New Roman" w:cs="Times New Roman"/>
+              </w:rPr>
+              <w:t>Railroads</w:t>
+            </w:r>
+          </w:p>
+        </w:tc>
+      </w:tr>
+      <w:tr>
+        <w:trPr>
+          <w:trHeight w:val="300"/>
+        </w:trPr>
+        <w:tc>
+          <w:tcPr>
+            <w:tcW w:w="2254" w:type="dxa"/>
+          </w:tcPr>
+          <w:p>
+            <w:pPr>
+              <w:rPr>
+                <w:rFonts w:ascii="Times New Roman" w:hAnsi="Times New Roman" w:cs="Times New Roman"/>
+              </w:rPr>
+            </w:pPr>
+            <w:r>
+              <w:rPr>
+                <w:rFonts w:ascii="Times New Roman" w:hAnsi="Times New Roman" w:cs="Times New Roman"/>
+              </w:rPr>
+              <w:t>ABX.TO</w:t>
+            </w:r>
+          </w:p>
+        </w:tc>
+        <w:tc>
+          <w:tcPr>
+            <w:tcW w:w="2254" w:type="dxa"/>
+          </w:tcPr>
+          <w:p>
+            <w:pPr>
+              <w:rPr>
+                <w:rFonts w:ascii="Times New Roman" w:hAnsi="Times New Roman" w:cs="Times New Roman"/>
+              </w:rPr>
+            </w:pPr>
+            <w:r>
+              <w:rPr>
+                <w:rFonts w:ascii="Times New Roman" w:hAnsi="Times New Roman" w:cs="Times New Roman"/>
+              </w:rPr>
+              <w:t>BARRICK GOLD CORPORATION</w:t>
+            </w:r>
+          </w:p>
+        </w:tc>
+        <w:tc>
+          <w:tcPr>
+            <w:tcW w:w="2254" w:type="dxa"/>
+          </w:tcPr>
+          <w:p>
+            <w:pPr>
+              <w:rPr>
+                <w:rFonts w:ascii="Times New Roman" w:hAnsi="Times New Roman" w:cs="Times New Roman"/>
+              </w:rPr>
+            </w:pPr>
+            <w:r>
+              <w:rPr>
+                <w:rFonts w:ascii="Times New Roman" w:hAnsi="Times New Roman" w:cs="Times New Roman"/>
+              </w:rPr>
+              <w:t>Basic Materials</w:t>
+            </w:r>
+          </w:p>
+        </w:tc>
+        <w:tc>
+          <w:tcPr>
+            <w:tcW w:w="2254" w:type="dxa"/>
+          </w:tcPr>
+          <w:p>
+            <w:pPr>
+              <w:rPr>
+                <w:rFonts w:ascii="Times New Roman" w:hAnsi="Times New Roman" w:cs="Times New Roman"/>
+              </w:rPr>
+            </w:pPr>
+            <w:r>
+              <w:rPr>
+                <w:rFonts w:ascii="Times New Roman" w:hAnsi="Times New Roman" w:cs="Times New Roman"/>
+              </w:rPr>
+              <w:t xml:space="preserve">Gold  </w:t>
+            </w:r>
+          </w:p>
+        </w:tc>
+      </w:tr>
+      <w:tr>
+        <w:trPr>
+          <w:trHeight w:val="300"/>
+        </w:trPr>
+        <w:tc>
+          <w:tcPr>
+            <w:tcW w:w="2254" w:type="dxa"/>
+          </w:tcPr>
+          <w:p>
+            <w:pPr>
+              <w:rPr>
+                <w:rFonts w:ascii="Times New Roman" w:hAnsi="Times New Roman" w:cs="Times New Roman"/>
+              </w:rPr>
+            </w:pPr>
+            <w:r>
+              <w:rPr>
+                <w:rFonts w:ascii="Times New Roman" w:hAnsi="Times New Roman" w:cs="Times New Roman"/>
+              </w:rPr>
+              <w:t xml:space="preserve">BNS.TO  </w:t>
+            </w:r>
+          </w:p>
+        </w:tc>
+        <w:tc>
+          <w:tcPr>
+            <w:tcW w:w="2254" w:type="dxa"/>
+          </w:tcPr>
+          <w:p>
+            <w:pPr>
+              <w:rPr>
+                <w:rFonts w:ascii="Times New Roman" w:hAnsi="Times New Roman" w:cs="Times New Roman"/>
+              </w:rPr>
+            </w:pPr>
+            <w:r>
+              <w:rPr>
+                <w:rFonts w:ascii="Times New Roman" w:hAnsi="Times New Roman" w:cs="Times New Roman"/>
+              </w:rPr>
+              <w:t>BANK OF NOVA SCOTIA</w:t>
+            </w:r>
+          </w:p>
+        </w:tc>
+        <w:tc>
+          <w:tcPr>
+            <w:tcW w:w="2254" w:type="dxa"/>
+          </w:tcPr>
+          <w:p>
+            <w:pPr>
+              <w:rPr>
+                <w:rFonts w:ascii="Times New Roman" w:hAnsi="Times New Roman" w:cs="Times New Roman"/>
+              </w:rPr>
+            </w:pPr>
+            <w:r>
+              <w:rPr>
+                <w:rFonts w:ascii="Times New Roman" w:hAnsi="Times New Roman" w:cs="Times New Roman"/>
+              </w:rPr>
+              <w:t>Financial Services</w:t>
+            </w:r>
+          </w:p>
+        </w:tc>
+        <w:tc>
+          <w:tcPr>
+            <w:tcW w:w="2254" w:type="dxa"/>
+          </w:tcPr>
+          <w:p>
+            <w:pPr>
+              <w:rPr>
+                <w:rFonts w:ascii="Times New Roman" w:hAnsi="Times New Roman" w:cs="Times New Roman"/>
+              </w:rPr>
+            </w:pPr>
+            <w:r>
+              <w:rPr>
+                <w:rFonts w:ascii="Times New Roman" w:hAnsi="Times New Roman" w:cs="Times New Roman"/>
+              </w:rPr>
+              <w:t>Banks - Diversified</w:t>
+            </w:r>
+          </w:p>
+        </w:tc>
+      </w:tr>
+    </w:tbl>
+    <w:p>
+      <w:pPr>
+        <w:rPr>
+          <w:rFonts w:ascii="Times New Roman" w:hAnsi="Times New Roman" w:cs="Times New Roman"/>
+        </w:rPr>
+      </w:pPr>
+      <w:r>
+        <w:rPr>
+          <w:rFonts w:ascii="Times New Roman" w:hAnsi="Times New Roman" w:cs="Times New Roman"/>
+        </w:rPr>
+        <w:t xml:space="preserve"> </w:t>
+      </w:r>
+      <w:r>
+        <w:rPr>
+          <w:rFonts w:ascii="Times New Roman" w:hAnsi="Times New Roman" w:cs="Times New Roman"/>
           <w:noProof/>
-          <w:color w:val="000000"/>
-          <w:kern w:val="0"/>
-          <w:sz w:val="32"/>
-          <w:szCs w:val="32"/>
-          <w:lang w:val="en-US"/>
-          <w14:ligatures w14:val="none"/>
-        </w:rPr>
-        <w:lastRenderedPageBreak/>
+        </w:rPr>
         <w:drawing>
-          <wp:inline distT="0" distB="0" distL="0" distR="0" wp14:anchorId="499364D5" wp14:editId="38118A90">
-            <wp:extent cx="5943600" cy="3378200"/>
-            <wp:effectExtent l="0" t="0" r="0" b="0"/>
-            <wp:docPr id="2038968399" name="Picture 1" descr="A graph showing a graph&#10;&#10;Description automatically generated with medium confidence"/>
+          <wp:inline distT="0" distB="0" distL="0" distR="0" wp14:anchorId="779A8F19" wp14:editId="7F70BB59">
+            <wp:extent cx="5731510" cy="3817620"/>
+            <wp:effectExtent l="0" t="0" r="2540" b="0"/>
+            <wp:docPr id="144340656" name="Picture 1" descr="A graph of different colored lines&#10;&#10;Description automatically generated"/>
             <wp:cNvGraphicFramePr>
               <a:graphicFrameLocks xmlns:a="http://schemas.openxmlformats.org/drawingml/2006/main" noChangeAspect="1"/>
             </wp:cNvGraphicFramePr>
@@ -6613,7 +7211,7 @@
               <a:graphicData uri="http://schemas.openxmlformats.org/drawingml/2006/picture">
                 <pic:pic xmlns:pic="http://schemas.openxmlformats.org/drawingml/2006/picture">
                   <pic:nvPicPr>
-                    <pic:cNvPr id="2038968399" name="Picture 1" descr="A graph showing a graph&#10;&#10;Description automatically generated with medium confidence"/>
+                    <pic:cNvPr id="144340656" name="Picture 1" descr="A graph of different colored lines&#10;&#10;Description automatically generated"/>
                     <pic:cNvPicPr/>
                   </pic:nvPicPr>
                   <pic:blipFill>
@@ -6625,7 +7223,7 @@
                   <pic:spPr>
                     <a:xfrm>
                       <a:off x="0" y="0"/>
-                      <a:ext cx="5943600" cy="3378200"/>
+                      <a:ext cx="5731510" cy="3817620"/>
                     </a:xfrm>
                     <a:prstGeom prst="rect">
                       <a:avLst/>
@@ -6639,123 +7237,824 @@
       </w:r>
       <w:r>
         <w:rPr>
-          <w:rFonts w:ascii="Times New Roman" w:eastAsia="Times New Roman" w:hAnsi="Times New Roman" w:cs="Times New Roman"/>
-          <w:bCs/>
-          <w:color w:val="000000"/>
-          <w:kern w:val="0"/>
-          <w:sz w:val="32"/>
-          <w:szCs w:val="32"/>
-          <w:lang w:val="en-US"/>
-          <w14:ligatures w14:val="none"/>
+          <w:rFonts w:ascii="Times New Roman" w:hAnsi="Times New Roman" w:cs="Times New Roman"/>
         </w:rPr>
         <w:br/>
-      </w:r>
-      <w:r>
-        <w:rPr>
-          <w:rFonts w:ascii="Times New Roman" w:eastAsia="Times New Roman" w:hAnsi="Times New Roman" w:cs="Times New Roman"/>
-          <w:bCs/>
-          <w:noProof/>
-          <w:color w:val="000000"/>
-          <w:kern w:val="0"/>
-          <w:sz w:val="32"/>
-          <w:szCs w:val="32"/>
-          <w:lang w:val="en-US"/>
-          <w14:ligatures w14:val="none"/>
-        </w:rPr>
-        <w:drawing>
-          <wp:inline distT="0" distB="0" distL="0" distR="0" wp14:anchorId="7318D4CA" wp14:editId="436034E6">
-            <wp:extent cx="5943600" cy="3375660"/>
-            <wp:effectExtent l="0" t="0" r="0" b="0"/>
-            <wp:docPr id="711184933" name="Picture 1" descr="A graph of different colored lines&#10;&#10;Description automatically generated"/>
-            <wp:cNvGraphicFramePr>
-              <a:graphicFrameLocks xmlns:a="http://schemas.openxmlformats.org/drawingml/2006/main" noChangeAspect="1"/>
-            </wp:cNvGraphicFramePr>
-            <a:graphic xmlns:a="http://schemas.openxmlformats.org/drawingml/2006/main">
-              <a:graphicData uri="http://schemas.openxmlformats.org/drawingml/2006/picture">
-                <pic:pic xmlns:pic="http://schemas.openxmlformats.org/drawingml/2006/picture">
-                  <pic:nvPicPr>
-                    <pic:cNvPr id="711184933" name="Picture 1" descr="A graph of different colored lines&#10;&#10;Description automatically generated"/>
-                    <pic:cNvPicPr/>
-                  </pic:nvPicPr>
-                  <pic:blipFill>
-                    <a:blip r:embed="rId12"/>
-                    <a:stretch>
-                      <a:fillRect/>
-                    </a:stretch>
-                  </pic:blipFill>
-                  <pic:spPr>
-                    <a:xfrm>
-                      <a:off x="0" y="0"/>
-                      <a:ext cx="5943600" cy="3375660"/>
-                    </a:xfrm>
-                    <a:prstGeom prst="rect">
-                      <a:avLst/>
-                    </a:prstGeom>
-                  </pic:spPr>
-                </pic:pic>
-              </a:graphicData>
-            </a:graphic>
-          </wp:inline>
-        </w:drawing>
-      </w:r>
-    </w:p>
-    <w:p>
-      <w:pPr>
-        <w:spacing w:after="162" w:line="360" w:lineRule="auto"/>
-        <w:ind w:left="20" w:right="60" w:hanging="10"/>
-        <w:rPr>
-          <w:rFonts w:ascii="Times New Roman" w:eastAsia="Times New Roman" w:hAnsi="Times New Roman" w:cs="Times New Roman"/>
-          <w:bCs/>
-          <w:color w:val="000000"/>
-          <w:kern w:val="0"/>
-          <w:sz w:val="32"/>
-          <w:szCs w:val="32"/>
-          <w:lang w:val="en-US"/>
-          <w14:ligatures w14:val="none"/>
-        </w:rPr>
-      </w:pPr>
-    </w:p>
-    <w:p>
-      <w:pPr>
-        <w:spacing w:after="200" w:line="276" w:lineRule="auto"/>
-        <w:rPr>
-          <w:rFonts w:ascii="Times New Roman" w:eastAsia="Times New Roman" w:hAnsi="Times New Roman" w:cs="Times New Roman"/>
-          <w:color w:val="000000"/>
-          <w:kern w:val="0"/>
-          <w:sz w:val="32"/>
-          <w:szCs w:val="32"/>
-          <w:lang w:eastAsia="en-CA"/>
-          <w14:ligatures w14:val="none"/>
-        </w:rPr>
-      </w:pPr>
-    </w:p>
-    <w:p>
-      <w:pPr>
-        <w:spacing w:after="200" w:line="276" w:lineRule="auto"/>
-        <w:rPr>
-          <w:rFonts w:ascii="Times New Roman" w:eastAsia="Times New Roman" w:hAnsi="Times New Roman" w:cs="Times New Roman"/>
-          <w:color w:val="000000"/>
-          <w:kern w:val="0"/>
-          <w:sz w:val="32"/>
-          <w:szCs w:val="32"/>
-          <w:lang w:eastAsia="en-CA"/>
-          <w14:ligatures w14:val="none"/>
-        </w:rPr>
-      </w:pPr>
-    </w:p>
-    <w:p>
-      <w:pPr>
-        <w:spacing w:after="200" w:line="276" w:lineRule="auto"/>
-        <w:rPr>
-          <w:rFonts w:ascii="Times New Roman" w:eastAsia="Times New Roman" w:hAnsi="Times New Roman" w:cs="Times New Roman"/>
-          <w:b/>
-          <w:bCs/>
-          <w:color w:val="000000"/>
-          <w:kern w:val="0"/>
-          <w:sz w:val="32"/>
-          <w:szCs w:val="32"/>
-          <w:lang w:eastAsia="en-CA"/>
-          <w14:ligatures w14:val="none"/>
+        <w:t>Observation from analysis:</w:t>
+      </w:r>
+    </w:p>
+    <w:p>
+      <w:pPr>
+        <w:pStyle w:val="ListParagraph"/>
+        <w:numPr>
+          <w:ilvl w:val="0"/>
+          <w:numId w:val="54"/>
+        </w:numPr>
+        <w:spacing w:line="279" w:lineRule="auto"/>
+        <w:rPr>
+          <w:rFonts w:ascii="Times New Roman" w:hAnsi="Times New Roman" w:cs="Times New Roman"/>
+        </w:rPr>
+      </w:pPr>
+      <w:r>
+        <w:rPr>
+          <w:rFonts w:ascii="Times New Roman" w:hAnsi="Times New Roman" w:cs="Times New Roman"/>
+        </w:rPr>
+        <w:t>Sector which is highly valued are Oil &amp; Gas E&amp;P, Banks, Railway and Gold.</w:t>
+      </w:r>
+    </w:p>
+    <w:p>
+      <w:pPr>
+        <w:pStyle w:val="ListParagraph"/>
+        <w:numPr>
+          <w:ilvl w:val="0"/>
+          <w:numId w:val="54"/>
+        </w:numPr>
+        <w:spacing w:line="279" w:lineRule="auto"/>
+        <w:rPr>
+          <w:rFonts w:ascii="Times New Roman" w:hAnsi="Times New Roman" w:cs="Times New Roman"/>
+        </w:rPr>
+      </w:pPr>
+      <w:r>
+        <w:rPr>
+          <w:rFonts w:ascii="Times New Roman" w:hAnsi="Times New Roman" w:cs="Times New Roman"/>
+          <w:b/>
+          <w:bCs/>
+        </w:rPr>
+        <w:t>Stock Growth Trends</w:t>
+      </w:r>
+      <w:r>
+        <w:rPr>
+          <w:rFonts w:ascii="Times New Roman" w:hAnsi="Times New Roman" w:cs="Times New Roman"/>
+        </w:rPr>
+        <w:t>:</w:t>
+      </w:r>
+    </w:p>
+    <w:p>
+      <w:pPr>
+        <w:pStyle w:val="ListParagraph"/>
+        <w:numPr>
+          <w:ilvl w:val="0"/>
+          <w:numId w:val="53"/>
+        </w:numPr>
+        <w:spacing w:after="0" w:line="279" w:lineRule="auto"/>
+        <w:rPr>
+          <w:rFonts w:ascii="Times New Roman" w:hAnsi="Times New Roman" w:cs="Times New Roman"/>
+        </w:rPr>
+      </w:pPr>
+      <w:r>
+        <w:rPr>
+          <w:rFonts w:ascii="Times New Roman" w:hAnsi="Times New Roman" w:cs="Times New Roman"/>
+        </w:rPr>
+        <w:t>The chart shows price differences from a base date (2004-12-01).</w:t>
+      </w:r>
+    </w:p>
+    <w:p>
+      <w:pPr>
+        <w:pStyle w:val="ListParagraph"/>
+        <w:numPr>
+          <w:ilvl w:val="0"/>
+          <w:numId w:val="53"/>
+        </w:numPr>
+        <w:spacing w:after="0" w:line="279" w:lineRule="auto"/>
+        <w:rPr>
+          <w:rFonts w:ascii="Times New Roman" w:hAnsi="Times New Roman" w:cs="Times New Roman"/>
+        </w:rPr>
+      </w:pPr>
+      <w:r>
+        <w:rPr>
+          <w:rFonts w:ascii="Times New Roman" w:hAnsi="Times New Roman" w:cs="Times New Roman"/>
+        </w:rPr>
+        <w:t xml:space="preserve">Some stocks (like </w:t>
+      </w:r>
+      <w:r>
+        <w:rPr>
+          <w:rFonts w:ascii="Times New Roman" w:hAnsi="Times New Roman" w:cs="Times New Roman"/>
+          <w:b/>
+          <w:bCs/>
+        </w:rPr>
+        <w:t>CNR.TO</w:t>
+      </w:r>
+      <w:r>
+        <w:rPr>
+          <w:rFonts w:ascii="Times New Roman" w:hAnsi="Times New Roman" w:cs="Times New Roman"/>
+        </w:rPr>
+        <w:t xml:space="preserve"> and </w:t>
+      </w:r>
+      <w:r>
+        <w:rPr>
+          <w:rFonts w:ascii="Times New Roman" w:hAnsi="Times New Roman" w:cs="Times New Roman"/>
+          <w:b/>
+          <w:bCs/>
+        </w:rPr>
+        <w:t>BMO.TO</w:t>
+      </w:r>
+      <w:r>
+        <w:rPr>
+          <w:rFonts w:ascii="Times New Roman" w:hAnsi="Times New Roman" w:cs="Times New Roman"/>
+        </w:rPr>
+        <w:t>) have experienced consistent long-term growth, making them strong candidates for stable investments.</w:t>
+      </w:r>
+    </w:p>
+    <w:p>
+      <w:pPr>
+        <w:pStyle w:val="ListParagraph"/>
+        <w:numPr>
+          <w:ilvl w:val="0"/>
+          <w:numId w:val="53"/>
+        </w:numPr>
+        <w:spacing w:after="0" w:line="279" w:lineRule="auto"/>
+        <w:rPr>
+          <w:rFonts w:ascii="Times New Roman" w:hAnsi="Times New Roman" w:cs="Times New Roman"/>
+        </w:rPr>
+      </w:pPr>
+      <w:r>
+        <w:rPr>
+          <w:rFonts w:ascii="Times New Roman" w:hAnsi="Times New Roman" w:cs="Times New Roman"/>
+        </w:rPr>
+        <w:t xml:space="preserve">Others (like </w:t>
+      </w:r>
+      <w:r>
+        <w:rPr>
+          <w:rFonts w:ascii="Times New Roman" w:hAnsi="Times New Roman" w:cs="Times New Roman"/>
+          <w:b/>
+          <w:bCs/>
+        </w:rPr>
+        <w:t>ABX.TO</w:t>
+      </w:r>
+      <w:r>
+        <w:rPr>
+          <w:rFonts w:ascii="Times New Roman" w:hAnsi="Times New Roman" w:cs="Times New Roman"/>
+        </w:rPr>
+        <w:t>) have shown fluctuations, suggesting more volatility.</w:t>
+      </w:r>
+    </w:p>
+    <w:p>
+      <w:pPr>
+        <w:pStyle w:val="ListParagraph"/>
+        <w:numPr>
+          <w:ilvl w:val="0"/>
+          <w:numId w:val="54"/>
+        </w:numPr>
+        <w:spacing w:line="279" w:lineRule="auto"/>
+        <w:rPr>
+          <w:rFonts w:ascii="Times New Roman" w:hAnsi="Times New Roman" w:cs="Times New Roman"/>
+        </w:rPr>
+      </w:pPr>
+      <w:r>
+        <w:rPr>
+          <w:rFonts w:ascii="Times New Roman" w:hAnsi="Times New Roman" w:cs="Times New Roman"/>
+          <w:b/>
+          <w:bCs/>
+        </w:rPr>
+        <w:t>Volatility and Risk</w:t>
+      </w:r>
+      <w:r>
+        <w:rPr>
+          <w:rFonts w:ascii="Times New Roman" w:hAnsi="Times New Roman" w:cs="Times New Roman"/>
+        </w:rPr>
+        <w:t>:</w:t>
+      </w:r>
+    </w:p>
+    <w:p>
+      <w:pPr>
+        <w:pStyle w:val="ListParagraph"/>
+        <w:numPr>
+          <w:ilvl w:val="0"/>
+          <w:numId w:val="52"/>
+        </w:numPr>
+        <w:spacing w:after="0" w:line="279" w:lineRule="auto"/>
+        <w:rPr>
+          <w:rFonts w:ascii="Times New Roman" w:hAnsi="Times New Roman" w:cs="Times New Roman"/>
+        </w:rPr>
+      </w:pPr>
+      <w:r>
+        <w:rPr>
+          <w:rFonts w:ascii="Times New Roman" w:hAnsi="Times New Roman" w:cs="Times New Roman"/>
+        </w:rPr>
+        <w:t xml:space="preserve">Stocks with </w:t>
+      </w:r>
+      <w:r>
+        <w:rPr>
+          <w:rFonts w:ascii="Times New Roman" w:hAnsi="Times New Roman" w:cs="Times New Roman"/>
+          <w:b/>
+          <w:bCs/>
+        </w:rPr>
+        <w:t>higher price swings</w:t>
+      </w:r>
+      <w:r>
+        <w:rPr>
+          <w:rFonts w:ascii="Times New Roman" w:hAnsi="Times New Roman" w:cs="Times New Roman"/>
+        </w:rPr>
+        <w:t xml:space="preserve"> (e.g., ABX.TO) may be riskier but offer short-term trading opportunities.</w:t>
+      </w:r>
+    </w:p>
+    <w:p>
+      <w:pPr>
+        <w:pStyle w:val="ListParagraph"/>
+        <w:numPr>
+          <w:ilvl w:val="0"/>
+          <w:numId w:val="52"/>
+        </w:numPr>
+        <w:spacing w:after="0" w:line="279" w:lineRule="auto"/>
+        <w:rPr>
+          <w:rFonts w:ascii="Times New Roman" w:hAnsi="Times New Roman" w:cs="Times New Roman"/>
+        </w:rPr>
+      </w:pPr>
+      <w:r>
+        <w:rPr>
+          <w:rFonts w:ascii="Times New Roman" w:hAnsi="Times New Roman" w:cs="Times New Roman"/>
+        </w:rPr>
+        <w:t>Stable stocks (e.g., CNR.TO) are more suited for long-term, low-risk investors.</w:t>
+      </w:r>
+    </w:p>
+    <w:p>
+      <w:pPr>
+        <w:pStyle w:val="ListParagraph"/>
+        <w:numPr>
+          <w:ilvl w:val="0"/>
+          <w:numId w:val="54"/>
+        </w:numPr>
+        <w:spacing w:line="279" w:lineRule="auto"/>
+        <w:rPr>
+          <w:rFonts w:ascii="Times New Roman" w:hAnsi="Times New Roman" w:cs="Times New Roman"/>
+        </w:rPr>
+      </w:pPr>
+      <w:r>
+        <w:rPr>
+          <w:rFonts w:ascii="Times New Roman" w:hAnsi="Times New Roman" w:cs="Times New Roman"/>
+          <w:b/>
+          <w:bCs/>
+        </w:rPr>
+        <w:t>Investment Timing Matters</w:t>
+      </w:r>
+      <w:r>
+        <w:rPr>
+          <w:rFonts w:ascii="Times New Roman" w:hAnsi="Times New Roman" w:cs="Times New Roman"/>
+        </w:rPr>
+        <w:t>:</w:t>
+      </w:r>
+    </w:p>
+    <w:p>
+      <w:pPr>
+        <w:pStyle w:val="ListParagraph"/>
+        <w:numPr>
+          <w:ilvl w:val="0"/>
+          <w:numId w:val="51"/>
+        </w:numPr>
+        <w:spacing w:after="0" w:line="279" w:lineRule="auto"/>
+        <w:rPr>
+          <w:rFonts w:ascii="Times New Roman" w:hAnsi="Times New Roman" w:cs="Times New Roman"/>
+        </w:rPr>
+      </w:pPr>
+      <w:r>
+        <w:rPr>
+          <w:rFonts w:ascii="Times New Roman" w:hAnsi="Times New Roman" w:cs="Times New Roman"/>
+        </w:rPr>
+        <w:t>The 2008 and 2020 financial crises are visible as dips in stock prices.</w:t>
+      </w:r>
+    </w:p>
+    <w:p>
+      <w:pPr>
+        <w:pStyle w:val="ListParagraph"/>
+        <w:numPr>
+          <w:ilvl w:val="0"/>
+          <w:numId w:val="51"/>
+        </w:numPr>
+        <w:spacing w:after="0" w:line="279" w:lineRule="auto"/>
+        <w:rPr>
+          <w:rFonts w:ascii="Times New Roman" w:hAnsi="Times New Roman" w:cs="Times New Roman"/>
+        </w:rPr>
+      </w:pPr>
+      <w:r>
+        <w:rPr>
+          <w:rFonts w:ascii="Times New Roman" w:hAnsi="Times New Roman" w:cs="Times New Roman"/>
+        </w:rPr>
+        <w:lastRenderedPageBreak/>
+        <w:t xml:space="preserve">Investors who bought during these dips benefited from </w:t>
+      </w:r>
+      <w:r>
+        <w:rPr>
+          <w:rFonts w:ascii="Times New Roman" w:hAnsi="Times New Roman" w:cs="Times New Roman"/>
+          <w:b/>
+          <w:bCs/>
+        </w:rPr>
+        <w:t>significant gains</w:t>
+      </w:r>
+      <w:r>
+        <w:rPr>
+          <w:rFonts w:ascii="Times New Roman" w:hAnsi="Times New Roman" w:cs="Times New Roman"/>
+        </w:rPr>
+        <w:t xml:space="preserve"> in the following years.</w:t>
+      </w:r>
+    </w:p>
+    <w:p>
+      <w:pPr>
+        <w:pStyle w:val="ListParagraph"/>
+        <w:numPr>
+          <w:ilvl w:val="0"/>
+          <w:numId w:val="54"/>
+        </w:numPr>
+        <w:spacing w:line="279" w:lineRule="auto"/>
+        <w:rPr>
+          <w:rFonts w:ascii="Times New Roman" w:hAnsi="Times New Roman" w:cs="Times New Roman"/>
+        </w:rPr>
+      </w:pPr>
+      <w:r>
+        <w:rPr>
+          <w:rFonts w:ascii="Times New Roman" w:hAnsi="Times New Roman" w:cs="Times New Roman"/>
+          <w:b/>
+          <w:bCs/>
+        </w:rPr>
+        <w:t>Sector-Based Performance</w:t>
+      </w:r>
+      <w:r>
+        <w:rPr>
+          <w:rFonts w:ascii="Times New Roman" w:hAnsi="Times New Roman" w:cs="Times New Roman"/>
+        </w:rPr>
+        <w:t>:</w:t>
+      </w:r>
+    </w:p>
+    <w:p>
+      <w:pPr>
+        <w:pStyle w:val="ListParagraph"/>
+        <w:numPr>
+          <w:ilvl w:val="0"/>
+          <w:numId w:val="50"/>
+        </w:numPr>
+        <w:spacing w:after="0" w:line="279" w:lineRule="auto"/>
+        <w:rPr>
+          <w:rFonts w:ascii="Times New Roman" w:hAnsi="Times New Roman" w:cs="Times New Roman"/>
+        </w:rPr>
+      </w:pPr>
+      <w:r>
+        <w:rPr>
+          <w:rFonts w:ascii="Times New Roman" w:hAnsi="Times New Roman" w:cs="Times New Roman"/>
+        </w:rPr>
+        <w:t>Different stocks belong to different sectors.</w:t>
+      </w:r>
+    </w:p>
+    <w:p>
+      <w:pPr>
+        <w:pStyle w:val="ListParagraph"/>
+        <w:numPr>
+          <w:ilvl w:val="0"/>
+          <w:numId w:val="50"/>
+        </w:numPr>
+        <w:spacing w:after="0" w:line="279" w:lineRule="auto"/>
+        <w:rPr>
+          <w:rFonts w:ascii="Times New Roman" w:hAnsi="Times New Roman" w:cs="Times New Roman"/>
+        </w:rPr>
+      </w:pPr>
+      <w:r>
+        <w:rPr>
+          <w:rFonts w:ascii="Times New Roman" w:hAnsi="Times New Roman" w:cs="Times New Roman"/>
+        </w:rPr>
+        <w:t xml:space="preserve">If a customer prefers </w:t>
+      </w:r>
+      <w:r>
+        <w:rPr>
+          <w:rFonts w:ascii="Times New Roman" w:hAnsi="Times New Roman" w:cs="Times New Roman"/>
+          <w:b/>
+          <w:bCs/>
+        </w:rPr>
+        <w:t>low-risk investments</w:t>
+      </w:r>
+      <w:r>
+        <w:rPr>
+          <w:rFonts w:ascii="Times New Roman" w:hAnsi="Times New Roman" w:cs="Times New Roman"/>
+        </w:rPr>
+        <w:t>, they should target sectors with steady upward trends.</w:t>
+      </w:r>
+    </w:p>
+    <w:p>
+      <w:pPr>
+        <w:pStyle w:val="ListParagraph"/>
+        <w:numPr>
+          <w:ilvl w:val="0"/>
+          <w:numId w:val="54"/>
+        </w:numPr>
+        <w:spacing w:line="279" w:lineRule="auto"/>
+        <w:rPr>
+          <w:rFonts w:ascii="Times New Roman" w:hAnsi="Times New Roman" w:cs="Times New Roman"/>
+        </w:rPr>
+      </w:pPr>
+      <w:r>
+        <w:rPr>
+          <w:rFonts w:ascii="Times New Roman" w:hAnsi="Times New Roman" w:cs="Times New Roman"/>
+          <w:b/>
+          <w:bCs/>
+        </w:rPr>
+        <w:t>Profit/Loss Boundary (Dotted Line)</w:t>
+      </w:r>
+      <w:r>
+        <w:rPr>
+          <w:rFonts w:ascii="Times New Roman" w:hAnsi="Times New Roman" w:cs="Times New Roman"/>
+        </w:rPr>
+        <w:t>:</w:t>
+      </w:r>
+    </w:p>
+    <w:p>
+      <w:pPr>
+        <w:pStyle w:val="ListParagraph"/>
+        <w:numPr>
+          <w:ilvl w:val="0"/>
+          <w:numId w:val="49"/>
+        </w:numPr>
+        <w:spacing w:after="0" w:line="279" w:lineRule="auto"/>
+        <w:rPr>
+          <w:rFonts w:ascii="Times New Roman" w:hAnsi="Times New Roman" w:cs="Times New Roman"/>
+        </w:rPr>
+      </w:pPr>
+      <w:r>
+        <w:rPr>
+          <w:rFonts w:ascii="Times New Roman" w:hAnsi="Times New Roman" w:cs="Times New Roman"/>
+        </w:rPr>
+        <w:t>It represents whether a stock is above or below its starting price.</w:t>
+      </w:r>
+    </w:p>
+    <w:p>
+      <w:pPr>
+        <w:pStyle w:val="ListParagraph"/>
+        <w:numPr>
+          <w:ilvl w:val="0"/>
+          <w:numId w:val="49"/>
+        </w:numPr>
+        <w:spacing w:after="0" w:line="279" w:lineRule="auto"/>
+        <w:rPr>
+          <w:rFonts w:ascii="Times New Roman" w:hAnsi="Times New Roman" w:cs="Times New Roman"/>
+        </w:rPr>
+      </w:pPr>
+      <w:r>
+        <w:rPr>
+          <w:rFonts w:ascii="Times New Roman" w:hAnsi="Times New Roman" w:cs="Times New Roman"/>
+        </w:rPr>
+        <w:t xml:space="preserve">If a stock stays </w:t>
+      </w:r>
+      <w:r>
+        <w:rPr>
+          <w:rFonts w:ascii="Times New Roman" w:hAnsi="Times New Roman" w:cs="Times New Roman"/>
+          <w:b/>
+          <w:bCs/>
+        </w:rPr>
+        <w:t>above the boundary for long periods</w:t>
+      </w:r>
+      <w:r>
+        <w:rPr>
+          <w:rFonts w:ascii="Times New Roman" w:hAnsi="Times New Roman" w:cs="Times New Roman"/>
+        </w:rPr>
+        <w:t>, it indicates strong long-term performance.</w:t>
+      </w:r>
+    </w:p>
+    <w:p>
+      <w:pPr>
+        <w:pStyle w:val="ListParagraph"/>
+        <w:spacing w:after="0"/>
+        <w:ind w:left="1080"/>
+        <w:rPr>
+          <w:rFonts w:ascii="Times New Roman" w:hAnsi="Times New Roman" w:cs="Times New Roman"/>
+        </w:rPr>
+      </w:pPr>
+    </w:p>
+    <w:p>
+      <w:pPr>
+        <w:spacing w:after="0"/>
+        <w:rPr>
+          <w:rFonts w:ascii="Times New Roman" w:hAnsi="Times New Roman" w:cs="Times New Roman"/>
+        </w:rPr>
+      </w:pPr>
+    </w:p>
+    <w:p>
+      <w:pPr>
+        <w:rPr>
+          <w:rFonts w:ascii="Times New Roman" w:hAnsi="Times New Roman" w:cs="Times New Roman"/>
+          <w:b/>
+          <w:bCs/>
+        </w:rPr>
+      </w:pPr>
+      <w:r>
+        <w:rPr>
+          <w:rFonts w:ascii="Times New Roman" w:eastAsia="Aptos" w:hAnsi="Times New Roman" w:cs="Times New Roman"/>
+          <w:b/>
+          <w:bCs/>
+        </w:rPr>
+        <w:t>How This Helps Beginner Investors:</w:t>
+      </w:r>
+    </w:p>
+    <w:p>
+      <w:pPr>
+        <w:rPr>
+          <w:rFonts w:ascii="Times New Roman" w:eastAsia="Aptos" w:hAnsi="Times New Roman" w:cs="Times New Roman"/>
+        </w:rPr>
+      </w:pPr>
+      <w:r>
+        <w:rPr>
+          <w:rFonts w:ascii="Times New Roman" w:hAnsi="Times New Roman" w:cs="Times New Roman"/>
+        </w:rPr>
+        <w:t>Sector-Based Diversification to Reduce Risks:</w:t>
+      </w:r>
+    </w:p>
+    <w:p>
+      <w:pPr>
+        <w:pStyle w:val="ListParagraph"/>
+        <w:numPr>
+          <w:ilvl w:val="0"/>
+          <w:numId w:val="48"/>
+        </w:numPr>
+        <w:spacing w:line="279" w:lineRule="auto"/>
+        <w:rPr>
+          <w:rFonts w:ascii="Times New Roman" w:eastAsia="Aptos" w:hAnsi="Times New Roman" w:cs="Times New Roman"/>
+        </w:rPr>
+      </w:pPr>
+      <w:r>
+        <w:rPr>
+          <w:rFonts w:ascii="Times New Roman" w:eastAsia="Aptos" w:hAnsi="Times New Roman" w:cs="Times New Roman"/>
+        </w:rPr>
+        <w:t xml:space="preserve">It means investing in </w:t>
+      </w:r>
+      <w:r>
+        <w:rPr>
+          <w:rFonts w:ascii="Times New Roman" w:eastAsia="Aptos" w:hAnsi="Times New Roman" w:cs="Times New Roman"/>
+          <w:b/>
+          <w:bCs/>
+        </w:rPr>
+        <w:t>different industries</w:t>
+      </w:r>
+      <w:r>
+        <w:rPr>
+          <w:rFonts w:ascii="Times New Roman" w:eastAsia="Aptos" w:hAnsi="Times New Roman" w:cs="Times New Roman"/>
+        </w:rPr>
+        <w:t xml:space="preserve"> rather than putting all money into a single sector (e.g., technology, healthcare, finance).</w:t>
+      </w:r>
+    </w:p>
+    <w:p>
+      <w:pPr>
+        <w:pStyle w:val="ListParagraph"/>
+        <w:numPr>
+          <w:ilvl w:val="0"/>
+          <w:numId w:val="48"/>
+        </w:numPr>
+        <w:spacing w:after="0" w:line="279" w:lineRule="auto"/>
+        <w:rPr>
+          <w:rFonts w:ascii="Times New Roman" w:eastAsia="Aptos" w:hAnsi="Times New Roman" w:cs="Times New Roman"/>
+        </w:rPr>
+      </w:pPr>
+      <w:r>
+        <w:rPr>
+          <w:rFonts w:ascii="Times New Roman" w:eastAsia="Aptos" w:hAnsi="Times New Roman" w:cs="Times New Roman"/>
+        </w:rPr>
+        <w:t xml:space="preserve">Different sectors react </w:t>
+      </w:r>
+      <w:r>
+        <w:rPr>
+          <w:rFonts w:ascii="Times New Roman" w:eastAsia="Aptos" w:hAnsi="Times New Roman" w:cs="Times New Roman"/>
+          <w:b/>
+          <w:bCs/>
+        </w:rPr>
+        <w:t>differently</w:t>
+      </w:r>
+      <w:r>
+        <w:rPr>
+          <w:rFonts w:ascii="Times New Roman" w:eastAsia="Aptos" w:hAnsi="Times New Roman" w:cs="Times New Roman"/>
+        </w:rPr>
+        <w:t xml:space="preserve"> to economic changes, reducing overall investment risk.</w:t>
+      </w:r>
+    </w:p>
+    <w:p>
+      <w:pPr>
+        <w:spacing w:after="0"/>
+        <w:rPr>
+          <w:rFonts w:ascii="Times New Roman" w:eastAsia="Aptos" w:hAnsi="Times New Roman" w:cs="Times New Roman"/>
+        </w:rPr>
+      </w:pPr>
+      <w:r>
+        <w:rPr>
+          <w:rFonts w:ascii="Times New Roman" w:eastAsia="Aptos" w:hAnsi="Times New Roman" w:cs="Times New Roman"/>
+        </w:rPr>
+        <w:t>Why is it important for new investors:</w:t>
+      </w:r>
+    </w:p>
+    <w:p>
+      <w:pPr>
+        <w:pStyle w:val="ListParagraph"/>
+        <w:numPr>
+          <w:ilvl w:val="0"/>
+          <w:numId w:val="53"/>
+        </w:numPr>
+        <w:spacing w:after="0" w:line="279" w:lineRule="auto"/>
+        <w:rPr>
+          <w:rFonts w:ascii="Times New Roman" w:eastAsia="Aptos" w:hAnsi="Times New Roman" w:cs="Times New Roman"/>
+        </w:rPr>
+      </w:pPr>
+      <w:r>
+        <w:rPr>
+          <w:rFonts w:ascii="Times New Roman" w:eastAsia="Aptos" w:hAnsi="Times New Roman" w:cs="Times New Roman"/>
+        </w:rPr>
+        <w:t xml:space="preserve">If an investor </w:t>
+      </w:r>
+      <w:r>
+        <w:rPr>
+          <w:rFonts w:ascii="Times New Roman" w:eastAsia="Aptos" w:hAnsi="Times New Roman" w:cs="Times New Roman"/>
+          <w:b/>
+          <w:bCs/>
+        </w:rPr>
+        <w:t>only buys</w:t>
+      </w:r>
+      <w:r>
+        <w:rPr>
+          <w:rFonts w:ascii="Times New Roman" w:eastAsia="Aptos" w:hAnsi="Times New Roman" w:cs="Times New Roman"/>
+        </w:rPr>
+        <w:t xml:space="preserve"> stocks from one sector (e.g., banking), their portfolio is at high risk if that sector crashes.</w:t>
+      </w:r>
+    </w:p>
+    <w:p>
+      <w:pPr>
+        <w:pStyle w:val="ListParagraph"/>
+        <w:numPr>
+          <w:ilvl w:val="0"/>
+          <w:numId w:val="53"/>
+        </w:numPr>
+        <w:spacing w:after="0" w:line="279" w:lineRule="auto"/>
+        <w:rPr>
+          <w:rFonts w:ascii="Times New Roman" w:eastAsia="Aptos" w:hAnsi="Times New Roman" w:cs="Times New Roman"/>
+        </w:rPr>
+      </w:pPr>
+      <w:r>
+        <w:rPr>
+          <w:rFonts w:ascii="Times New Roman" w:eastAsia="Aptos" w:hAnsi="Times New Roman" w:cs="Times New Roman"/>
+        </w:rPr>
+        <w:t xml:space="preserve">Diversifying across multiple sectors protects against </w:t>
+      </w:r>
+      <w:r>
+        <w:rPr>
+          <w:rFonts w:ascii="Times New Roman" w:eastAsia="Aptos" w:hAnsi="Times New Roman" w:cs="Times New Roman"/>
+          <w:b/>
+          <w:bCs/>
+        </w:rPr>
+        <w:t>sector-specific downturns</w:t>
+      </w:r>
+      <w:r>
+        <w:rPr>
+          <w:rFonts w:ascii="Times New Roman" w:eastAsia="Aptos" w:hAnsi="Times New Roman" w:cs="Times New Roman"/>
+        </w:rPr>
+        <w:t>.</w:t>
+      </w:r>
+    </w:p>
+    <w:p>
+      <w:pPr>
+        <w:pStyle w:val="ListParagraph"/>
+        <w:numPr>
+          <w:ilvl w:val="0"/>
+          <w:numId w:val="53"/>
+        </w:numPr>
+        <w:spacing w:after="0" w:line="279" w:lineRule="auto"/>
+        <w:rPr>
+          <w:rFonts w:ascii="Times New Roman" w:eastAsia="Aptos" w:hAnsi="Times New Roman" w:cs="Times New Roman"/>
+        </w:rPr>
+      </w:pPr>
+      <w:r>
+        <w:rPr>
+          <w:rFonts w:ascii="Times New Roman" w:eastAsia="Aptos" w:hAnsi="Times New Roman" w:cs="Times New Roman"/>
+        </w:rPr>
+        <w:t>For example:</w:t>
+      </w:r>
+      <w:r>
+        <w:rPr>
+          <w:rFonts w:ascii="Times New Roman" w:hAnsi="Times New Roman" w:cs="Times New Roman"/>
+        </w:rPr>
+        <w:br/>
+      </w:r>
+      <w:r>
+        <w:rPr>
+          <w:rFonts w:ascii="Times New Roman" w:eastAsia="Aptos" w:hAnsi="Times New Roman" w:cs="Times New Roman"/>
+        </w:rPr>
+        <w:t>Financial Sector (BMO.TO, CM.TO, BNS.TO) → Affected by interest rates, economic cycles.</w:t>
+      </w:r>
+      <w:r>
+        <w:rPr>
+          <w:rFonts w:ascii="Times New Roman" w:hAnsi="Times New Roman" w:cs="Times New Roman"/>
+        </w:rPr>
+        <w:br/>
+      </w:r>
+      <w:r>
+        <w:rPr>
+          <w:rFonts w:ascii="Times New Roman" w:eastAsia="Aptos" w:hAnsi="Times New Roman" w:cs="Times New Roman"/>
+        </w:rPr>
+        <w:t>Energy Sector (CNQ.TO) → Influenced by oil prices, geopolitical events.</w:t>
+      </w:r>
+      <w:r>
+        <w:rPr>
+          <w:rFonts w:ascii="Times New Roman" w:hAnsi="Times New Roman" w:cs="Times New Roman"/>
+        </w:rPr>
+        <w:br/>
+      </w:r>
+      <w:r>
+        <w:rPr>
+          <w:rFonts w:ascii="Times New Roman" w:eastAsia="Aptos" w:hAnsi="Times New Roman" w:cs="Times New Roman"/>
+        </w:rPr>
+        <w:t>Industrial Sector (CNR.TO) → Depends on trade, infrastructure growth.</w:t>
+      </w:r>
+      <w:r>
+        <w:rPr>
+          <w:rFonts w:ascii="Times New Roman" w:hAnsi="Times New Roman" w:cs="Times New Roman"/>
+        </w:rPr>
+        <w:br/>
+      </w:r>
+      <w:r>
+        <w:rPr>
+          <w:rFonts w:ascii="Times New Roman" w:eastAsia="Aptos" w:hAnsi="Times New Roman" w:cs="Times New Roman"/>
+        </w:rPr>
+        <w:t>Gold &amp; Mining (ABX.TO) → Gains value in economic downturns (safe-haven investment).</w:t>
+      </w:r>
+    </w:p>
+    <w:p>
+      <w:pPr>
+        <w:spacing w:after="0"/>
+        <w:rPr>
+          <w:rFonts w:ascii="Times New Roman" w:eastAsia="Aptos" w:hAnsi="Times New Roman" w:cs="Times New Roman"/>
+        </w:rPr>
+      </w:pPr>
+    </w:p>
+    <w:p>
+      <w:pPr>
+        <w:spacing w:after="0"/>
+        <w:rPr>
+          <w:rFonts w:ascii="Times New Roman" w:eastAsia="Aptos" w:hAnsi="Times New Roman" w:cs="Times New Roman"/>
+        </w:rPr>
+      </w:pPr>
+    </w:p>
+    <w:p>
+      <w:pPr>
+        <w:spacing w:after="0"/>
+        <w:rPr>
+          <w:rFonts w:ascii="Times New Roman" w:eastAsia="Aptos" w:hAnsi="Times New Roman" w:cs="Times New Roman"/>
+          <w:b/>
+          <w:bCs/>
+        </w:rPr>
+      </w:pPr>
+      <w:r>
+        <w:rPr>
+          <w:rFonts w:ascii="Times New Roman" w:eastAsia="Aptos" w:hAnsi="Times New Roman" w:cs="Times New Roman"/>
+          <w:b/>
+          <w:bCs/>
+        </w:rPr>
+        <w:t>How Can Beginners Use This?</w:t>
+      </w:r>
+    </w:p>
+    <w:p>
+      <w:pPr>
+        <w:pStyle w:val="ListParagraph"/>
+        <w:numPr>
+          <w:ilvl w:val="0"/>
+          <w:numId w:val="47"/>
+        </w:numPr>
+        <w:spacing w:after="0" w:line="279" w:lineRule="auto"/>
+        <w:rPr>
+          <w:rFonts w:ascii="Times New Roman" w:hAnsi="Times New Roman" w:cs="Times New Roman"/>
+        </w:rPr>
+      </w:pPr>
+      <w:r>
+        <w:rPr>
+          <w:rFonts w:ascii="Times New Roman" w:eastAsia="Aptos" w:hAnsi="Times New Roman" w:cs="Times New Roman"/>
+        </w:rPr>
+        <w:t>Scenario 1: If the economy slows down, banks (BMO.TO, CM.TO) might struggle, but gold (ABX.TO) could rise.</w:t>
+      </w:r>
+      <w:r>
+        <w:rPr>
+          <w:rFonts w:ascii="Times New Roman" w:hAnsi="Times New Roman" w:cs="Times New Roman"/>
+        </w:rPr>
+        <w:br/>
+      </w:r>
+      <w:r>
+        <w:rPr>
+          <w:rFonts w:ascii="Times New Roman" w:eastAsia="Aptos" w:hAnsi="Times New Roman" w:cs="Times New Roman"/>
+        </w:rPr>
+        <w:t>Scenario 2: If oil prices surge, energy stocks (CNQ.TO) will benefit, while transport (CNR.TO) may suffer due to higher costs.</w:t>
+      </w:r>
+    </w:p>
+    <w:p>
+      <w:pPr>
+        <w:pStyle w:val="ListParagraph"/>
+        <w:numPr>
+          <w:ilvl w:val="0"/>
+          <w:numId w:val="47"/>
+        </w:numPr>
+        <w:spacing w:after="0" w:line="279" w:lineRule="auto"/>
+        <w:rPr>
+          <w:rFonts w:ascii="Times New Roman" w:hAnsi="Times New Roman" w:cs="Times New Roman"/>
+        </w:rPr>
+      </w:pPr>
+      <w:r>
+        <w:rPr>
+          <w:rFonts w:ascii="Times New Roman" w:eastAsia="Aptos" w:hAnsi="Times New Roman" w:cs="Times New Roman"/>
+        </w:rPr>
+        <w:t>By investing across multiple sectors, losses in one area are balanced by gains in another.</w:t>
+      </w:r>
+    </w:p>
+    <w:p>
+      <w:pPr>
+        <w:spacing w:after="0" w:line="279" w:lineRule="auto"/>
+        <w:rPr>
+          <w:rFonts w:ascii="Times New Roman" w:hAnsi="Times New Roman" w:cs="Times New Roman"/>
         </w:rPr>
       </w:pPr>
       <w:r>
@@ -6893,7 +8192,7 @@
                     <pic:cNvPicPr/>
                   </pic:nvPicPr>
                   <pic:blipFill>
-                    <a:blip r:embed="rId13"/>
+                    <a:blip r:embed="rId12"/>
                     <a:stretch>
                       <a:fillRect/>
                     </a:stretch>
@@ -10921,7 +12220,7 @@
       <w:r>
         <w:t xml:space="preserve">Investopedia. “What Is Portfolio Management?” [Online]. Available: </w:t>
       </w:r>
-      <w:hyperlink r:id="rId14" w:tgtFrame="_new" w:history="1">
+      <w:hyperlink r:id="rId13" w:tgtFrame="_new" w:history="1">
         <w:r>
           <w:rPr>
             <w:rStyle w:val="Hyperlink"/>
@@ -10950,7 +12249,7 @@
       <w:r>
         <w:t xml:space="preserve">Groww. “Portfolio Management Overview.” [Online]. Available: </w:t>
       </w:r>
-      <w:hyperlink r:id="rId15" w:tgtFrame="_new" w:history="1">
+      <w:hyperlink r:id="rId14" w:tgtFrame="_new" w:history="1">
         <w:r>
           <w:rPr>
             <w:rStyle w:val="Hyperlink"/>
@@ -11002,7 +12301,7 @@
           <w:lang w:val="en-US"/>
         </w:rPr>
       </w:pPr>
-      <w:hyperlink r:id="rId16" w:history="1">
+      <w:hyperlink r:id="rId15" w:history="1">
         <w:r>
           <w:rPr>
             <w:rStyle w:val="Hyperlink"/>
@@ -11052,7 +12351,7 @@
           <w:lang w:val="en-US"/>
         </w:rPr>
       </w:pPr>
-      <w:hyperlink r:id="rId17" w:history="1">
+      <w:hyperlink r:id="rId16" w:history="1">
         <w:r>
           <w:rPr>
             <w:rStyle w:val="Hyperlink"/>
@@ -11082,7 +12381,7 @@
           <w:lang w:val="en-US"/>
         </w:rPr>
       </w:pPr>
-      <w:hyperlink r:id="rId18" w:history="1">
+      <w:hyperlink r:id="rId17" w:history="1">
         <w:r>
           <w:rPr>
             <w:rStyle w:val="Hyperlink"/>
@@ -11282,6 +12581,232 @@
     </w:lvl>
   </w:abstractNum>
   <w:abstractNum w:abstractNumId="1" w15:restartNumberingAfterBreak="0">
+    <w:nsid w:val="0BB9F9A2"/>
+    <w:multiLevelType w:val="hybridMultilevel"/>
+    <w:tmpl w:val="1108C35E"/>
+    <w:lvl w:ilvl="0" w:tplc="81B8FB02">
+      <w:start w:val="1"/>
+      <w:numFmt w:val="bullet"/>
+      <w:lvlText w:val=""/>
+      <w:lvlJc w:val="left"/>
+      <w:pPr>
+        <w:ind w:left="1080" w:hanging="360"/>
+      </w:pPr>
+      <w:rPr>
+        <w:rFonts w:ascii="Symbol" w:hAnsi="Symbol" w:hint="default"/>
+      </w:rPr>
+    </w:lvl>
+    <w:lvl w:ilvl="1" w:tplc="188CF5A0">
+      <w:start w:val="1"/>
+      <w:numFmt w:val="bullet"/>
+      <w:lvlText w:val="o"/>
+      <w:lvlJc w:val="left"/>
+      <w:pPr>
+        <w:ind w:left="1800" w:hanging="360"/>
+      </w:pPr>
+      <w:rPr>
+        <w:rFonts w:ascii="Courier New" w:hAnsi="Courier New" w:hint="default"/>
+      </w:rPr>
+    </w:lvl>
+    <w:lvl w:ilvl="2" w:tplc="831660AA">
+      <w:start w:val="1"/>
+      <w:numFmt w:val="bullet"/>
+      <w:lvlText w:val=""/>
+      <w:lvlJc w:val="left"/>
+      <w:pPr>
+        <w:ind w:left="2520" w:hanging="360"/>
+      </w:pPr>
+      <w:rPr>
+        <w:rFonts w:ascii="Wingdings" w:hAnsi="Wingdings" w:hint="default"/>
+      </w:rPr>
+    </w:lvl>
+    <w:lvl w:ilvl="3" w:tplc="C1AEBE74">
+      <w:start w:val="1"/>
+      <w:numFmt w:val="bullet"/>
+      <w:lvlText w:val=""/>
+      <w:lvlJc w:val="left"/>
+      <w:pPr>
+        <w:ind w:left="3240" w:hanging="360"/>
+      </w:pPr>
+      <w:rPr>
+        <w:rFonts w:ascii="Symbol" w:hAnsi="Symbol" w:hint="default"/>
+      </w:rPr>
+    </w:lvl>
+    <w:lvl w:ilvl="4" w:tplc="F150250A">
+      <w:start w:val="1"/>
+      <w:numFmt w:val="bullet"/>
+      <w:lvlText w:val="o"/>
+      <w:lvlJc w:val="left"/>
+      <w:pPr>
+        <w:ind w:left="3960" w:hanging="360"/>
+      </w:pPr>
+      <w:rPr>
+        <w:rFonts w:ascii="Courier New" w:hAnsi="Courier New" w:hint="default"/>
+      </w:rPr>
+    </w:lvl>
+    <w:lvl w:ilvl="5" w:tplc="5D3A16A4">
+      <w:start w:val="1"/>
+      <w:numFmt w:val="bullet"/>
+      <w:lvlText w:val=""/>
+      <w:lvlJc w:val="left"/>
+      <w:pPr>
+        <w:ind w:left="4680" w:hanging="360"/>
+      </w:pPr>
+      <w:rPr>
+        <w:rFonts w:ascii="Wingdings" w:hAnsi="Wingdings" w:hint="default"/>
+      </w:rPr>
+    </w:lvl>
+    <w:lvl w:ilvl="6" w:tplc="13A88D30">
+      <w:start w:val="1"/>
+      <w:numFmt w:val="bullet"/>
+      <w:lvlText w:val=""/>
+      <w:lvlJc w:val="left"/>
+      <w:pPr>
+        <w:ind w:left="5400" w:hanging="360"/>
+      </w:pPr>
+      <w:rPr>
+        <w:rFonts w:ascii="Symbol" w:hAnsi="Symbol" w:hint="default"/>
+      </w:rPr>
+    </w:lvl>
+    <w:lvl w:ilvl="7" w:tplc="F114323C">
+      <w:start w:val="1"/>
+      <w:numFmt w:val="bullet"/>
+      <w:lvlText w:val="o"/>
+      <w:lvlJc w:val="left"/>
+      <w:pPr>
+        <w:ind w:left="6120" w:hanging="360"/>
+      </w:pPr>
+      <w:rPr>
+        <w:rFonts w:ascii="Courier New" w:hAnsi="Courier New" w:hint="default"/>
+      </w:rPr>
+    </w:lvl>
+    <w:lvl w:ilvl="8" w:tplc="9C144612">
+      <w:start w:val="1"/>
+      <w:numFmt w:val="bullet"/>
+      <w:lvlText w:val=""/>
+      <w:lvlJc w:val="left"/>
+      <w:pPr>
+        <w:ind w:left="6840" w:hanging="360"/>
+      </w:pPr>
+      <w:rPr>
+        <w:rFonts w:ascii="Wingdings" w:hAnsi="Wingdings" w:hint="default"/>
+      </w:rPr>
+    </w:lvl>
+  </w:abstractNum>
+  <w:abstractNum w:abstractNumId="2" w15:restartNumberingAfterBreak="0">
+    <w:nsid w:val="0C52DA71"/>
+    <w:multiLevelType w:val="hybridMultilevel"/>
+    <w:tmpl w:val="12386AB0"/>
+    <w:lvl w:ilvl="0" w:tplc="63D8E09E">
+      <w:start w:val="1"/>
+      <w:numFmt w:val="bullet"/>
+      <w:lvlText w:val=""/>
+      <w:lvlJc w:val="left"/>
+      <w:pPr>
+        <w:ind w:left="1080" w:hanging="360"/>
+      </w:pPr>
+      <w:rPr>
+        <w:rFonts w:ascii="Symbol" w:hAnsi="Symbol" w:hint="default"/>
+      </w:rPr>
+    </w:lvl>
+    <w:lvl w:ilvl="1" w:tplc="99328C64">
+      <w:start w:val="1"/>
+      <w:numFmt w:val="bullet"/>
+      <w:lvlText w:val="o"/>
+      <w:lvlJc w:val="left"/>
+      <w:pPr>
+        <w:ind w:left="1800" w:hanging="360"/>
+      </w:pPr>
+      <w:rPr>
+        <w:rFonts w:ascii="Courier New" w:hAnsi="Courier New" w:hint="default"/>
+      </w:rPr>
+    </w:lvl>
+    <w:lvl w:ilvl="2" w:tplc="67744518">
+      <w:start w:val="1"/>
+      <w:numFmt w:val="bullet"/>
+      <w:lvlText w:val=""/>
+      <w:lvlJc w:val="left"/>
+      <w:pPr>
+        <w:ind w:left="2520" w:hanging="360"/>
+      </w:pPr>
+      <w:rPr>
+        <w:rFonts w:ascii="Wingdings" w:hAnsi="Wingdings" w:hint="default"/>
+      </w:rPr>
+    </w:lvl>
+    <w:lvl w:ilvl="3" w:tplc="2F961C1E">
+      <w:start w:val="1"/>
+      <w:numFmt w:val="bullet"/>
+      <w:lvlText w:val=""/>
+      <w:lvlJc w:val="left"/>
+      <w:pPr>
+        <w:ind w:left="3240" w:hanging="360"/>
+      </w:pPr>
+      <w:rPr>
+        <w:rFonts w:ascii="Symbol" w:hAnsi="Symbol" w:hint="default"/>
+      </w:rPr>
+    </w:lvl>
+    <w:lvl w:ilvl="4" w:tplc="0DD2A8B8">
+      <w:start w:val="1"/>
+      <w:numFmt w:val="bullet"/>
+      <w:lvlText w:val="o"/>
+      <w:lvlJc w:val="left"/>
+      <w:pPr>
+        <w:ind w:left="3960" w:hanging="360"/>
+      </w:pPr>
+      <w:rPr>
+        <w:rFonts w:ascii="Courier New" w:hAnsi="Courier New" w:hint="default"/>
+      </w:rPr>
+    </w:lvl>
+    <w:lvl w:ilvl="5" w:tplc="2F8A410A">
+      <w:start w:val="1"/>
+      <w:numFmt w:val="bullet"/>
+      <w:lvlText w:val=""/>
+      <w:lvlJc w:val="left"/>
+      <w:pPr>
+        <w:ind w:left="4680" w:hanging="360"/>
+      </w:pPr>
+      <w:rPr>
+        <w:rFonts w:ascii="Wingdings" w:hAnsi="Wingdings" w:hint="default"/>
+      </w:rPr>
+    </w:lvl>
+    <w:lvl w:ilvl="6" w:tplc="7744068E">
+      <w:start w:val="1"/>
+      <w:numFmt w:val="bullet"/>
+      <w:lvlText w:val=""/>
+      <w:lvlJc w:val="left"/>
+      <w:pPr>
+        <w:ind w:left="5400" w:hanging="360"/>
+      </w:pPr>
+      <w:rPr>
+        <w:rFonts w:ascii="Symbol" w:hAnsi="Symbol" w:hint="default"/>
+      </w:rPr>
+    </w:lvl>
+    <w:lvl w:ilvl="7" w:tplc="BC5A75E2">
+      <w:start w:val="1"/>
+      <w:numFmt w:val="bullet"/>
+      <w:lvlText w:val="o"/>
+      <w:lvlJc w:val="left"/>
+      <w:pPr>
+        <w:ind w:left="6120" w:hanging="360"/>
+      </w:pPr>
+      <w:rPr>
+        <w:rFonts w:ascii="Courier New" w:hAnsi="Courier New" w:hint="default"/>
+      </w:rPr>
+    </w:lvl>
+    <w:lvl w:ilvl="8" w:tplc="CF92C084">
+      <w:start w:val="1"/>
+      <w:numFmt w:val="bullet"/>
+      <w:lvlText w:val=""/>
+      <w:lvlJc w:val="left"/>
+      <w:pPr>
+        <w:ind w:left="6840" w:hanging="360"/>
+      </w:pPr>
+      <w:rPr>
+        <w:rFonts w:ascii="Wingdings" w:hAnsi="Wingdings" w:hint="default"/>
+      </w:rPr>
+    </w:lvl>
+  </w:abstractNum>
+  <w:abstractNum w:abstractNumId="3" w15:restartNumberingAfterBreak="0">
     <w:nsid w:val="0C7060FD"/>
     <w:multiLevelType w:val="hybridMultilevel"/>
     <w:tmpl w:val="F306C2C4"/>
@@ -11370,7 +12895,7 @@
       </w:pPr>
     </w:lvl>
   </w:abstractNum>
-  <w:abstractNum w:abstractNumId="2" w15:restartNumberingAfterBreak="0">
+  <w:abstractNum w:abstractNumId="4" w15:restartNumberingAfterBreak="0">
     <w:nsid w:val="133622D8"/>
     <w:multiLevelType w:val="multilevel"/>
     <w:tmpl w:val="D936658C"/>
@@ -11519,7 +13044,120 @@
       </w:rPr>
     </w:lvl>
   </w:abstractNum>
-  <w:abstractNum w:abstractNumId="3" w15:restartNumberingAfterBreak="0">
+  <w:abstractNum w:abstractNumId="5" w15:restartNumberingAfterBreak="0">
+    <w:nsid w:val="1398A58B"/>
+    <w:multiLevelType w:val="hybridMultilevel"/>
+    <w:tmpl w:val="58DC697E"/>
+    <w:lvl w:ilvl="0" w:tplc="73BC5438">
+      <w:start w:val="1"/>
+      <w:numFmt w:val="bullet"/>
+      <w:lvlText w:val=""/>
+      <w:lvlJc w:val="left"/>
+      <w:pPr>
+        <w:ind w:left="1080" w:hanging="360"/>
+      </w:pPr>
+      <w:rPr>
+        <w:rFonts w:ascii="Symbol" w:hAnsi="Symbol" w:hint="default"/>
+      </w:rPr>
+    </w:lvl>
+    <w:lvl w:ilvl="1" w:tplc="54F23DCE">
+      <w:start w:val="1"/>
+      <w:numFmt w:val="bullet"/>
+      <w:lvlText w:val="o"/>
+      <w:lvlJc w:val="left"/>
+      <w:pPr>
+        <w:ind w:left="1800" w:hanging="360"/>
+      </w:pPr>
+      <w:rPr>
+        <w:rFonts w:ascii="Courier New" w:hAnsi="Courier New" w:hint="default"/>
+      </w:rPr>
+    </w:lvl>
+    <w:lvl w:ilvl="2" w:tplc="5B7039B4">
+      <w:start w:val="1"/>
+      <w:numFmt w:val="bullet"/>
+      <w:lvlText w:val=""/>
+      <w:lvlJc w:val="left"/>
+      <w:pPr>
+        <w:ind w:left="2520" w:hanging="360"/>
+      </w:pPr>
+      <w:rPr>
+        <w:rFonts w:ascii="Wingdings" w:hAnsi="Wingdings" w:hint="default"/>
+      </w:rPr>
+    </w:lvl>
+    <w:lvl w:ilvl="3" w:tplc="1F4E5718">
+      <w:start w:val="1"/>
+      <w:numFmt w:val="bullet"/>
+      <w:lvlText w:val=""/>
+      <w:lvlJc w:val="left"/>
+      <w:pPr>
+        <w:ind w:left="3240" w:hanging="360"/>
+      </w:pPr>
+      <w:rPr>
+        <w:rFonts w:ascii="Symbol" w:hAnsi="Symbol" w:hint="default"/>
+      </w:rPr>
+    </w:lvl>
+    <w:lvl w:ilvl="4" w:tplc="937A256A">
+      <w:start w:val="1"/>
+      <w:numFmt w:val="bullet"/>
+      <w:lvlText w:val="o"/>
+      <w:lvlJc w:val="left"/>
+      <w:pPr>
+        <w:ind w:left="3960" w:hanging="360"/>
+      </w:pPr>
+      <w:rPr>
+        <w:rFonts w:ascii="Courier New" w:hAnsi="Courier New" w:hint="default"/>
+      </w:rPr>
+    </w:lvl>
+    <w:lvl w:ilvl="5" w:tplc="965CE30A">
+      <w:start w:val="1"/>
+      <w:numFmt w:val="bullet"/>
+      <w:lvlText w:val=""/>
+      <w:lvlJc w:val="left"/>
+      <w:pPr>
+        <w:ind w:left="4680" w:hanging="360"/>
+      </w:pPr>
+      <w:rPr>
+        <w:rFonts w:ascii="Wingdings" w:hAnsi="Wingdings" w:hint="default"/>
+      </w:rPr>
+    </w:lvl>
+    <w:lvl w:ilvl="6" w:tplc="8CFE8172">
+      <w:start w:val="1"/>
+      <w:numFmt w:val="bullet"/>
+      <w:lvlText w:val=""/>
+      <w:lvlJc w:val="left"/>
+      <w:pPr>
+        <w:ind w:left="5400" w:hanging="360"/>
+      </w:pPr>
+      <w:rPr>
+        <w:rFonts w:ascii="Symbol" w:hAnsi="Symbol" w:hint="default"/>
+      </w:rPr>
+    </w:lvl>
+    <w:lvl w:ilvl="7" w:tplc="742A071A">
+      <w:start w:val="1"/>
+      <w:numFmt w:val="bullet"/>
+      <w:lvlText w:val="o"/>
+      <w:lvlJc w:val="left"/>
+      <w:pPr>
+        <w:ind w:left="6120" w:hanging="360"/>
+      </w:pPr>
+      <w:rPr>
+        <w:rFonts w:ascii="Courier New" w:hAnsi="Courier New" w:hint="default"/>
+      </w:rPr>
+    </w:lvl>
+    <w:lvl w:ilvl="8" w:tplc="B7EA1242">
+      <w:start w:val="1"/>
+      <w:numFmt w:val="bullet"/>
+      <w:lvlText w:val=""/>
+      <w:lvlJc w:val="left"/>
+      <w:pPr>
+        <w:ind w:left="6840" w:hanging="360"/>
+      </w:pPr>
+      <w:rPr>
+        <w:rFonts w:ascii="Wingdings" w:hAnsi="Wingdings" w:hint="default"/>
+      </w:rPr>
+    </w:lvl>
+  </w:abstractNum>
+  <w:abstractNum w:abstractNumId="6" w15:restartNumberingAfterBreak="0">
     <w:nsid w:val="157E3763"/>
     <w:multiLevelType w:val="multilevel"/>
     <w:tmpl w:val="0A54AD5E"/>
@@ -11632,7 +13270,7 @@
       </w:pPr>
     </w:lvl>
   </w:abstractNum>
-  <w:abstractNum w:abstractNumId="4" w15:restartNumberingAfterBreak="0">
+  <w:abstractNum w:abstractNumId="7" w15:restartNumberingAfterBreak="0">
     <w:nsid w:val="1B5E1F21"/>
     <w:multiLevelType w:val="multilevel"/>
     <w:tmpl w:val="25B6F8BA"/>
@@ -11745,7 +13383,120 @@
       </w:pPr>
     </w:lvl>
   </w:abstractNum>
-  <w:abstractNum w:abstractNumId="5" w15:restartNumberingAfterBreak="0">
+  <w:abstractNum w:abstractNumId="8" w15:restartNumberingAfterBreak="0">
+    <w:nsid w:val="1BCE40BA"/>
+    <w:multiLevelType w:val="hybridMultilevel"/>
+    <w:tmpl w:val="B70E1114"/>
+    <w:lvl w:ilvl="0" w:tplc="E18AEEB8">
+      <w:start w:val="1"/>
+      <w:numFmt w:val="bullet"/>
+      <w:lvlText w:val=""/>
+      <w:lvlJc w:val="left"/>
+      <w:pPr>
+        <w:ind w:left="1080" w:hanging="360"/>
+      </w:pPr>
+      <w:rPr>
+        <w:rFonts w:ascii="Symbol" w:hAnsi="Symbol" w:hint="default"/>
+      </w:rPr>
+    </w:lvl>
+    <w:lvl w:ilvl="1" w:tplc="B1744470">
+      <w:start w:val="1"/>
+      <w:numFmt w:val="bullet"/>
+      <w:lvlText w:val="o"/>
+      <w:lvlJc w:val="left"/>
+      <w:pPr>
+        <w:ind w:left="1800" w:hanging="360"/>
+      </w:pPr>
+      <w:rPr>
+        <w:rFonts w:ascii="Courier New" w:hAnsi="Courier New" w:hint="default"/>
+      </w:rPr>
+    </w:lvl>
+    <w:lvl w:ilvl="2" w:tplc="03FAECD8">
+      <w:start w:val="1"/>
+      <w:numFmt w:val="bullet"/>
+      <w:lvlText w:val=""/>
+      <w:lvlJc w:val="left"/>
+      <w:pPr>
+        <w:ind w:left="2520" w:hanging="360"/>
+      </w:pPr>
+      <w:rPr>
+        <w:rFonts w:ascii="Wingdings" w:hAnsi="Wingdings" w:hint="default"/>
+      </w:rPr>
+    </w:lvl>
+    <w:lvl w:ilvl="3" w:tplc="D8A6046A">
+      <w:start w:val="1"/>
+      <w:numFmt w:val="bullet"/>
+      <w:lvlText w:val=""/>
+      <w:lvlJc w:val="left"/>
+      <w:pPr>
+        <w:ind w:left="3240" w:hanging="360"/>
+      </w:pPr>
+      <w:rPr>
+        <w:rFonts w:ascii="Symbol" w:hAnsi="Symbol" w:hint="default"/>
+      </w:rPr>
+    </w:lvl>
+    <w:lvl w:ilvl="4" w:tplc="8F705C70">
+      <w:start w:val="1"/>
+      <w:numFmt w:val="bullet"/>
+      <w:lvlText w:val="o"/>
+      <w:lvlJc w:val="left"/>
+      <w:pPr>
+        <w:ind w:left="3960" w:hanging="360"/>
+      </w:pPr>
+      <w:rPr>
+        <w:rFonts w:ascii="Courier New" w:hAnsi="Courier New" w:hint="default"/>
+      </w:rPr>
+    </w:lvl>
+    <w:lvl w:ilvl="5" w:tplc="B018F506">
+      <w:start w:val="1"/>
+      <w:numFmt w:val="bullet"/>
+      <w:lvlText w:val=""/>
+      <w:lvlJc w:val="left"/>
+      <w:pPr>
+        <w:ind w:left="4680" w:hanging="360"/>
+      </w:pPr>
+      <w:rPr>
+        <w:rFonts w:ascii="Wingdings" w:hAnsi="Wingdings" w:hint="default"/>
+      </w:rPr>
+    </w:lvl>
+    <w:lvl w:ilvl="6" w:tplc="673CEB20">
+      <w:start w:val="1"/>
+      <w:numFmt w:val="bullet"/>
+      <w:lvlText w:val=""/>
+      <w:lvlJc w:val="left"/>
+      <w:pPr>
+        <w:ind w:left="5400" w:hanging="360"/>
+      </w:pPr>
+      <w:rPr>
+        <w:rFonts w:ascii="Symbol" w:hAnsi="Symbol" w:hint="default"/>
+      </w:rPr>
+    </w:lvl>
+    <w:lvl w:ilvl="7" w:tplc="C0C4C1EE">
+      <w:start w:val="1"/>
+      <w:numFmt w:val="bullet"/>
+      <w:lvlText w:val="o"/>
+      <w:lvlJc w:val="left"/>
+      <w:pPr>
+        <w:ind w:left="6120" w:hanging="360"/>
+      </w:pPr>
+      <w:rPr>
+        <w:rFonts w:ascii="Courier New" w:hAnsi="Courier New" w:hint="default"/>
+      </w:rPr>
+    </w:lvl>
+    <w:lvl w:ilvl="8" w:tplc="7AF2F676">
+      <w:start w:val="1"/>
+      <w:numFmt w:val="bullet"/>
+      <w:lvlText w:val=""/>
+      <w:lvlJc w:val="left"/>
+      <w:pPr>
+        <w:ind w:left="6840" w:hanging="360"/>
+      </w:pPr>
+      <w:rPr>
+        <w:rFonts w:ascii="Wingdings" w:hAnsi="Wingdings" w:hint="default"/>
+      </w:rPr>
+    </w:lvl>
+  </w:abstractNum>
+  <w:abstractNum w:abstractNumId="9" w15:restartNumberingAfterBreak="0">
     <w:nsid w:val="1C6B5A35"/>
     <w:multiLevelType w:val="multilevel"/>
     <w:tmpl w:val="EAB4A1EA"/>
@@ -11858,7 +13609,7 @@
       </w:pPr>
     </w:lvl>
   </w:abstractNum>
-  <w:abstractNum w:abstractNumId="6" w15:restartNumberingAfterBreak="0">
+  <w:abstractNum w:abstractNumId="10" w15:restartNumberingAfterBreak="0">
     <w:nsid w:val="1ED80C24"/>
     <w:multiLevelType w:val="multilevel"/>
     <w:tmpl w:val="D21E5446"/>
@@ -11971,7 +13722,7 @@
       </w:pPr>
     </w:lvl>
   </w:abstractNum>
-  <w:abstractNum w:abstractNumId="7" w15:restartNumberingAfterBreak="0">
+  <w:abstractNum w:abstractNumId="11" w15:restartNumberingAfterBreak="0">
     <w:nsid w:val="1EF4366F"/>
     <w:multiLevelType w:val="multilevel"/>
     <w:tmpl w:val="06820DDE"/>
@@ -12084,7 +13835,7 @@
       </w:pPr>
     </w:lvl>
   </w:abstractNum>
-  <w:abstractNum w:abstractNumId="8" w15:restartNumberingAfterBreak="0">
+  <w:abstractNum w:abstractNumId="12" w15:restartNumberingAfterBreak="0">
     <w:nsid w:val="1FBF299E"/>
     <w:multiLevelType w:val="multilevel"/>
     <w:tmpl w:val="BE927292"/>
@@ -12197,7 +13948,7 @@
       </w:pPr>
     </w:lvl>
   </w:abstractNum>
-  <w:abstractNum w:abstractNumId="9" w15:restartNumberingAfterBreak="0">
+  <w:abstractNum w:abstractNumId="13" w15:restartNumberingAfterBreak="0">
     <w:nsid w:val="21E75EF0"/>
     <w:multiLevelType w:val="multilevel"/>
     <w:tmpl w:val="F38838B6"/>
@@ -12310,7 +14061,7 @@
       </w:pPr>
     </w:lvl>
   </w:abstractNum>
-  <w:abstractNum w:abstractNumId="10" w15:restartNumberingAfterBreak="0">
+  <w:abstractNum w:abstractNumId="14" w15:restartNumberingAfterBreak="0">
     <w:nsid w:val="244D5E8D"/>
     <w:multiLevelType w:val="multilevel"/>
     <w:tmpl w:val="489265F2"/>
@@ -12423,7 +14174,7 @@
       </w:pPr>
     </w:lvl>
   </w:abstractNum>
-  <w:abstractNum w:abstractNumId="11" w15:restartNumberingAfterBreak="0">
+  <w:abstractNum w:abstractNumId="15" w15:restartNumberingAfterBreak="0">
     <w:nsid w:val="259163C5"/>
     <w:multiLevelType w:val="multilevel"/>
     <w:tmpl w:val="89089316"/>
@@ -12572,7 +14323,7 @@
       </w:rPr>
     </w:lvl>
   </w:abstractNum>
-  <w:abstractNum w:abstractNumId="12" w15:restartNumberingAfterBreak="0">
+  <w:abstractNum w:abstractNumId="16" w15:restartNumberingAfterBreak="0">
     <w:nsid w:val="29EC6DE1"/>
     <w:multiLevelType w:val="hybridMultilevel"/>
     <w:tmpl w:val="79E47F00"/>
@@ -12661,7 +14412,7 @@
       </w:pPr>
     </w:lvl>
   </w:abstractNum>
-  <w:abstractNum w:abstractNumId="13" w15:restartNumberingAfterBreak="0">
+  <w:abstractNum w:abstractNumId="17" w15:restartNumberingAfterBreak="0">
     <w:nsid w:val="2D7232DF"/>
     <w:multiLevelType w:val="multilevel"/>
     <w:tmpl w:val="B1A80E5E"/>
@@ -12810,7 +14561,7 @@
       </w:rPr>
     </w:lvl>
   </w:abstractNum>
-  <w:abstractNum w:abstractNumId="14" w15:restartNumberingAfterBreak="0">
+  <w:abstractNum w:abstractNumId="18" w15:restartNumberingAfterBreak="0">
     <w:nsid w:val="30DD505F"/>
     <w:multiLevelType w:val="hybridMultilevel"/>
     <w:tmpl w:val="1ADA9CCA"/>
@@ -12896,7 +14647,7 @@
       </w:pPr>
     </w:lvl>
   </w:abstractNum>
-  <w:abstractNum w:abstractNumId="15" w15:restartNumberingAfterBreak="0">
+  <w:abstractNum w:abstractNumId="19" w15:restartNumberingAfterBreak="0">
     <w:nsid w:val="31A70FD3"/>
     <w:multiLevelType w:val="hybridMultilevel"/>
     <w:tmpl w:val="6AB41DEC"/>
@@ -13009,7 +14760,7 @@
       </w:rPr>
     </w:lvl>
   </w:abstractNum>
-  <w:abstractNum w:abstractNumId="16" w15:restartNumberingAfterBreak="0">
+  <w:abstractNum w:abstractNumId="20" w15:restartNumberingAfterBreak="0">
     <w:nsid w:val="34FA2AE1"/>
     <w:multiLevelType w:val="multilevel"/>
     <w:tmpl w:val="48E034B2"/>
@@ -13158,7 +14909,7 @@
       </w:rPr>
     </w:lvl>
   </w:abstractNum>
-  <w:abstractNum w:abstractNumId="17" w15:restartNumberingAfterBreak="0">
+  <w:abstractNum w:abstractNumId="21" w15:restartNumberingAfterBreak="0">
     <w:nsid w:val="359C59A7"/>
     <w:multiLevelType w:val="multilevel"/>
     <w:tmpl w:val="35A44F20"/>
@@ -13271,7 +15022,7 @@
       </w:pPr>
     </w:lvl>
   </w:abstractNum>
-  <w:abstractNum w:abstractNumId="18" w15:restartNumberingAfterBreak="0">
+  <w:abstractNum w:abstractNumId="22" w15:restartNumberingAfterBreak="0">
     <w:nsid w:val="395C3AD6"/>
     <w:multiLevelType w:val="hybridMultilevel"/>
     <w:tmpl w:val="E82ED508"/>
@@ -13357,7 +15108,7 @@
       </w:pPr>
     </w:lvl>
   </w:abstractNum>
-  <w:abstractNum w:abstractNumId="19" w15:restartNumberingAfterBreak="0">
+  <w:abstractNum w:abstractNumId="23" w15:restartNumberingAfterBreak="0">
     <w:nsid w:val="3A0E5B63"/>
     <w:multiLevelType w:val="multilevel"/>
     <w:tmpl w:val="406E0ECE"/>
@@ -13470,7 +15221,7 @@
       </w:pPr>
     </w:lvl>
   </w:abstractNum>
-  <w:abstractNum w:abstractNumId="20" w15:restartNumberingAfterBreak="0">
+  <w:abstractNum w:abstractNumId="24" w15:restartNumberingAfterBreak="0">
     <w:nsid w:val="3B532559"/>
     <w:multiLevelType w:val="multilevel"/>
     <w:tmpl w:val="F34E92E6"/>
@@ -13583,7 +15334,120 @@
       </w:pPr>
     </w:lvl>
   </w:abstractNum>
-  <w:abstractNum w:abstractNumId="21" w15:restartNumberingAfterBreak="0">
+  <w:abstractNum w:abstractNumId="25" w15:restartNumberingAfterBreak="0">
+    <w:nsid w:val="3B78CD3F"/>
+    <w:multiLevelType w:val="hybridMultilevel"/>
+    <w:tmpl w:val="20EC69CE"/>
+    <w:lvl w:ilvl="0" w:tplc="5AFA9428">
+      <w:start w:val="1"/>
+      <w:numFmt w:val="bullet"/>
+      <w:lvlText w:val=""/>
+      <w:lvlJc w:val="left"/>
+      <w:pPr>
+        <w:ind w:left="1080" w:hanging="360"/>
+      </w:pPr>
+      <w:rPr>
+        <w:rFonts w:ascii="Symbol" w:hAnsi="Symbol" w:hint="default"/>
+      </w:rPr>
+    </w:lvl>
+    <w:lvl w:ilvl="1" w:tplc="36781F74">
+      <w:start w:val="1"/>
+      <w:numFmt w:val="bullet"/>
+      <w:lvlText w:val="o"/>
+      <w:lvlJc w:val="left"/>
+      <w:pPr>
+        <w:ind w:left="1800" w:hanging="360"/>
+      </w:pPr>
+      <w:rPr>
+        <w:rFonts w:ascii="Courier New" w:hAnsi="Courier New" w:hint="default"/>
+      </w:rPr>
+    </w:lvl>
+    <w:lvl w:ilvl="2" w:tplc="2368C080">
+      <w:start w:val="1"/>
+      <w:numFmt w:val="bullet"/>
+      <w:lvlText w:val=""/>
+      <w:lvlJc w:val="left"/>
+      <w:pPr>
+        <w:ind w:left="2520" w:hanging="360"/>
+      </w:pPr>
+      <w:rPr>
+        <w:rFonts w:ascii="Wingdings" w:hAnsi="Wingdings" w:hint="default"/>
+      </w:rPr>
+    </w:lvl>
+    <w:lvl w:ilvl="3" w:tplc="8ADC80EC">
+      <w:start w:val="1"/>
+      <w:numFmt w:val="bullet"/>
+      <w:lvlText w:val=""/>
+      <w:lvlJc w:val="left"/>
+      <w:pPr>
+        <w:ind w:left="3240" w:hanging="360"/>
+      </w:pPr>
+      <w:rPr>
+        <w:rFonts w:ascii="Symbol" w:hAnsi="Symbol" w:hint="default"/>
+      </w:rPr>
+    </w:lvl>
+    <w:lvl w:ilvl="4" w:tplc="53E62E2E">
+      <w:start w:val="1"/>
+      <w:numFmt w:val="bullet"/>
+      <w:lvlText w:val="o"/>
+      <w:lvlJc w:val="left"/>
+      <w:pPr>
+        <w:ind w:left="3960" w:hanging="360"/>
+      </w:pPr>
+      <w:rPr>
+        <w:rFonts w:ascii="Courier New" w:hAnsi="Courier New" w:hint="default"/>
+      </w:rPr>
+    </w:lvl>
+    <w:lvl w:ilvl="5" w:tplc="2250A7F2">
+      <w:start w:val="1"/>
+      <w:numFmt w:val="bullet"/>
+      <w:lvlText w:val=""/>
+      <w:lvlJc w:val="left"/>
+      <w:pPr>
+        <w:ind w:left="4680" w:hanging="360"/>
+      </w:pPr>
+      <w:rPr>
+        <w:rFonts w:ascii="Wingdings" w:hAnsi="Wingdings" w:hint="default"/>
+      </w:rPr>
+    </w:lvl>
+    <w:lvl w:ilvl="6" w:tplc="628E65AA">
+      <w:start w:val="1"/>
+      <w:numFmt w:val="bullet"/>
+      <w:lvlText w:val=""/>
+      <w:lvlJc w:val="left"/>
+      <w:pPr>
+        <w:ind w:left="5400" w:hanging="360"/>
+      </w:pPr>
+      <w:rPr>
+        <w:rFonts w:ascii="Symbol" w:hAnsi="Symbol" w:hint="default"/>
+      </w:rPr>
+    </w:lvl>
+    <w:lvl w:ilvl="7" w:tplc="C602DE62">
+      <w:start w:val="1"/>
+      <w:numFmt w:val="bullet"/>
+      <w:lvlText w:val="o"/>
+      <w:lvlJc w:val="left"/>
+      <w:pPr>
+        <w:ind w:left="6120" w:hanging="360"/>
+      </w:pPr>
+      <w:rPr>
+        <w:rFonts w:ascii="Courier New" w:hAnsi="Courier New" w:hint="default"/>
+      </w:rPr>
+    </w:lvl>
+    <w:lvl w:ilvl="8" w:tplc="0388C45C">
+      <w:start w:val="1"/>
+      <w:numFmt w:val="bullet"/>
+      <w:lvlText w:val=""/>
+      <w:lvlJc w:val="left"/>
+      <w:pPr>
+        <w:ind w:left="6840" w:hanging="360"/>
+      </w:pPr>
+      <w:rPr>
+        <w:rFonts w:ascii="Wingdings" w:hAnsi="Wingdings" w:hint="default"/>
+      </w:rPr>
+    </w:lvl>
+  </w:abstractNum>
+  <w:abstractNum w:abstractNumId="26" w15:restartNumberingAfterBreak="0">
     <w:nsid w:val="3BA61E78"/>
     <w:multiLevelType w:val="multilevel"/>
     <w:tmpl w:val="13BA2426"/>
@@ -13696,7 +15560,7 @@
       </w:pPr>
     </w:lvl>
   </w:abstractNum>
-  <w:abstractNum w:abstractNumId="22" w15:restartNumberingAfterBreak="0">
+  <w:abstractNum w:abstractNumId="27" w15:restartNumberingAfterBreak="0">
     <w:nsid w:val="3D3C788A"/>
     <w:multiLevelType w:val="multilevel"/>
     <w:tmpl w:val="153CF86E"/>
@@ -13809,7 +15673,7 @@
       </w:pPr>
     </w:lvl>
   </w:abstractNum>
-  <w:abstractNum w:abstractNumId="23" w15:restartNumberingAfterBreak="0">
+  <w:abstractNum w:abstractNumId="28" w15:restartNumberingAfterBreak="0">
     <w:nsid w:val="3D5A6609"/>
     <w:multiLevelType w:val="multilevel"/>
     <w:tmpl w:val="5F0A83C2"/>
@@ -13922,7 +15786,7 @@
       </w:pPr>
     </w:lvl>
   </w:abstractNum>
-  <w:abstractNum w:abstractNumId="24" w15:restartNumberingAfterBreak="0">
+  <w:abstractNum w:abstractNumId="29" w15:restartNumberingAfterBreak="0">
     <w:nsid w:val="40606B53"/>
     <w:multiLevelType w:val="multilevel"/>
     <w:tmpl w:val="2B86075C"/>
@@ -14035,7 +15899,120 @@
       </w:pPr>
     </w:lvl>
   </w:abstractNum>
-  <w:abstractNum w:abstractNumId="25" w15:restartNumberingAfterBreak="0">
+  <w:abstractNum w:abstractNumId="30" w15:restartNumberingAfterBreak="0">
+    <w:nsid w:val="4113F500"/>
+    <w:multiLevelType w:val="hybridMultilevel"/>
+    <w:tmpl w:val="19C894FC"/>
+    <w:lvl w:ilvl="0" w:tplc="2EE2D9E8">
+      <w:start w:val="1"/>
+      <w:numFmt w:val="bullet"/>
+      <w:lvlText w:val=""/>
+      <w:lvlJc w:val="left"/>
+      <w:pPr>
+        <w:ind w:left="1080" w:hanging="360"/>
+      </w:pPr>
+      <w:rPr>
+        <w:rFonts w:ascii="Symbol" w:hAnsi="Symbol" w:hint="default"/>
+      </w:rPr>
+    </w:lvl>
+    <w:lvl w:ilvl="1" w:tplc="388A9248">
+      <w:start w:val="1"/>
+      <w:numFmt w:val="bullet"/>
+      <w:lvlText w:val="o"/>
+      <w:lvlJc w:val="left"/>
+      <w:pPr>
+        <w:ind w:left="1800" w:hanging="360"/>
+      </w:pPr>
+      <w:rPr>
+        <w:rFonts w:ascii="Courier New" w:hAnsi="Courier New" w:hint="default"/>
+      </w:rPr>
+    </w:lvl>
+    <w:lvl w:ilvl="2" w:tplc="5950AC60">
+      <w:start w:val="1"/>
+      <w:numFmt w:val="bullet"/>
+      <w:lvlText w:val=""/>
+      <w:lvlJc w:val="left"/>
+      <w:pPr>
+        <w:ind w:left="2520" w:hanging="360"/>
+      </w:pPr>
+      <w:rPr>
+        <w:rFonts w:ascii="Wingdings" w:hAnsi="Wingdings" w:hint="default"/>
+      </w:rPr>
+    </w:lvl>
+    <w:lvl w:ilvl="3" w:tplc="5464EBF8">
+      <w:start w:val="1"/>
+      <w:numFmt w:val="bullet"/>
+      <w:lvlText w:val=""/>
+      <w:lvlJc w:val="left"/>
+      <w:pPr>
+        <w:ind w:left="3240" w:hanging="360"/>
+      </w:pPr>
+      <w:rPr>
+        <w:rFonts w:ascii="Symbol" w:hAnsi="Symbol" w:hint="default"/>
+      </w:rPr>
+    </w:lvl>
+    <w:lvl w:ilvl="4" w:tplc="3C32BE04">
+      <w:start w:val="1"/>
+      <w:numFmt w:val="bullet"/>
+      <w:lvlText w:val="o"/>
+      <w:lvlJc w:val="left"/>
+      <w:pPr>
+        <w:ind w:left="3960" w:hanging="360"/>
+      </w:pPr>
+      <w:rPr>
+        <w:rFonts w:ascii="Courier New" w:hAnsi="Courier New" w:hint="default"/>
+      </w:rPr>
+    </w:lvl>
+    <w:lvl w:ilvl="5" w:tplc="2F9828E6">
+      <w:start w:val="1"/>
+      <w:numFmt w:val="bullet"/>
+      <w:lvlText w:val=""/>
+      <w:lvlJc w:val="left"/>
+      <w:pPr>
+        <w:ind w:left="4680" w:hanging="360"/>
+      </w:pPr>
+      <w:rPr>
+        <w:rFonts w:ascii="Wingdings" w:hAnsi="Wingdings" w:hint="default"/>
+      </w:rPr>
+    </w:lvl>
+    <w:lvl w:ilvl="6" w:tplc="62D4FDDA">
+      <w:start w:val="1"/>
+      <w:numFmt w:val="bullet"/>
+      <w:lvlText w:val=""/>
+      <w:lvlJc w:val="left"/>
+      <w:pPr>
+        <w:ind w:left="5400" w:hanging="360"/>
+      </w:pPr>
+      <w:rPr>
+        <w:rFonts w:ascii="Symbol" w:hAnsi="Symbol" w:hint="default"/>
+      </w:rPr>
+    </w:lvl>
+    <w:lvl w:ilvl="7" w:tplc="5E1CE23C">
+      <w:start w:val="1"/>
+      <w:numFmt w:val="bullet"/>
+      <w:lvlText w:val="o"/>
+      <w:lvlJc w:val="left"/>
+      <w:pPr>
+        <w:ind w:left="6120" w:hanging="360"/>
+      </w:pPr>
+      <w:rPr>
+        <w:rFonts w:ascii="Courier New" w:hAnsi="Courier New" w:hint="default"/>
+      </w:rPr>
+    </w:lvl>
+    <w:lvl w:ilvl="8" w:tplc="9C02A858">
+      <w:start w:val="1"/>
+      <w:numFmt w:val="bullet"/>
+      <w:lvlText w:val=""/>
+      <w:lvlJc w:val="left"/>
+      <w:pPr>
+        <w:ind w:left="6840" w:hanging="360"/>
+      </w:pPr>
+      <w:rPr>
+        <w:rFonts w:ascii="Wingdings" w:hAnsi="Wingdings" w:hint="default"/>
+      </w:rPr>
+    </w:lvl>
+  </w:abstractNum>
+  <w:abstractNum w:abstractNumId="31" w15:restartNumberingAfterBreak="0">
     <w:nsid w:val="436C4392"/>
     <w:multiLevelType w:val="multilevel"/>
     <w:tmpl w:val="FEEE811E"/>
@@ -14184,7 +16161,7 @@
       </w:rPr>
     </w:lvl>
   </w:abstractNum>
-  <w:abstractNum w:abstractNumId="26" w15:restartNumberingAfterBreak="0">
+  <w:abstractNum w:abstractNumId="32" w15:restartNumberingAfterBreak="0">
     <w:nsid w:val="47D330E4"/>
     <w:multiLevelType w:val="hybridMultilevel"/>
     <w:tmpl w:val="BE6A890C"/>
@@ -14274,7 +16251,7 @@
       </w:pPr>
     </w:lvl>
   </w:abstractNum>
-  <w:abstractNum w:abstractNumId="27" w15:restartNumberingAfterBreak="0">
+  <w:abstractNum w:abstractNumId="33" w15:restartNumberingAfterBreak="0">
     <w:nsid w:val="47E90250"/>
     <w:multiLevelType w:val="multilevel"/>
     <w:tmpl w:val="E58CB294"/>
@@ -14423,7 +16400,120 @@
       </w:rPr>
     </w:lvl>
   </w:abstractNum>
-  <w:abstractNum w:abstractNumId="28" w15:restartNumberingAfterBreak="0">
+  <w:abstractNum w:abstractNumId="34" w15:restartNumberingAfterBreak="0">
+    <w:nsid w:val="484FD024"/>
+    <w:multiLevelType w:val="hybridMultilevel"/>
+    <w:tmpl w:val="1952CC2C"/>
+    <w:lvl w:ilvl="0" w:tplc="545CC324">
+      <w:start w:val="1"/>
+      <w:numFmt w:val="bullet"/>
+      <w:lvlText w:val=""/>
+      <w:lvlJc w:val="left"/>
+      <w:pPr>
+        <w:ind w:left="1080" w:hanging="360"/>
+      </w:pPr>
+      <w:rPr>
+        <w:rFonts w:ascii="Symbol" w:hAnsi="Symbol" w:hint="default"/>
+      </w:rPr>
+    </w:lvl>
+    <w:lvl w:ilvl="1" w:tplc="B2CE0262">
+      <w:start w:val="1"/>
+      <w:numFmt w:val="bullet"/>
+      <w:lvlText w:val="o"/>
+      <w:lvlJc w:val="left"/>
+      <w:pPr>
+        <w:ind w:left="1800" w:hanging="360"/>
+      </w:pPr>
+      <w:rPr>
+        <w:rFonts w:ascii="Courier New" w:hAnsi="Courier New" w:hint="default"/>
+      </w:rPr>
+    </w:lvl>
+    <w:lvl w:ilvl="2" w:tplc="DC1A533A">
+      <w:start w:val="1"/>
+      <w:numFmt w:val="bullet"/>
+      <w:lvlText w:val=""/>
+      <w:lvlJc w:val="left"/>
+      <w:pPr>
+        <w:ind w:left="2520" w:hanging="360"/>
+      </w:pPr>
+      <w:rPr>
+        <w:rFonts w:ascii="Wingdings" w:hAnsi="Wingdings" w:hint="default"/>
+      </w:rPr>
+    </w:lvl>
+    <w:lvl w:ilvl="3" w:tplc="63C040D4">
+      <w:start w:val="1"/>
+      <w:numFmt w:val="bullet"/>
+      <w:lvlText w:val=""/>
+      <w:lvlJc w:val="left"/>
+      <w:pPr>
+        <w:ind w:left="3240" w:hanging="360"/>
+      </w:pPr>
+      <w:rPr>
+        <w:rFonts w:ascii="Symbol" w:hAnsi="Symbol" w:hint="default"/>
+      </w:rPr>
+    </w:lvl>
+    <w:lvl w:ilvl="4" w:tplc="65C4AF56">
+      <w:start w:val="1"/>
+      <w:numFmt w:val="bullet"/>
+      <w:lvlText w:val="o"/>
+      <w:lvlJc w:val="left"/>
+      <w:pPr>
+        <w:ind w:left="3960" w:hanging="360"/>
+      </w:pPr>
+      <w:rPr>
+        <w:rFonts w:ascii="Courier New" w:hAnsi="Courier New" w:hint="default"/>
+      </w:rPr>
+    </w:lvl>
+    <w:lvl w:ilvl="5" w:tplc="FC40B248">
+      <w:start w:val="1"/>
+      <w:numFmt w:val="bullet"/>
+      <w:lvlText w:val=""/>
+      <w:lvlJc w:val="left"/>
+      <w:pPr>
+        <w:ind w:left="4680" w:hanging="360"/>
+      </w:pPr>
+      <w:rPr>
+        <w:rFonts w:ascii="Wingdings" w:hAnsi="Wingdings" w:hint="default"/>
+      </w:rPr>
+    </w:lvl>
+    <w:lvl w:ilvl="6" w:tplc="EDEE69A0">
+      <w:start w:val="1"/>
+      <w:numFmt w:val="bullet"/>
+      <w:lvlText w:val=""/>
+      <w:lvlJc w:val="left"/>
+      <w:pPr>
+        <w:ind w:left="5400" w:hanging="360"/>
+      </w:pPr>
+      <w:rPr>
+        <w:rFonts w:ascii="Symbol" w:hAnsi="Symbol" w:hint="default"/>
+      </w:rPr>
+    </w:lvl>
+    <w:lvl w:ilvl="7" w:tplc="A3824C1A">
+      <w:start w:val="1"/>
+      <w:numFmt w:val="bullet"/>
+      <w:lvlText w:val="o"/>
+      <w:lvlJc w:val="left"/>
+      <w:pPr>
+        <w:ind w:left="6120" w:hanging="360"/>
+      </w:pPr>
+      <w:rPr>
+        <w:rFonts w:ascii="Courier New" w:hAnsi="Courier New" w:hint="default"/>
+      </w:rPr>
+    </w:lvl>
+    <w:lvl w:ilvl="8" w:tplc="FC3AC064">
+      <w:start w:val="1"/>
+      <w:numFmt w:val="bullet"/>
+      <w:lvlText w:val=""/>
+      <w:lvlJc w:val="left"/>
+      <w:pPr>
+        <w:ind w:left="6840" w:hanging="360"/>
+      </w:pPr>
+      <w:rPr>
+        <w:rFonts w:ascii="Wingdings" w:hAnsi="Wingdings" w:hint="default"/>
+      </w:rPr>
+    </w:lvl>
+  </w:abstractNum>
+  <w:abstractNum w:abstractNumId="35" w15:restartNumberingAfterBreak="0">
     <w:nsid w:val="48AE042F"/>
     <w:multiLevelType w:val="multilevel"/>
     <w:tmpl w:val="80027492"/>
@@ -14572,7 +16662,7 @@
       </w:rPr>
     </w:lvl>
   </w:abstractNum>
-  <w:abstractNum w:abstractNumId="29" w15:restartNumberingAfterBreak="0">
+  <w:abstractNum w:abstractNumId="36" w15:restartNumberingAfterBreak="0">
     <w:nsid w:val="48BE6BCA"/>
     <w:multiLevelType w:val="hybridMultilevel"/>
     <w:tmpl w:val="FE6ABC58"/>
@@ -14661,7 +16751,7 @@
       </w:pPr>
     </w:lvl>
   </w:abstractNum>
-  <w:abstractNum w:abstractNumId="30" w15:restartNumberingAfterBreak="0">
+  <w:abstractNum w:abstractNumId="37" w15:restartNumberingAfterBreak="0">
     <w:nsid w:val="4A3A6830"/>
     <w:multiLevelType w:val="multilevel"/>
     <w:tmpl w:val="A17C9372"/>
@@ -14810,7 +16900,7 @@
       </w:rPr>
     </w:lvl>
   </w:abstractNum>
-  <w:abstractNum w:abstractNumId="31" w15:restartNumberingAfterBreak="0">
+  <w:abstractNum w:abstractNumId="38" w15:restartNumberingAfterBreak="0">
     <w:nsid w:val="4BC933F8"/>
     <w:multiLevelType w:val="multilevel"/>
     <w:tmpl w:val="DD882376"/>
@@ -14923,7 +17013,7 @@
       </w:pPr>
     </w:lvl>
   </w:abstractNum>
-  <w:abstractNum w:abstractNumId="32" w15:restartNumberingAfterBreak="0">
+  <w:abstractNum w:abstractNumId="39" w15:restartNumberingAfterBreak="0">
     <w:nsid w:val="4CEA62D7"/>
     <w:multiLevelType w:val="hybridMultilevel"/>
     <w:tmpl w:val="2CC4A158"/>
@@ -15036,7 +17126,7 @@
       </w:rPr>
     </w:lvl>
   </w:abstractNum>
-  <w:abstractNum w:abstractNumId="33" w15:restartNumberingAfterBreak="0">
+  <w:abstractNum w:abstractNumId="40" w15:restartNumberingAfterBreak="0">
     <w:nsid w:val="4D9224B6"/>
     <w:multiLevelType w:val="multilevel"/>
     <w:tmpl w:val="248A072A"/>
@@ -15185,7 +17275,7 @@
       </w:rPr>
     </w:lvl>
   </w:abstractNum>
-  <w:abstractNum w:abstractNumId="34" w15:restartNumberingAfterBreak="0">
+  <w:abstractNum w:abstractNumId="41" w15:restartNumberingAfterBreak="0">
     <w:nsid w:val="509770C3"/>
     <w:multiLevelType w:val="multilevel"/>
     <w:tmpl w:val="73DE9192"/>
@@ -15334,7 +17424,7 @@
       </w:rPr>
     </w:lvl>
   </w:abstractNum>
-  <w:abstractNum w:abstractNumId="35" w15:restartNumberingAfterBreak="0">
+  <w:abstractNum w:abstractNumId="42" w15:restartNumberingAfterBreak="0">
     <w:nsid w:val="517C40F7"/>
     <w:multiLevelType w:val="multilevel"/>
     <w:tmpl w:val="2D7E8482"/>
@@ -15483,7 +17573,93 @@
       </w:rPr>
     </w:lvl>
   </w:abstractNum>
-  <w:abstractNum w:abstractNumId="36" w15:restartNumberingAfterBreak="0">
+  <w:abstractNum w:abstractNumId="43" w15:restartNumberingAfterBreak="0">
+    <w:nsid w:val="51B737FB"/>
+    <w:multiLevelType w:val="hybridMultilevel"/>
+    <w:tmpl w:val="4DDEA348"/>
+    <w:lvl w:ilvl="0" w:tplc="A642B780">
+      <w:start w:val="1"/>
+      <w:numFmt w:val="decimal"/>
+      <w:lvlText w:val="%1."/>
+      <w:lvlJc w:val="left"/>
+      <w:pPr>
+        <w:ind w:left="720" w:hanging="360"/>
+      </w:pPr>
+    </w:lvl>
+    <w:lvl w:ilvl="1" w:tplc="237A4808">
+      <w:start w:val="1"/>
+      <w:numFmt w:val="lowerLetter"/>
+      <w:lvlText w:val="%2."/>
+      <w:lvlJc w:val="left"/>
+      <w:pPr>
+        <w:ind w:left="1440" w:hanging="360"/>
+      </w:pPr>
+    </w:lvl>
+    <w:lvl w:ilvl="2" w:tplc="B720BAD2">
+      <w:start w:val="1"/>
+      <w:numFmt w:val="lowerRoman"/>
+      <w:lvlText w:val="%3."/>
+      <w:lvlJc w:val="right"/>
+      <w:pPr>
+        <w:ind w:left="2160" w:hanging="180"/>
+      </w:pPr>
+    </w:lvl>
+    <w:lvl w:ilvl="3" w:tplc="B9F8D1F4">
+      <w:start w:val="1"/>
+      <w:numFmt w:val="decimal"/>
+      <w:lvlText w:val="%4."/>
+      <w:lvlJc w:val="left"/>
+      <w:pPr>
+        <w:ind w:left="2880" w:hanging="360"/>
+      </w:pPr>
+    </w:lvl>
+    <w:lvl w:ilvl="4" w:tplc="2B2EF23A">
+      <w:start w:val="1"/>
+      <w:numFmt w:val="lowerLetter"/>
+      <w:lvlText w:val="%5."/>
+      <w:lvlJc w:val="left"/>
+      <w:pPr>
+        <w:ind w:left="3600" w:hanging="360"/>
+      </w:pPr>
+    </w:lvl>
+    <w:lvl w:ilvl="5" w:tplc="37005A24">
+      <w:start w:val="1"/>
+      <w:numFmt w:val="lowerRoman"/>
+      <w:lvlText w:val="%6."/>
+      <w:lvlJc w:val="right"/>
+      <w:pPr>
+        <w:ind w:left="4320" w:hanging="180"/>
+      </w:pPr>
+    </w:lvl>
+    <w:lvl w:ilvl="6" w:tplc="8BDA9DA2">
+      <w:start w:val="1"/>
+      <w:numFmt w:val="decimal"/>
+      <w:lvlText w:val="%7."/>
+      <w:lvlJc w:val="left"/>
+      <w:pPr>
+        <w:ind w:left="5040" w:hanging="360"/>
+      </w:pPr>
+    </w:lvl>
+    <w:lvl w:ilvl="7" w:tplc="DFFA39E4">
+      <w:start w:val="1"/>
+      <w:numFmt w:val="lowerLetter"/>
+      <w:lvlText w:val="%8."/>
+      <w:lvlJc w:val="left"/>
+      <w:pPr>
+        <w:ind w:left="5760" w:hanging="360"/>
+      </w:pPr>
+    </w:lvl>
+    <w:lvl w:ilvl="8" w:tplc="3B882842">
+      <w:start w:val="1"/>
+      <w:numFmt w:val="lowerRoman"/>
+      <w:lvlText w:val="%9."/>
+      <w:lvlJc w:val="right"/>
+      <w:pPr>
+        <w:ind w:left="6480" w:hanging="180"/>
+      </w:pPr>
+    </w:lvl>
+  </w:abstractNum>
+  <w:abstractNum w:abstractNumId="44" w15:restartNumberingAfterBreak="0">
     <w:nsid w:val="57DA19A5"/>
     <w:multiLevelType w:val="multilevel"/>
     <w:tmpl w:val="FD72BB82"/>
@@ -15632,7 +17808,7 @@
       </w:rPr>
     </w:lvl>
   </w:abstractNum>
-  <w:abstractNum w:abstractNumId="37" w15:restartNumberingAfterBreak="0">
+  <w:abstractNum w:abstractNumId="45" w15:restartNumberingAfterBreak="0">
     <w:nsid w:val="57ED6610"/>
     <w:multiLevelType w:val="hybridMultilevel"/>
     <w:tmpl w:val="EE18BB4E"/>
@@ -15721,7 +17897,7 @@
       </w:pPr>
     </w:lvl>
   </w:abstractNum>
-  <w:abstractNum w:abstractNumId="38" w15:restartNumberingAfterBreak="0">
+  <w:abstractNum w:abstractNumId="46" w15:restartNumberingAfterBreak="0">
     <w:nsid w:val="592B184F"/>
     <w:multiLevelType w:val="hybridMultilevel"/>
     <w:tmpl w:val="DF545292"/>
@@ -15810,7 +17986,7 @@
       </w:pPr>
     </w:lvl>
   </w:abstractNum>
-  <w:abstractNum w:abstractNumId="39" w15:restartNumberingAfterBreak="0">
+  <w:abstractNum w:abstractNumId="47" w15:restartNumberingAfterBreak="0">
     <w:nsid w:val="5A761914"/>
     <w:multiLevelType w:val="multilevel"/>
     <w:tmpl w:val="728023D2"/>
@@ -15923,7 +18099,7 @@
       </w:pPr>
     </w:lvl>
   </w:abstractNum>
-  <w:abstractNum w:abstractNumId="40" w15:restartNumberingAfterBreak="0">
+  <w:abstractNum w:abstractNumId="48" w15:restartNumberingAfterBreak="0">
     <w:nsid w:val="60294BAD"/>
     <w:multiLevelType w:val="multilevel"/>
     <w:tmpl w:val="F85C99CA"/>
@@ -16036,7 +18212,7 @@
       </w:pPr>
     </w:lvl>
   </w:abstractNum>
-  <w:abstractNum w:abstractNumId="41" w15:restartNumberingAfterBreak="0">
+  <w:abstractNum w:abstractNumId="49" w15:restartNumberingAfterBreak="0">
     <w:nsid w:val="68D174B0"/>
     <w:multiLevelType w:val="hybridMultilevel"/>
     <w:tmpl w:val="BC3E2F7E"/>
@@ -16149,7 +18325,7 @@
       </w:rPr>
     </w:lvl>
   </w:abstractNum>
-  <w:abstractNum w:abstractNumId="42" w15:restartNumberingAfterBreak="0">
+  <w:abstractNum w:abstractNumId="50" w15:restartNumberingAfterBreak="0">
     <w:nsid w:val="6A797D3E"/>
     <w:multiLevelType w:val="hybridMultilevel"/>
     <w:tmpl w:val="65FA862A"/>
@@ -16239,7 +18415,7 @@
       </w:pPr>
     </w:lvl>
   </w:abstractNum>
-  <w:abstractNum w:abstractNumId="43" w15:restartNumberingAfterBreak="0">
+  <w:abstractNum w:abstractNumId="51" w15:restartNumberingAfterBreak="0">
     <w:nsid w:val="6FF720AE"/>
     <w:multiLevelType w:val="multilevel"/>
     <w:tmpl w:val="B2E0F2C0"/>
@@ -16352,7 +18528,7 @@
       </w:pPr>
     </w:lvl>
   </w:abstractNum>
-  <w:abstractNum w:abstractNumId="44" w15:restartNumberingAfterBreak="0">
+  <w:abstractNum w:abstractNumId="52" w15:restartNumberingAfterBreak="0">
     <w:nsid w:val="768B03F3"/>
     <w:multiLevelType w:val="hybridMultilevel"/>
     <w:tmpl w:val="94DADA2E"/>
@@ -16442,7 +18618,7 @@
       </w:pPr>
     </w:lvl>
   </w:abstractNum>
-  <w:abstractNum w:abstractNumId="45" w15:restartNumberingAfterBreak="0">
+  <w:abstractNum w:abstractNumId="53" w15:restartNumberingAfterBreak="0">
     <w:nsid w:val="78535092"/>
     <w:multiLevelType w:val="multilevel"/>
     <w:tmpl w:val="926E27BA"/>
@@ -16556,142 +18732,166 @@
     </w:lvl>
   </w:abstractNum>
   <w:num w:numId="1" w16cid:durableId="577835693">
+    <w:abstractNumId w:val="40"/>
+  </w:num>
+  <w:num w:numId="2" w16cid:durableId="92172213">
+    <w:abstractNumId w:val="22"/>
+  </w:num>
+  <w:num w:numId="3" w16cid:durableId="149059239">
+    <w:abstractNumId w:val="19"/>
+  </w:num>
+  <w:num w:numId="4" w16cid:durableId="483281761">
+    <w:abstractNumId w:val="4"/>
+  </w:num>
+  <w:num w:numId="5" w16cid:durableId="124351998">
+    <w:abstractNumId w:val="21"/>
+  </w:num>
+  <w:num w:numId="6" w16cid:durableId="2022774201">
+    <w:abstractNumId w:val="38"/>
+  </w:num>
+  <w:num w:numId="7" w16cid:durableId="36200999">
+    <w:abstractNumId w:val="37"/>
+  </w:num>
+  <w:num w:numId="8" w16cid:durableId="65930082">
+    <w:abstractNumId w:val="49"/>
+  </w:num>
+  <w:num w:numId="9" w16cid:durableId="783354395">
+    <w:abstractNumId w:val="39"/>
+  </w:num>
+  <w:num w:numId="10" w16cid:durableId="681010726">
     <w:abstractNumId w:val="33"/>
   </w:num>
-  <w:num w:numId="2" w16cid:durableId="92172213">
+  <w:num w:numId="11" w16cid:durableId="1080642543">
+    <w:abstractNumId w:val="11"/>
+  </w:num>
+  <w:num w:numId="12" w16cid:durableId="2067685165">
+    <w:abstractNumId w:val="3"/>
+  </w:num>
+  <w:num w:numId="13" w16cid:durableId="1047265547">
     <w:abstractNumId w:val="18"/>
   </w:num>
-  <w:num w:numId="3" w16cid:durableId="149059239">
-    <w:abstractNumId w:val="15"/>
+  <w:num w:numId="14" w16cid:durableId="2020545205">
+    <w:abstractNumId w:val="46"/>
   </w:num>
-  <w:num w:numId="4" w16cid:durableId="483281761">
-    <w:abstractNumId w:val="2"/>
-  </w:num>
-  <w:num w:numId="5" w16cid:durableId="124351998">
-    <w:abstractNumId w:val="17"/>
-  </w:num>
-  <w:num w:numId="6" w16cid:durableId="2022774201">
-    <w:abstractNumId w:val="31"/>
-  </w:num>
-  <w:num w:numId="7" w16cid:durableId="36200999">
-    <w:abstractNumId w:val="30"/>
-  </w:num>
-  <w:num w:numId="8" w16cid:durableId="65930082">
-    <w:abstractNumId w:val="41"/>
-  </w:num>
-  <w:num w:numId="9" w16cid:durableId="783354395">
+  <w:num w:numId="15" w16cid:durableId="1636981645">
     <w:abstractNumId w:val="32"/>
   </w:num>
-  <w:num w:numId="10" w16cid:durableId="681010726">
-    <w:abstractNumId w:val="27"/>
+  <w:num w:numId="16" w16cid:durableId="1251154653">
+    <w:abstractNumId w:val="16"/>
   </w:num>
-  <w:num w:numId="11" w16cid:durableId="1080642543">
+  <w:num w:numId="17" w16cid:durableId="846673689">
+    <w:abstractNumId w:val="45"/>
+  </w:num>
+  <w:num w:numId="18" w16cid:durableId="430859867">
+    <w:abstractNumId w:val="36"/>
+  </w:num>
+  <w:num w:numId="19" w16cid:durableId="1155874165">
+    <w:abstractNumId w:val="52"/>
+  </w:num>
+  <w:num w:numId="20" w16cid:durableId="661616124">
+    <w:abstractNumId w:val="50"/>
+  </w:num>
+  <w:num w:numId="21" w16cid:durableId="1876692067">
     <w:abstractNumId w:val="7"/>
   </w:num>
-  <w:num w:numId="12" w16cid:durableId="2067685165">
-    <w:abstractNumId w:val="1"/>
-  </w:num>
-  <w:num w:numId="13" w16cid:durableId="1047265547">
-    <w:abstractNumId w:val="14"/>
-  </w:num>
-  <w:num w:numId="14" w16cid:durableId="2020545205">
-    <w:abstractNumId w:val="38"/>
-  </w:num>
-  <w:num w:numId="15" w16cid:durableId="1636981645">
-    <w:abstractNumId w:val="26"/>
-  </w:num>
-  <w:num w:numId="16" w16cid:durableId="1251154653">
-    <w:abstractNumId w:val="12"/>
-  </w:num>
-  <w:num w:numId="17" w16cid:durableId="846673689">
-    <w:abstractNumId w:val="37"/>
-  </w:num>
-  <w:num w:numId="18" w16cid:durableId="430859867">
-    <w:abstractNumId w:val="29"/>
-  </w:num>
-  <w:num w:numId="19" w16cid:durableId="1155874165">
-    <w:abstractNumId w:val="44"/>
-  </w:num>
-  <w:num w:numId="20" w16cid:durableId="661616124">
-    <w:abstractNumId w:val="42"/>
-  </w:num>
-  <w:num w:numId="21" w16cid:durableId="1876692067">
-    <w:abstractNumId w:val="4"/>
-  </w:num>
   <w:num w:numId="22" w16cid:durableId="1032219510">
-    <w:abstractNumId w:val="3"/>
+    <w:abstractNumId w:val="6"/>
   </w:num>
   <w:num w:numId="23" w16cid:durableId="608898329">
-    <w:abstractNumId w:val="40"/>
+    <w:abstractNumId w:val="48"/>
   </w:num>
   <w:num w:numId="24" w16cid:durableId="576979813">
-    <w:abstractNumId w:val="19"/>
+    <w:abstractNumId w:val="23"/>
   </w:num>
   <w:num w:numId="25" w16cid:durableId="830953447">
-    <w:abstractNumId w:val="43"/>
+    <w:abstractNumId w:val="51"/>
   </w:num>
   <w:num w:numId="26" w16cid:durableId="908422987">
     <w:abstractNumId w:val="0"/>
   </w:num>
   <w:num w:numId="27" w16cid:durableId="1246106426">
-    <w:abstractNumId w:val="39"/>
+    <w:abstractNumId w:val="47"/>
   </w:num>
   <w:num w:numId="28" w16cid:durableId="248201875">
-    <w:abstractNumId w:val="23"/>
+    <w:abstractNumId w:val="28"/>
   </w:num>
   <w:num w:numId="29" w16cid:durableId="339938329">
-    <w:abstractNumId w:val="21"/>
+    <w:abstractNumId w:val="26"/>
   </w:num>
   <w:num w:numId="30" w16cid:durableId="1322008373">
+    <w:abstractNumId w:val="29"/>
+  </w:num>
+  <w:num w:numId="31" w16cid:durableId="1178152136">
+    <w:abstractNumId w:val="14"/>
+  </w:num>
+  <w:num w:numId="32" w16cid:durableId="2029402810">
+    <w:abstractNumId w:val="13"/>
+  </w:num>
+  <w:num w:numId="33" w16cid:durableId="1045058206">
+    <w:abstractNumId w:val="10"/>
+  </w:num>
+  <w:num w:numId="34" w16cid:durableId="85807911">
     <w:abstractNumId w:val="24"/>
   </w:num>
-  <w:num w:numId="31" w16cid:durableId="1178152136">
-    <w:abstractNumId w:val="10"/>
+  <w:num w:numId="35" w16cid:durableId="629631235">
+    <w:abstractNumId w:val="27"/>
   </w:num>
-  <w:num w:numId="32" w16cid:durableId="2029402810">
+  <w:num w:numId="36" w16cid:durableId="906843338">
+    <w:abstractNumId w:val="53"/>
+  </w:num>
+  <w:num w:numId="37" w16cid:durableId="371423057">
     <w:abstractNumId w:val="9"/>
   </w:num>
-  <w:num w:numId="33" w16cid:durableId="1045058206">
-    <w:abstractNumId w:val="6"/>
+  <w:num w:numId="38" w16cid:durableId="1609578854">
+    <w:abstractNumId w:val="12"/>
   </w:num>
-  <w:num w:numId="34" w16cid:durableId="85807911">
+  <w:num w:numId="39" w16cid:durableId="413167677">
+    <w:abstractNumId w:val="41"/>
+  </w:num>
+  <w:num w:numId="40" w16cid:durableId="867762348">
+    <w:abstractNumId w:val="35"/>
+  </w:num>
+  <w:num w:numId="41" w16cid:durableId="1880432484">
+    <w:abstractNumId w:val="31"/>
+  </w:num>
+  <w:num w:numId="42" w16cid:durableId="1844583618">
+    <w:abstractNumId w:val="42"/>
+  </w:num>
+  <w:num w:numId="43" w16cid:durableId="1230117996">
+    <w:abstractNumId w:val="17"/>
+  </w:num>
+  <w:num w:numId="44" w16cid:durableId="370226590">
+    <w:abstractNumId w:val="15"/>
+  </w:num>
+  <w:num w:numId="45" w16cid:durableId="62338156">
+    <w:abstractNumId w:val="44"/>
+  </w:num>
+  <w:num w:numId="46" w16cid:durableId="223569665">
     <w:abstractNumId w:val="20"/>
   </w:num>
-  <w:num w:numId="35" w16cid:durableId="629631235">
-    <w:abstractNumId w:val="22"/>
-  </w:num>
-  <w:num w:numId="36" w16cid:durableId="906843338">
-    <w:abstractNumId w:val="45"/>
-  </w:num>
-  <w:num w:numId="37" w16cid:durableId="371423057">
+  <w:num w:numId="47" w16cid:durableId="687678461">
     <w:abstractNumId w:val="5"/>
   </w:num>
-  <w:num w:numId="38" w16cid:durableId="1609578854">
+  <w:num w:numId="48" w16cid:durableId="824008468">
+    <w:abstractNumId w:val="25"/>
+  </w:num>
+  <w:num w:numId="49" w16cid:durableId="1362633660">
+    <w:abstractNumId w:val="30"/>
+  </w:num>
+  <w:num w:numId="50" w16cid:durableId="616062221">
+    <w:abstractNumId w:val="2"/>
+  </w:num>
+  <w:num w:numId="51" w16cid:durableId="1520894907">
+    <w:abstractNumId w:val="1"/>
+  </w:num>
+  <w:num w:numId="52" w16cid:durableId="847988491">
+    <w:abstractNumId w:val="34"/>
+  </w:num>
+  <w:num w:numId="53" w16cid:durableId="619268041">
     <w:abstractNumId w:val="8"/>
   </w:num>
-  <w:num w:numId="39" w16cid:durableId="413167677">
-    <w:abstractNumId w:val="34"/>
-  </w:num>
-  <w:num w:numId="40" w16cid:durableId="867762348">
-    <w:abstractNumId w:val="28"/>
-  </w:num>
-  <w:num w:numId="41" w16cid:durableId="1880432484">
-    <w:abstractNumId w:val="25"/>
-  </w:num>
-  <w:num w:numId="42" w16cid:durableId="1844583618">
-    <w:abstractNumId w:val="35"/>
-  </w:num>
-  <w:num w:numId="43" w16cid:durableId="1230117996">
-    <w:abstractNumId w:val="13"/>
-  </w:num>
-  <w:num w:numId="44" w16cid:durableId="370226590">
-    <w:abstractNumId w:val="11"/>
-  </w:num>
-  <w:num w:numId="45" w16cid:durableId="62338156">
-    <w:abstractNumId w:val="36"/>
-  </w:num>
-  <w:num w:numId="46" w16cid:durableId="223569665">
-    <w:abstractNumId w:val="16"/>
+  <w:num w:numId="54" w16cid:durableId="1761296546">
+    <w:abstractNumId w:val="43"/>
   </w:num>
 </w:numbering>
 </file>
@@ -16870,7 +19070,7 @@
     <w:lsdException w:name="Table Web 2" w:semiHidden="1" w:unhideWhenUsed="1"/>
     <w:lsdException w:name="Table Web 3" w:semiHidden="1" w:unhideWhenUsed="1"/>
     <w:lsdException w:name="Balloon Text" w:semiHidden="1" w:unhideWhenUsed="1"/>
-    <w:lsdException w:name="Table Grid" w:uiPriority="39"/>
+    <w:lsdException w:name="Table Grid" w:uiPriority="59"/>
     <w:lsdException w:name="Table Theme" w:semiHidden="1" w:unhideWhenUsed="1"/>
     <w:lsdException w:name="Placeholder Text" w:semiHidden="1"/>
     <w:lsdException w:name="No Spacing" w:uiPriority="1" w:qFormat="1"/>
@@ -17643,7 +19843,7 @@
   <w:style w:type="table" w:styleId="TableGrid">
     <w:name w:val="Table Grid"/>
     <w:basedOn w:val="TableNormal"/>
-    <w:uiPriority w:val="39"/>
+    <w:uiPriority w:val="59"/>
     <w:rsid w:val="007A0070"/>
     <w:pPr>
       <w:spacing w:after="0" w:line="240" w:lineRule="auto"/>

</xml_diff>